<commit_message>
add( tsp solvers )
</commit_message>
<xml_diff>
--- a/docs/Отчет_MDMTSP_КТ1.docx
+++ b/docs/Отчет_MDMTSP_КТ1.docx
@@ -181,7 +181,7 @@
         <w:ind w:left="418" w:right="418" w:firstLine="0"/>
         <w:jc w:val="center"/>
       </w:pPr>
-      <w:bookmarkStart w:id="0" w:name="_Toc220871054"/>
+      <w:bookmarkStart w:id="0" w:name="_Toc221127124"/>
       <w:r>
         <w:rPr>
           <w:spacing w:val="-2"/>
@@ -269,7 +269,7 @@
         <w:ind w:left="418" w:right="418" w:firstLine="0"/>
         <w:jc w:val="center"/>
       </w:pPr>
-      <w:bookmarkStart w:id="1" w:name="_Toc220871055"/>
+      <w:bookmarkStart w:id="1" w:name="_Toc221127125"/>
       <w:r>
         <w:t>Тема</w:t>
       </w:r>
@@ -669,7 +669,7 @@
               <w:tab w:val="right" w:leader="dot" w:pos="9350"/>
             </w:tabs>
             <w:rPr>
-              <w:rFonts w:ascii="Times New Roman" w:eastAsiaTheme="minorEastAsia" w:hAnsi="Times New Roman" w:cs="Times New Roman"/>
+              <w:rFonts w:eastAsiaTheme="minorEastAsia" w:cstheme="minorBidi"/>
               <w:b w:val="0"/>
               <w:bCs w:val="0"/>
               <w:i w:val="0"/>
@@ -702,11 +702,10 @@
             </w:rPr>
             <w:fldChar w:fldCharType="separate"/>
           </w:r>
-          <w:hyperlink w:anchor="_Toc220871054" w:history="1">
+          <w:hyperlink w:anchor="_Toc221127124" w:history="1">
             <w:r>
               <w:rPr>
                 <w:rStyle w:val="a6"/>
-                <w:rFonts w:ascii="Times New Roman" w:hAnsi="Times New Roman" w:cs="Times New Roman"/>
                 <w:noProof/>
                 <w:spacing w:val="-2"/>
               </w:rPr>
@@ -714,7 +713,6 @@
             </w:r>
             <w:r>
               <w:rPr>
-                <w:rFonts w:ascii="Times New Roman" w:hAnsi="Times New Roman" w:cs="Times New Roman"/>
                 <w:noProof/>
                 <w:webHidden/>
               </w:rPr>
@@ -722,7 +720,6 @@
             </w:r>
             <w:r>
               <w:rPr>
-                <w:rFonts w:ascii="Times New Roman" w:hAnsi="Times New Roman" w:cs="Times New Roman"/>
                 <w:noProof/>
                 <w:webHidden/>
               </w:rPr>
@@ -730,22 +727,19 @@
             </w:r>
             <w:r>
               <w:rPr>
-                <w:rFonts w:ascii="Times New Roman" w:hAnsi="Times New Roman" w:cs="Times New Roman"/>
-                <w:noProof/>
-                <w:webHidden/>
-              </w:rPr>
-              <w:instrText xml:space="preserve"> PAGEREF _Toc220871054 \h </w:instrText>
-            </w:r>
-            <w:r>
-              <w:rPr>
-                <w:rFonts w:ascii="Times New Roman" w:hAnsi="Times New Roman" w:cs="Times New Roman"/>
-                <w:noProof/>
-                <w:webHidden/>
-              </w:rPr>
-            </w:r>
-            <w:r>
-              <w:rPr>
-                <w:rFonts w:ascii="Times New Roman" w:hAnsi="Times New Roman" w:cs="Times New Roman"/>
+                <w:noProof/>
+                <w:webHidden/>
+              </w:rPr>
+              <w:instrText xml:space="preserve"> PAGEREF _Toc221127124 \h </w:instrText>
+            </w:r>
+            <w:r>
+              <w:rPr>
+                <w:noProof/>
+                <w:webHidden/>
+              </w:rPr>
+            </w:r>
+            <w:r>
+              <w:rPr>
                 <w:noProof/>
                 <w:webHidden/>
               </w:rPr>
@@ -753,7 +747,6 @@
             </w:r>
             <w:r>
               <w:rPr>
-                <w:rFonts w:ascii="Times New Roman" w:hAnsi="Times New Roman" w:cs="Times New Roman"/>
                 <w:noProof/>
                 <w:webHidden/>
               </w:rPr>
@@ -761,7 +754,6 @@
             </w:r>
             <w:r>
               <w:rPr>
-                <w:rFonts w:ascii="Times New Roman" w:hAnsi="Times New Roman" w:cs="Times New Roman"/>
                 <w:noProof/>
                 <w:webHidden/>
               </w:rPr>
@@ -776,7 +768,7 @@
               <w:tab w:val="right" w:leader="dot" w:pos="9350"/>
             </w:tabs>
             <w:rPr>
-              <w:rFonts w:ascii="Times New Roman" w:eastAsiaTheme="minorEastAsia" w:hAnsi="Times New Roman" w:cs="Times New Roman"/>
+              <w:rFonts w:eastAsiaTheme="minorEastAsia" w:cstheme="minorBidi"/>
               <w:b w:val="0"/>
               <w:bCs w:val="0"/>
               <w:noProof/>
@@ -787,11 +779,10 @@
               <w14:ligatures w14:val="standardContextual"/>
             </w:rPr>
           </w:pPr>
-          <w:hyperlink w:anchor="_Toc220871055" w:history="1">
+          <w:hyperlink w:anchor="_Toc221127125" w:history="1">
             <w:r>
               <w:rPr>
                 <w:rStyle w:val="a6"/>
-                <w:rFonts w:ascii="Times New Roman" w:hAnsi="Times New Roman" w:cs="Times New Roman"/>
                 <w:noProof/>
               </w:rPr>
               <w:t>Тема</w:t>
@@ -799,7 +790,6 @@
             <w:r>
               <w:rPr>
                 <w:rStyle w:val="a6"/>
-                <w:rFonts w:ascii="Times New Roman" w:hAnsi="Times New Roman" w:cs="Times New Roman"/>
                 <w:noProof/>
                 <w:spacing w:val="-1"/>
               </w:rPr>
@@ -808,7 +798,6 @@
             <w:r>
               <w:rPr>
                 <w:rStyle w:val="a6"/>
-                <w:rFonts w:ascii="Times New Roman" w:hAnsi="Times New Roman" w:cs="Times New Roman"/>
                 <w:noProof/>
                 <w:spacing w:val="-2"/>
               </w:rPr>
@@ -816,7 +805,6 @@
             </w:r>
             <w:r>
               <w:rPr>
-                <w:rFonts w:ascii="Times New Roman" w:hAnsi="Times New Roman" w:cs="Times New Roman"/>
                 <w:noProof/>
                 <w:webHidden/>
               </w:rPr>
@@ -824,7 +812,6 @@
             </w:r>
             <w:r>
               <w:rPr>
-                <w:rFonts w:ascii="Times New Roman" w:hAnsi="Times New Roman" w:cs="Times New Roman"/>
                 <w:noProof/>
                 <w:webHidden/>
               </w:rPr>
@@ -832,22 +819,19 @@
             </w:r>
             <w:r>
               <w:rPr>
-                <w:rFonts w:ascii="Times New Roman" w:hAnsi="Times New Roman" w:cs="Times New Roman"/>
-                <w:noProof/>
-                <w:webHidden/>
-              </w:rPr>
-              <w:instrText xml:space="preserve"> PAGEREF _Toc220871055 \h </w:instrText>
-            </w:r>
-            <w:r>
-              <w:rPr>
-                <w:rFonts w:ascii="Times New Roman" w:hAnsi="Times New Roman" w:cs="Times New Roman"/>
-                <w:noProof/>
-                <w:webHidden/>
-              </w:rPr>
-            </w:r>
-            <w:r>
-              <w:rPr>
-                <w:rFonts w:ascii="Times New Roman" w:hAnsi="Times New Roman" w:cs="Times New Roman"/>
+                <w:noProof/>
+                <w:webHidden/>
+              </w:rPr>
+              <w:instrText xml:space="preserve"> PAGEREF _Toc221127125 \h </w:instrText>
+            </w:r>
+            <w:r>
+              <w:rPr>
+                <w:noProof/>
+                <w:webHidden/>
+              </w:rPr>
+            </w:r>
+            <w:r>
+              <w:rPr>
                 <w:noProof/>
                 <w:webHidden/>
               </w:rPr>
@@ -855,7 +839,6 @@
             </w:r>
             <w:r>
               <w:rPr>
-                <w:rFonts w:ascii="Times New Roman" w:hAnsi="Times New Roman" w:cs="Times New Roman"/>
                 <w:noProof/>
                 <w:webHidden/>
               </w:rPr>
@@ -863,7 +846,6 @@
             </w:r>
             <w:r>
               <w:rPr>
-                <w:rFonts w:ascii="Times New Roman" w:hAnsi="Times New Roman" w:cs="Times New Roman"/>
                 <w:noProof/>
                 <w:webHidden/>
               </w:rPr>
@@ -879,7 +861,7 @@
               <w:tab w:val="right" w:leader="dot" w:pos="9350"/>
             </w:tabs>
             <w:rPr>
-              <w:rFonts w:ascii="Times New Roman" w:eastAsiaTheme="minorEastAsia" w:hAnsi="Times New Roman" w:cs="Times New Roman"/>
+              <w:rFonts w:eastAsiaTheme="minorEastAsia" w:cstheme="minorBidi"/>
               <w:b w:val="0"/>
               <w:bCs w:val="0"/>
               <w:i w:val="0"/>
@@ -890,11 +872,10 @@
               <w14:ligatures w14:val="standardContextual"/>
             </w:rPr>
           </w:pPr>
-          <w:hyperlink w:anchor="_Toc220871056" w:history="1">
+          <w:hyperlink w:anchor="_Toc221127126" w:history="1">
             <w:r>
               <w:rPr>
                 <w:rStyle w:val="a6"/>
-                <w:rFonts w:ascii="Times New Roman" w:hAnsi="Times New Roman" w:cs="Times New Roman"/>
                 <w:noProof/>
                 <w:w w:val="101"/>
               </w:rPr>
@@ -902,7 +883,7 @@
             </w:r>
             <w:r>
               <w:rPr>
-                <w:rFonts w:ascii="Times New Roman" w:eastAsiaTheme="minorEastAsia" w:hAnsi="Times New Roman" w:cs="Times New Roman"/>
+                <w:rFonts w:eastAsiaTheme="minorEastAsia" w:cstheme="minorBidi"/>
                 <w:b w:val="0"/>
                 <w:bCs w:val="0"/>
                 <w:i w:val="0"/>
@@ -917,7 +898,6 @@
             <w:r>
               <w:rPr>
                 <w:rStyle w:val="a6"/>
-                <w:rFonts w:ascii="Times New Roman" w:hAnsi="Times New Roman" w:cs="Times New Roman"/>
                 <w:noProof/>
                 <w:spacing w:val="-2"/>
               </w:rPr>
@@ -925,7 +905,6 @@
             </w:r>
             <w:r>
               <w:rPr>
-                <w:rFonts w:ascii="Times New Roman" w:hAnsi="Times New Roman" w:cs="Times New Roman"/>
                 <w:noProof/>
                 <w:webHidden/>
               </w:rPr>
@@ -933,7 +912,6 @@
             </w:r>
             <w:r>
               <w:rPr>
-                <w:rFonts w:ascii="Times New Roman" w:hAnsi="Times New Roman" w:cs="Times New Roman"/>
                 <w:noProof/>
                 <w:webHidden/>
               </w:rPr>
@@ -941,22 +919,19 @@
             </w:r>
             <w:r>
               <w:rPr>
-                <w:rFonts w:ascii="Times New Roman" w:hAnsi="Times New Roman" w:cs="Times New Roman"/>
-                <w:noProof/>
-                <w:webHidden/>
-              </w:rPr>
-              <w:instrText xml:space="preserve"> PAGEREF _Toc220871056 \h </w:instrText>
-            </w:r>
-            <w:r>
-              <w:rPr>
-                <w:rFonts w:ascii="Times New Roman" w:hAnsi="Times New Roman" w:cs="Times New Roman"/>
-                <w:noProof/>
-                <w:webHidden/>
-              </w:rPr>
-            </w:r>
-            <w:r>
-              <w:rPr>
-                <w:rFonts w:ascii="Times New Roman" w:hAnsi="Times New Roman" w:cs="Times New Roman"/>
+                <w:noProof/>
+                <w:webHidden/>
+              </w:rPr>
+              <w:instrText xml:space="preserve"> PAGEREF _Toc221127126 \h </w:instrText>
+            </w:r>
+            <w:r>
+              <w:rPr>
+                <w:noProof/>
+                <w:webHidden/>
+              </w:rPr>
+            </w:r>
+            <w:r>
+              <w:rPr>
                 <w:noProof/>
                 <w:webHidden/>
               </w:rPr>
@@ -964,7 +939,6 @@
             </w:r>
             <w:r>
               <w:rPr>
-                <w:rFonts w:ascii="Times New Roman" w:hAnsi="Times New Roman" w:cs="Times New Roman"/>
                 <w:noProof/>
                 <w:webHidden/>
               </w:rPr>
@@ -972,7 +946,6 @@
             </w:r>
             <w:r>
               <w:rPr>
-                <w:rFonts w:ascii="Times New Roman" w:hAnsi="Times New Roman" w:cs="Times New Roman"/>
                 <w:noProof/>
                 <w:webHidden/>
               </w:rPr>
@@ -988,7 +961,7 @@
               <w:tab w:val="right" w:leader="dot" w:pos="9350"/>
             </w:tabs>
             <w:rPr>
-              <w:rFonts w:ascii="Times New Roman" w:eastAsiaTheme="minorEastAsia" w:hAnsi="Times New Roman" w:cs="Times New Roman"/>
+              <w:rFonts w:eastAsiaTheme="minorEastAsia" w:cstheme="minorBidi"/>
               <w:b w:val="0"/>
               <w:bCs w:val="0"/>
               <w:noProof/>
@@ -999,18 +972,17 @@
               <w14:ligatures w14:val="standardContextual"/>
             </w:rPr>
           </w:pPr>
-          <w:hyperlink w:anchor="_Toc220871057" w:history="1">
+          <w:hyperlink w:anchor="_Toc221127127" w:history="1">
             <w:r>
               <w:rPr>
                 <w:rStyle w:val="a6"/>
-                <w:rFonts w:ascii="Times New Roman" w:hAnsi="Times New Roman" w:cs="Times New Roman"/>
                 <w:noProof/>
               </w:rPr>
               <w:t>1.1.</w:t>
             </w:r>
             <w:r>
               <w:rPr>
-                <w:rFonts w:ascii="Times New Roman" w:eastAsiaTheme="minorEastAsia" w:hAnsi="Times New Roman" w:cs="Times New Roman"/>
+                <w:rFonts w:eastAsiaTheme="minorEastAsia" w:cstheme="minorBidi"/>
                 <w:b w:val="0"/>
                 <w:bCs w:val="0"/>
                 <w:noProof/>
@@ -1025,7 +997,6 @@
             <w:r>
               <w:rPr>
                 <w:rStyle w:val="a6"/>
-                <w:rFonts w:ascii="Times New Roman" w:hAnsi="Times New Roman" w:cs="Times New Roman"/>
                 <w:noProof/>
                 <w:spacing w:val="-2"/>
               </w:rPr>
@@ -1033,7 +1004,6 @@
             </w:r>
             <w:r>
               <w:rPr>
-                <w:rFonts w:ascii="Times New Roman" w:hAnsi="Times New Roman" w:cs="Times New Roman"/>
                 <w:noProof/>
                 <w:webHidden/>
               </w:rPr>
@@ -1041,7 +1011,6 @@
             </w:r>
             <w:r>
               <w:rPr>
-                <w:rFonts w:ascii="Times New Roman" w:hAnsi="Times New Roman" w:cs="Times New Roman"/>
                 <w:noProof/>
                 <w:webHidden/>
               </w:rPr>
@@ -1049,22 +1018,19 @@
             </w:r>
             <w:r>
               <w:rPr>
-                <w:rFonts w:ascii="Times New Roman" w:hAnsi="Times New Roman" w:cs="Times New Roman"/>
-                <w:noProof/>
-                <w:webHidden/>
-              </w:rPr>
-              <w:instrText xml:space="preserve"> PAGEREF _Toc220871057 \h </w:instrText>
-            </w:r>
-            <w:r>
-              <w:rPr>
-                <w:rFonts w:ascii="Times New Roman" w:hAnsi="Times New Roman" w:cs="Times New Roman"/>
-                <w:noProof/>
-                <w:webHidden/>
-              </w:rPr>
-            </w:r>
-            <w:r>
-              <w:rPr>
-                <w:rFonts w:ascii="Times New Roman" w:hAnsi="Times New Roman" w:cs="Times New Roman"/>
+                <w:noProof/>
+                <w:webHidden/>
+              </w:rPr>
+              <w:instrText xml:space="preserve"> PAGEREF _Toc221127127 \h </w:instrText>
+            </w:r>
+            <w:r>
+              <w:rPr>
+                <w:noProof/>
+                <w:webHidden/>
+              </w:rPr>
+            </w:r>
+            <w:r>
+              <w:rPr>
                 <w:noProof/>
                 <w:webHidden/>
               </w:rPr>
@@ -1072,7 +1038,6 @@
             </w:r>
             <w:r>
               <w:rPr>
-                <w:rFonts w:ascii="Times New Roman" w:hAnsi="Times New Roman" w:cs="Times New Roman"/>
                 <w:noProof/>
                 <w:webHidden/>
               </w:rPr>
@@ -1080,7 +1045,6 @@
             </w:r>
             <w:r>
               <w:rPr>
-                <w:rFonts w:ascii="Times New Roman" w:hAnsi="Times New Roman" w:cs="Times New Roman"/>
                 <w:noProof/>
                 <w:webHidden/>
               </w:rPr>
@@ -1096,7 +1060,7 @@
               <w:tab w:val="right" w:leader="dot" w:pos="9350"/>
             </w:tabs>
             <w:rPr>
-              <w:rFonts w:ascii="Times New Roman" w:eastAsiaTheme="minorEastAsia" w:hAnsi="Times New Roman" w:cs="Times New Roman"/>
+              <w:rFonts w:eastAsiaTheme="minorEastAsia" w:cstheme="minorBidi"/>
               <w:b w:val="0"/>
               <w:bCs w:val="0"/>
               <w:noProof/>
@@ -1107,18 +1071,17 @@
               <w14:ligatures w14:val="standardContextual"/>
             </w:rPr>
           </w:pPr>
-          <w:hyperlink w:anchor="_Toc220871058" w:history="1">
+          <w:hyperlink w:anchor="_Toc221127128" w:history="1">
             <w:r>
               <w:rPr>
                 <w:rStyle w:val="a6"/>
-                <w:rFonts w:ascii="Times New Roman" w:hAnsi="Times New Roman" w:cs="Times New Roman"/>
                 <w:noProof/>
               </w:rPr>
               <w:t>1.2.</w:t>
             </w:r>
             <w:r>
               <w:rPr>
-                <w:rFonts w:ascii="Times New Roman" w:eastAsiaTheme="minorEastAsia" w:hAnsi="Times New Roman" w:cs="Times New Roman"/>
+                <w:rFonts w:eastAsiaTheme="minorEastAsia" w:cstheme="minorBidi"/>
                 <w:b w:val="0"/>
                 <w:bCs w:val="0"/>
                 <w:noProof/>
@@ -1133,7 +1096,6 @@
             <w:r>
               <w:rPr>
                 <w:rStyle w:val="a6"/>
-                <w:rFonts w:ascii="Times New Roman" w:hAnsi="Times New Roman" w:cs="Times New Roman"/>
                 <w:noProof/>
               </w:rPr>
               <w:t>Объект</w:t>
@@ -1141,7 +1103,6 @@
             <w:r>
               <w:rPr>
                 <w:rStyle w:val="a6"/>
-                <w:rFonts w:ascii="Times New Roman" w:hAnsi="Times New Roman" w:cs="Times New Roman"/>
                 <w:noProof/>
                 <w:spacing w:val="9"/>
               </w:rPr>
@@ -1150,7 +1111,6 @@
             <w:r>
               <w:rPr>
                 <w:rStyle w:val="a6"/>
-                <w:rFonts w:ascii="Times New Roman" w:hAnsi="Times New Roman" w:cs="Times New Roman"/>
                 <w:noProof/>
               </w:rPr>
               <w:t>и</w:t>
@@ -1158,7 +1118,6 @@
             <w:r>
               <w:rPr>
                 <w:rStyle w:val="a6"/>
-                <w:rFonts w:ascii="Times New Roman" w:hAnsi="Times New Roman" w:cs="Times New Roman"/>
                 <w:noProof/>
                 <w:spacing w:val="10"/>
               </w:rPr>
@@ -1167,7 +1126,6 @@
             <w:r>
               <w:rPr>
                 <w:rStyle w:val="a6"/>
-                <w:rFonts w:ascii="Times New Roman" w:hAnsi="Times New Roman" w:cs="Times New Roman"/>
                 <w:noProof/>
               </w:rPr>
               <w:t>предмет</w:t>
@@ -1175,7 +1133,6 @@
             <w:r>
               <w:rPr>
                 <w:rStyle w:val="a6"/>
-                <w:rFonts w:ascii="Times New Roman" w:hAnsi="Times New Roman" w:cs="Times New Roman"/>
                 <w:noProof/>
                 <w:spacing w:val="9"/>
               </w:rPr>
@@ -1184,7 +1141,6 @@
             <w:r>
               <w:rPr>
                 <w:rStyle w:val="a6"/>
-                <w:rFonts w:ascii="Times New Roman" w:hAnsi="Times New Roman" w:cs="Times New Roman"/>
                 <w:noProof/>
                 <w:spacing w:val="-2"/>
               </w:rPr>
@@ -1192,7 +1148,6 @@
             </w:r>
             <w:r>
               <w:rPr>
-                <w:rFonts w:ascii="Times New Roman" w:hAnsi="Times New Roman" w:cs="Times New Roman"/>
                 <w:noProof/>
                 <w:webHidden/>
               </w:rPr>
@@ -1200,7 +1155,6 @@
             </w:r>
             <w:r>
               <w:rPr>
-                <w:rFonts w:ascii="Times New Roman" w:hAnsi="Times New Roman" w:cs="Times New Roman"/>
                 <w:noProof/>
                 <w:webHidden/>
               </w:rPr>
@@ -1208,22 +1162,19 @@
             </w:r>
             <w:r>
               <w:rPr>
-                <w:rFonts w:ascii="Times New Roman" w:hAnsi="Times New Roman" w:cs="Times New Roman"/>
-                <w:noProof/>
-                <w:webHidden/>
-              </w:rPr>
-              <w:instrText xml:space="preserve"> PAGEREF _Toc220871058 \h </w:instrText>
-            </w:r>
-            <w:r>
-              <w:rPr>
-                <w:rFonts w:ascii="Times New Roman" w:hAnsi="Times New Roman" w:cs="Times New Roman"/>
-                <w:noProof/>
-                <w:webHidden/>
-              </w:rPr>
-            </w:r>
-            <w:r>
-              <w:rPr>
-                <w:rFonts w:ascii="Times New Roman" w:hAnsi="Times New Roman" w:cs="Times New Roman"/>
+                <w:noProof/>
+                <w:webHidden/>
+              </w:rPr>
+              <w:instrText xml:space="preserve"> PAGEREF _Toc221127128 \h </w:instrText>
+            </w:r>
+            <w:r>
+              <w:rPr>
+                <w:noProof/>
+                <w:webHidden/>
+              </w:rPr>
+            </w:r>
+            <w:r>
+              <w:rPr>
                 <w:noProof/>
                 <w:webHidden/>
               </w:rPr>
@@ -1231,7 +1182,6 @@
             </w:r>
             <w:r>
               <w:rPr>
-                <w:rFonts w:ascii="Times New Roman" w:hAnsi="Times New Roman" w:cs="Times New Roman"/>
                 <w:noProof/>
                 <w:webHidden/>
               </w:rPr>
@@ -1239,7 +1189,6 @@
             </w:r>
             <w:r>
               <w:rPr>
-                <w:rFonts w:ascii="Times New Roman" w:hAnsi="Times New Roman" w:cs="Times New Roman"/>
                 <w:noProof/>
                 <w:webHidden/>
               </w:rPr>
@@ -1255,7 +1204,7 @@
               <w:tab w:val="right" w:leader="dot" w:pos="9350"/>
             </w:tabs>
             <w:rPr>
-              <w:rFonts w:ascii="Times New Roman" w:eastAsiaTheme="minorEastAsia" w:hAnsi="Times New Roman" w:cs="Times New Roman"/>
+              <w:rFonts w:eastAsiaTheme="minorEastAsia" w:cstheme="minorBidi"/>
               <w:b w:val="0"/>
               <w:bCs w:val="0"/>
               <w:noProof/>
@@ -1266,18 +1215,17 @@
               <w14:ligatures w14:val="standardContextual"/>
             </w:rPr>
           </w:pPr>
-          <w:hyperlink w:anchor="_Toc220871059" w:history="1">
+          <w:hyperlink w:anchor="_Toc221127129" w:history="1">
             <w:r>
               <w:rPr>
                 <w:rStyle w:val="a6"/>
-                <w:rFonts w:ascii="Times New Roman" w:hAnsi="Times New Roman" w:cs="Times New Roman"/>
                 <w:noProof/>
               </w:rPr>
               <w:t>1.3.</w:t>
             </w:r>
             <w:r>
               <w:rPr>
-                <w:rFonts w:ascii="Times New Roman" w:eastAsiaTheme="minorEastAsia" w:hAnsi="Times New Roman" w:cs="Times New Roman"/>
+                <w:rFonts w:eastAsiaTheme="minorEastAsia" w:cstheme="minorBidi"/>
                 <w:b w:val="0"/>
                 <w:bCs w:val="0"/>
                 <w:noProof/>
@@ -1292,7 +1240,6 @@
             <w:r>
               <w:rPr>
                 <w:rStyle w:val="a6"/>
-                <w:rFonts w:ascii="Times New Roman" w:hAnsi="Times New Roman" w:cs="Times New Roman"/>
                 <w:noProof/>
               </w:rPr>
               <w:t>Методы</w:t>
@@ -1300,7 +1247,6 @@
             <w:r>
               <w:rPr>
                 <w:rStyle w:val="a6"/>
-                <w:rFonts w:ascii="Times New Roman" w:hAnsi="Times New Roman" w:cs="Times New Roman"/>
                 <w:noProof/>
                 <w:spacing w:val="3"/>
               </w:rPr>
@@ -1309,7 +1255,6 @@
             <w:r>
               <w:rPr>
                 <w:rStyle w:val="a6"/>
-                <w:rFonts w:ascii="Times New Roman" w:hAnsi="Times New Roman" w:cs="Times New Roman"/>
                 <w:noProof/>
                 <w:spacing w:val="-2"/>
               </w:rPr>
@@ -1317,7 +1262,6 @@
             </w:r>
             <w:r>
               <w:rPr>
-                <w:rFonts w:ascii="Times New Roman" w:hAnsi="Times New Roman" w:cs="Times New Roman"/>
                 <w:noProof/>
                 <w:webHidden/>
               </w:rPr>
@@ -1325,7 +1269,6 @@
             </w:r>
             <w:r>
               <w:rPr>
-                <w:rFonts w:ascii="Times New Roman" w:hAnsi="Times New Roman" w:cs="Times New Roman"/>
                 <w:noProof/>
                 <w:webHidden/>
               </w:rPr>
@@ -1333,22 +1276,19 @@
             </w:r>
             <w:r>
               <w:rPr>
-                <w:rFonts w:ascii="Times New Roman" w:hAnsi="Times New Roman" w:cs="Times New Roman"/>
-                <w:noProof/>
-                <w:webHidden/>
-              </w:rPr>
-              <w:instrText xml:space="preserve"> PAGEREF _Toc220871059 \h </w:instrText>
-            </w:r>
-            <w:r>
-              <w:rPr>
-                <w:rFonts w:ascii="Times New Roman" w:hAnsi="Times New Roman" w:cs="Times New Roman"/>
-                <w:noProof/>
-                <w:webHidden/>
-              </w:rPr>
-            </w:r>
-            <w:r>
-              <w:rPr>
-                <w:rFonts w:ascii="Times New Roman" w:hAnsi="Times New Roman" w:cs="Times New Roman"/>
+                <w:noProof/>
+                <w:webHidden/>
+              </w:rPr>
+              <w:instrText xml:space="preserve"> PAGEREF _Toc221127129 \h </w:instrText>
+            </w:r>
+            <w:r>
+              <w:rPr>
+                <w:noProof/>
+                <w:webHidden/>
+              </w:rPr>
+            </w:r>
+            <w:r>
+              <w:rPr>
                 <w:noProof/>
                 <w:webHidden/>
               </w:rPr>
@@ -1356,7 +1296,6 @@
             </w:r>
             <w:r>
               <w:rPr>
-                <w:rFonts w:ascii="Times New Roman" w:hAnsi="Times New Roman" w:cs="Times New Roman"/>
                 <w:noProof/>
                 <w:webHidden/>
               </w:rPr>
@@ -1364,7 +1303,6 @@
             </w:r>
             <w:r>
               <w:rPr>
-                <w:rFonts w:ascii="Times New Roman" w:hAnsi="Times New Roman" w:cs="Times New Roman"/>
                 <w:noProof/>
                 <w:webHidden/>
               </w:rPr>
@@ -1380,7 +1318,7 @@
               <w:tab w:val="right" w:leader="dot" w:pos="9350"/>
             </w:tabs>
             <w:rPr>
-              <w:rFonts w:ascii="Times New Roman" w:eastAsiaTheme="minorEastAsia" w:hAnsi="Times New Roman" w:cs="Times New Roman"/>
+              <w:rFonts w:eastAsiaTheme="minorEastAsia" w:cstheme="minorBidi"/>
               <w:b w:val="0"/>
               <w:bCs w:val="0"/>
               <w:noProof/>
@@ -1391,18 +1329,17 @@
               <w14:ligatures w14:val="standardContextual"/>
             </w:rPr>
           </w:pPr>
-          <w:hyperlink w:anchor="_Toc220871060" w:history="1">
+          <w:hyperlink w:anchor="_Toc221127130" w:history="1">
             <w:r>
               <w:rPr>
                 <w:rStyle w:val="a6"/>
-                <w:rFonts w:ascii="Times New Roman" w:hAnsi="Times New Roman" w:cs="Times New Roman"/>
                 <w:noProof/>
               </w:rPr>
               <w:t>1.4.</w:t>
             </w:r>
             <w:r>
               <w:rPr>
-                <w:rFonts w:ascii="Times New Roman" w:eastAsiaTheme="minorEastAsia" w:hAnsi="Times New Roman" w:cs="Times New Roman"/>
+                <w:rFonts w:eastAsiaTheme="minorEastAsia" w:cstheme="minorBidi"/>
                 <w:b w:val="0"/>
                 <w:bCs w:val="0"/>
                 <w:noProof/>
@@ -1417,7 +1354,6 @@
             <w:r>
               <w:rPr>
                 <w:rStyle w:val="a6"/>
-                <w:rFonts w:ascii="Times New Roman" w:hAnsi="Times New Roman" w:cs="Times New Roman"/>
                 <w:noProof/>
               </w:rPr>
               <w:t>Цель</w:t>
@@ -1425,7 +1361,6 @@
             <w:r>
               <w:rPr>
                 <w:rStyle w:val="a6"/>
-                <w:rFonts w:ascii="Times New Roman" w:hAnsi="Times New Roman" w:cs="Times New Roman"/>
                 <w:noProof/>
                 <w:spacing w:val="13"/>
               </w:rPr>
@@ -1434,7 +1369,6 @@
             <w:r>
               <w:rPr>
                 <w:rStyle w:val="a6"/>
-                <w:rFonts w:ascii="Times New Roman" w:hAnsi="Times New Roman" w:cs="Times New Roman"/>
                 <w:noProof/>
                 <w:spacing w:val="-2"/>
               </w:rPr>
@@ -1442,7 +1376,6 @@
             </w:r>
             <w:r>
               <w:rPr>
-                <w:rFonts w:ascii="Times New Roman" w:hAnsi="Times New Roman" w:cs="Times New Roman"/>
                 <w:noProof/>
                 <w:webHidden/>
               </w:rPr>
@@ -1450,7 +1383,6 @@
             </w:r>
             <w:r>
               <w:rPr>
-                <w:rFonts w:ascii="Times New Roman" w:hAnsi="Times New Roman" w:cs="Times New Roman"/>
                 <w:noProof/>
                 <w:webHidden/>
               </w:rPr>
@@ -1458,22 +1390,19 @@
             </w:r>
             <w:r>
               <w:rPr>
-                <w:rFonts w:ascii="Times New Roman" w:hAnsi="Times New Roman" w:cs="Times New Roman"/>
-                <w:noProof/>
-                <w:webHidden/>
-              </w:rPr>
-              <w:instrText xml:space="preserve"> PAGEREF _Toc220871060 \h </w:instrText>
-            </w:r>
-            <w:r>
-              <w:rPr>
-                <w:rFonts w:ascii="Times New Roman" w:hAnsi="Times New Roman" w:cs="Times New Roman"/>
-                <w:noProof/>
-                <w:webHidden/>
-              </w:rPr>
-            </w:r>
-            <w:r>
-              <w:rPr>
-                <w:rFonts w:ascii="Times New Roman" w:hAnsi="Times New Roman" w:cs="Times New Roman"/>
+                <w:noProof/>
+                <w:webHidden/>
+              </w:rPr>
+              <w:instrText xml:space="preserve"> PAGEREF _Toc221127130 \h </w:instrText>
+            </w:r>
+            <w:r>
+              <w:rPr>
+                <w:noProof/>
+                <w:webHidden/>
+              </w:rPr>
+            </w:r>
+            <w:r>
+              <w:rPr>
                 <w:noProof/>
                 <w:webHidden/>
               </w:rPr>
@@ -1481,7 +1410,6 @@
             </w:r>
             <w:r>
               <w:rPr>
-                <w:rFonts w:ascii="Times New Roman" w:hAnsi="Times New Roman" w:cs="Times New Roman"/>
                 <w:noProof/>
                 <w:webHidden/>
               </w:rPr>
@@ -1489,7 +1417,6 @@
             </w:r>
             <w:r>
               <w:rPr>
-                <w:rFonts w:ascii="Times New Roman" w:hAnsi="Times New Roman" w:cs="Times New Roman"/>
                 <w:noProof/>
                 <w:webHidden/>
               </w:rPr>
@@ -1505,7 +1432,7 @@
               <w:tab w:val="right" w:leader="dot" w:pos="9350"/>
             </w:tabs>
             <w:rPr>
-              <w:rFonts w:ascii="Times New Roman" w:eastAsiaTheme="minorEastAsia" w:hAnsi="Times New Roman" w:cs="Times New Roman"/>
+              <w:rFonts w:eastAsiaTheme="minorEastAsia" w:cstheme="minorBidi"/>
               <w:b w:val="0"/>
               <w:bCs w:val="0"/>
               <w:noProof/>
@@ -1516,18 +1443,17 @@
               <w14:ligatures w14:val="standardContextual"/>
             </w:rPr>
           </w:pPr>
-          <w:hyperlink w:anchor="_Toc220871061" w:history="1">
+          <w:hyperlink w:anchor="_Toc221127131" w:history="1">
             <w:r>
               <w:rPr>
                 <w:rStyle w:val="a6"/>
-                <w:rFonts w:ascii="Times New Roman" w:hAnsi="Times New Roman" w:cs="Times New Roman"/>
                 <w:noProof/>
               </w:rPr>
               <w:t>1.5.</w:t>
             </w:r>
             <w:r>
               <w:rPr>
-                <w:rFonts w:ascii="Times New Roman" w:eastAsiaTheme="minorEastAsia" w:hAnsi="Times New Roman" w:cs="Times New Roman"/>
+                <w:rFonts w:eastAsiaTheme="minorEastAsia" w:cstheme="minorBidi"/>
                 <w:b w:val="0"/>
                 <w:bCs w:val="0"/>
                 <w:noProof/>
@@ -1542,7 +1468,6 @@
             <w:r>
               <w:rPr>
                 <w:rStyle w:val="a6"/>
-                <w:rFonts w:ascii="Times New Roman" w:hAnsi="Times New Roman" w:cs="Times New Roman"/>
                 <w:noProof/>
               </w:rPr>
               <w:t>Задачи</w:t>
@@ -1550,7 +1475,6 @@
             <w:r>
               <w:rPr>
                 <w:rStyle w:val="a6"/>
-                <w:rFonts w:ascii="Times New Roman" w:hAnsi="Times New Roman" w:cs="Times New Roman"/>
                 <w:noProof/>
                 <w:spacing w:val="5"/>
               </w:rPr>
@@ -1559,7 +1483,6 @@
             <w:r>
               <w:rPr>
                 <w:rStyle w:val="a6"/>
-                <w:rFonts w:ascii="Times New Roman" w:hAnsi="Times New Roman" w:cs="Times New Roman"/>
                 <w:noProof/>
                 <w:spacing w:val="-2"/>
               </w:rPr>
@@ -1567,7 +1490,6 @@
             </w:r>
             <w:r>
               <w:rPr>
-                <w:rFonts w:ascii="Times New Roman" w:hAnsi="Times New Roman" w:cs="Times New Roman"/>
                 <w:noProof/>
                 <w:webHidden/>
               </w:rPr>
@@ -1575,7 +1497,6 @@
             </w:r>
             <w:r>
               <w:rPr>
-                <w:rFonts w:ascii="Times New Roman" w:hAnsi="Times New Roman" w:cs="Times New Roman"/>
                 <w:noProof/>
                 <w:webHidden/>
               </w:rPr>
@@ -1583,22 +1504,19 @@
             </w:r>
             <w:r>
               <w:rPr>
-                <w:rFonts w:ascii="Times New Roman" w:hAnsi="Times New Roman" w:cs="Times New Roman"/>
-                <w:noProof/>
-                <w:webHidden/>
-              </w:rPr>
-              <w:instrText xml:space="preserve"> PAGEREF _Toc220871061 \h </w:instrText>
-            </w:r>
-            <w:r>
-              <w:rPr>
-                <w:rFonts w:ascii="Times New Roman" w:hAnsi="Times New Roman" w:cs="Times New Roman"/>
-                <w:noProof/>
-                <w:webHidden/>
-              </w:rPr>
-            </w:r>
-            <w:r>
-              <w:rPr>
-                <w:rFonts w:ascii="Times New Roman" w:hAnsi="Times New Roman" w:cs="Times New Roman"/>
+                <w:noProof/>
+                <w:webHidden/>
+              </w:rPr>
+              <w:instrText xml:space="preserve"> PAGEREF _Toc221127131 \h </w:instrText>
+            </w:r>
+            <w:r>
+              <w:rPr>
+                <w:noProof/>
+                <w:webHidden/>
+              </w:rPr>
+            </w:r>
+            <w:r>
+              <w:rPr>
                 <w:noProof/>
                 <w:webHidden/>
               </w:rPr>
@@ -1606,15 +1524,13 @@
             </w:r>
             <w:r>
               <w:rPr>
-                <w:rFonts w:ascii="Times New Roman" w:hAnsi="Times New Roman" w:cs="Times New Roman"/>
-                <w:noProof/>
-                <w:webHidden/>
-              </w:rPr>
-              <w:t>2</w:t>
-            </w:r>
-            <w:r>
-              <w:rPr>
-                <w:rFonts w:ascii="Times New Roman" w:hAnsi="Times New Roman" w:cs="Times New Roman"/>
+                <w:noProof/>
+                <w:webHidden/>
+              </w:rPr>
+              <w:t>3</w:t>
+            </w:r>
+            <w:r>
+              <w:rPr>
                 <w:noProof/>
                 <w:webHidden/>
               </w:rPr>
@@ -1630,7 +1546,7 @@
               <w:tab w:val="right" w:leader="dot" w:pos="9350"/>
             </w:tabs>
             <w:rPr>
-              <w:rFonts w:ascii="Times New Roman" w:eastAsiaTheme="minorEastAsia" w:hAnsi="Times New Roman" w:cs="Times New Roman"/>
+              <w:rFonts w:eastAsiaTheme="minorEastAsia" w:cstheme="minorBidi"/>
               <w:b w:val="0"/>
               <w:bCs w:val="0"/>
               <w:i w:val="0"/>
@@ -1641,11 +1557,10 @@
               <w14:ligatures w14:val="standardContextual"/>
             </w:rPr>
           </w:pPr>
-          <w:hyperlink w:anchor="_Toc220871062" w:history="1">
+          <w:hyperlink w:anchor="_Toc221127132" w:history="1">
             <w:r>
               <w:rPr>
                 <w:rStyle w:val="a6"/>
-                <w:rFonts w:ascii="Times New Roman" w:hAnsi="Times New Roman" w:cs="Times New Roman"/>
                 <w:noProof/>
                 <w:w w:val="101"/>
               </w:rPr>
@@ -1653,7 +1568,7 @@
             </w:r>
             <w:r>
               <w:rPr>
-                <w:rFonts w:ascii="Times New Roman" w:eastAsiaTheme="minorEastAsia" w:hAnsi="Times New Roman" w:cs="Times New Roman"/>
+                <w:rFonts w:eastAsiaTheme="minorEastAsia" w:cstheme="minorBidi"/>
                 <w:b w:val="0"/>
                 <w:bCs w:val="0"/>
                 <w:i w:val="0"/>
@@ -1668,7 +1583,6 @@
             <w:r>
               <w:rPr>
                 <w:rStyle w:val="a6"/>
-                <w:rFonts w:ascii="Times New Roman" w:hAnsi="Times New Roman" w:cs="Times New Roman"/>
                 <w:noProof/>
               </w:rPr>
               <w:t>Новизна</w:t>
@@ -1676,7 +1590,6 @@
             <w:r>
               <w:rPr>
                 <w:rStyle w:val="a6"/>
-                <w:rFonts w:ascii="Times New Roman" w:hAnsi="Times New Roman" w:cs="Times New Roman"/>
                 <w:noProof/>
                 <w:spacing w:val="3"/>
               </w:rPr>
@@ -1685,7 +1598,6 @@
             <w:r>
               <w:rPr>
                 <w:rStyle w:val="a6"/>
-                <w:rFonts w:ascii="Times New Roman" w:hAnsi="Times New Roman" w:cs="Times New Roman"/>
                 <w:noProof/>
               </w:rPr>
               <w:t>и</w:t>
@@ -1693,7 +1605,6 @@
             <w:r>
               <w:rPr>
                 <w:rStyle w:val="a6"/>
-                <w:rFonts w:ascii="Times New Roman" w:hAnsi="Times New Roman" w:cs="Times New Roman"/>
                 <w:noProof/>
                 <w:spacing w:val="5"/>
               </w:rPr>
@@ -1702,7 +1613,6 @@
             <w:r>
               <w:rPr>
                 <w:rStyle w:val="a6"/>
-                <w:rFonts w:ascii="Times New Roman" w:hAnsi="Times New Roman" w:cs="Times New Roman"/>
                 <w:noProof/>
               </w:rPr>
               <w:t>достоверность</w:t>
@@ -1710,7 +1620,6 @@
             <w:r>
               <w:rPr>
                 <w:rStyle w:val="a6"/>
-                <w:rFonts w:ascii="Times New Roman" w:hAnsi="Times New Roman" w:cs="Times New Roman"/>
                 <w:noProof/>
                 <w:spacing w:val="4"/>
               </w:rPr>
@@ -1719,7 +1628,6 @@
             <w:r>
               <w:rPr>
                 <w:rStyle w:val="a6"/>
-                <w:rFonts w:ascii="Times New Roman" w:hAnsi="Times New Roman" w:cs="Times New Roman"/>
                 <w:noProof/>
                 <w:spacing w:val="-2"/>
               </w:rPr>
@@ -1727,7 +1635,6 @@
             </w:r>
             <w:r>
               <w:rPr>
-                <w:rFonts w:ascii="Times New Roman" w:hAnsi="Times New Roman" w:cs="Times New Roman"/>
                 <w:noProof/>
                 <w:webHidden/>
               </w:rPr>
@@ -1735,7 +1642,6 @@
             </w:r>
             <w:r>
               <w:rPr>
-                <w:rFonts w:ascii="Times New Roman" w:hAnsi="Times New Roman" w:cs="Times New Roman"/>
                 <w:noProof/>
                 <w:webHidden/>
               </w:rPr>
@@ -1743,22 +1649,19 @@
             </w:r>
             <w:r>
               <w:rPr>
-                <w:rFonts w:ascii="Times New Roman" w:hAnsi="Times New Roman" w:cs="Times New Roman"/>
-                <w:noProof/>
-                <w:webHidden/>
-              </w:rPr>
-              <w:instrText xml:space="preserve"> PAGEREF _Toc220871062 \h </w:instrText>
-            </w:r>
-            <w:r>
-              <w:rPr>
-                <w:rFonts w:ascii="Times New Roman" w:hAnsi="Times New Roman" w:cs="Times New Roman"/>
-                <w:noProof/>
-                <w:webHidden/>
-              </w:rPr>
-            </w:r>
-            <w:r>
-              <w:rPr>
-                <w:rFonts w:ascii="Times New Roman" w:hAnsi="Times New Roman" w:cs="Times New Roman"/>
+                <w:noProof/>
+                <w:webHidden/>
+              </w:rPr>
+              <w:instrText xml:space="preserve"> PAGEREF _Toc221127132 \h </w:instrText>
+            </w:r>
+            <w:r>
+              <w:rPr>
+                <w:noProof/>
+                <w:webHidden/>
+              </w:rPr>
+            </w:r>
+            <w:r>
+              <w:rPr>
                 <w:noProof/>
                 <w:webHidden/>
               </w:rPr>
@@ -1766,15 +1669,13 @@
             </w:r>
             <w:r>
               <w:rPr>
-                <w:rFonts w:ascii="Times New Roman" w:hAnsi="Times New Roman" w:cs="Times New Roman"/>
-                <w:noProof/>
-                <w:webHidden/>
-              </w:rPr>
-              <w:t>3</w:t>
-            </w:r>
-            <w:r>
-              <w:rPr>
-                <w:rFonts w:ascii="Times New Roman" w:hAnsi="Times New Roman" w:cs="Times New Roman"/>
+                <w:noProof/>
+                <w:webHidden/>
+              </w:rPr>
+              <w:t>4</w:t>
+            </w:r>
+            <w:r>
+              <w:rPr>
                 <w:noProof/>
                 <w:webHidden/>
               </w:rPr>
@@ -1790,7 +1691,7 @@
               <w:tab w:val="right" w:leader="dot" w:pos="9350"/>
             </w:tabs>
             <w:rPr>
-              <w:rFonts w:ascii="Times New Roman" w:eastAsiaTheme="minorEastAsia" w:hAnsi="Times New Roman" w:cs="Times New Roman"/>
+              <w:rFonts w:eastAsiaTheme="minorEastAsia" w:cstheme="minorBidi"/>
               <w:b w:val="0"/>
               <w:bCs w:val="0"/>
               <w:noProof/>
@@ -1801,18 +1702,17 @@
               <w14:ligatures w14:val="standardContextual"/>
             </w:rPr>
           </w:pPr>
-          <w:hyperlink w:anchor="_Toc220871063" w:history="1">
+          <w:hyperlink w:anchor="_Toc221127133" w:history="1">
             <w:r>
               <w:rPr>
                 <w:rStyle w:val="a6"/>
-                <w:rFonts w:ascii="Times New Roman" w:hAnsi="Times New Roman" w:cs="Times New Roman"/>
                 <w:noProof/>
               </w:rPr>
               <w:t>2.1.</w:t>
             </w:r>
             <w:r>
               <w:rPr>
-                <w:rFonts w:ascii="Times New Roman" w:eastAsiaTheme="minorEastAsia" w:hAnsi="Times New Roman" w:cs="Times New Roman"/>
+                <w:rFonts w:eastAsiaTheme="minorEastAsia" w:cstheme="minorBidi"/>
                 <w:b w:val="0"/>
                 <w:bCs w:val="0"/>
                 <w:noProof/>
@@ -1827,7 +1727,6 @@
             <w:r>
               <w:rPr>
                 <w:rStyle w:val="a6"/>
-                <w:rFonts w:ascii="Times New Roman" w:hAnsi="Times New Roman" w:cs="Times New Roman"/>
                 <w:noProof/>
               </w:rPr>
               <w:t>Теоретическая</w:t>
@@ -1835,7 +1734,6 @@
             <w:r>
               <w:rPr>
                 <w:rStyle w:val="a6"/>
-                <w:rFonts w:ascii="Times New Roman" w:hAnsi="Times New Roman" w:cs="Times New Roman"/>
                 <w:noProof/>
                 <w:spacing w:val="18"/>
               </w:rPr>
@@ -1844,7 +1742,6 @@
             <w:r>
               <w:rPr>
                 <w:rStyle w:val="a6"/>
-                <w:rFonts w:ascii="Times New Roman" w:hAnsi="Times New Roman" w:cs="Times New Roman"/>
                 <w:noProof/>
               </w:rPr>
               <w:t>значимость</w:t>
@@ -1852,7 +1749,6 @@
             <w:r>
               <w:rPr>
                 <w:rStyle w:val="a6"/>
-                <w:rFonts w:ascii="Times New Roman" w:hAnsi="Times New Roman" w:cs="Times New Roman"/>
                 <w:noProof/>
                 <w:spacing w:val="19"/>
               </w:rPr>
@@ -1861,7 +1757,6 @@
             <w:r>
               <w:rPr>
                 <w:rStyle w:val="a6"/>
-                <w:rFonts w:ascii="Times New Roman" w:hAnsi="Times New Roman" w:cs="Times New Roman"/>
                 <w:noProof/>
                 <w:spacing w:val="-2"/>
               </w:rPr>
@@ -1869,7 +1764,6 @@
             </w:r>
             <w:r>
               <w:rPr>
-                <w:rFonts w:ascii="Times New Roman" w:hAnsi="Times New Roman" w:cs="Times New Roman"/>
                 <w:noProof/>
                 <w:webHidden/>
               </w:rPr>
@@ -1877,7 +1771,6 @@
             </w:r>
             <w:r>
               <w:rPr>
-                <w:rFonts w:ascii="Times New Roman" w:hAnsi="Times New Roman" w:cs="Times New Roman"/>
                 <w:noProof/>
                 <w:webHidden/>
               </w:rPr>
@@ -1885,22 +1778,19 @@
             </w:r>
             <w:r>
               <w:rPr>
-                <w:rFonts w:ascii="Times New Roman" w:hAnsi="Times New Roman" w:cs="Times New Roman"/>
-                <w:noProof/>
-                <w:webHidden/>
-              </w:rPr>
-              <w:instrText xml:space="preserve"> PAGEREF _Toc220871063 \h </w:instrText>
-            </w:r>
-            <w:r>
-              <w:rPr>
-                <w:rFonts w:ascii="Times New Roman" w:hAnsi="Times New Roman" w:cs="Times New Roman"/>
-                <w:noProof/>
-                <w:webHidden/>
-              </w:rPr>
-            </w:r>
-            <w:r>
-              <w:rPr>
-                <w:rFonts w:ascii="Times New Roman" w:hAnsi="Times New Roman" w:cs="Times New Roman"/>
+                <w:noProof/>
+                <w:webHidden/>
+              </w:rPr>
+              <w:instrText xml:space="preserve"> PAGEREF _Toc221127133 \h </w:instrText>
+            </w:r>
+            <w:r>
+              <w:rPr>
+                <w:noProof/>
+                <w:webHidden/>
+              </w:rPr>
+            </w:r>
+            <w:r>
+              <w:rPr>
                 <w:noProof/>
                 <w:webHidden/>
               </w:rPr>
@@ -1908,15 +1798,13 @@
             </w:r>
             <w:r>
               <w:rPr>
-                <w:rFonts w:ascii="Times New Roman" w:hAnsi="Times New Roman" w:cs="Times New Roman"/>
-                <w:noProof/>
-                <w:webHidden/>
-              </w:rPr>
-              <w:t>3</w:t>
-            </w:r>
-            <w:r>
-              <w:rPr>
-                <w:rFonts w:ascii="Times New Roman" w:hAnsi="Times New Roman" w:cs="Times New Roman"/>
+                <w:noProof/>
+                <w:webHidden/>
+              </w:rPr>
+              <w:t>4</w:t>
+            </w:r>
+            <w:r>
+              <w:rPr>
                 <w:noProof/>
                 <w:webHidden/>
               </w:rPr>
@@ -1932,7 +1820,7 @@
               <w:tab w:val="right" w:leader="dot" w:pos="9350"/>
             </w:tabs>
             <w:rPr>
-              <w:rFonts w:ascii="Times New Roman" w:eastAsiaTheme="minorEastAsia" w:hAnsi="Times New Roman" w:cs="Times New Roman"/>
+              <w:rFonts w:eastAsiaTheme="minorEastAsia" w:cstheme="minorBidi"/>
               <w:b w:val="0"/>
               <w:bCs w:val="0"/>
               <w:noProof/>
@@ -1943,18 +1831,17 @@
               <w14:ligatures w14:val="standardContextual"/>
             </w:rPr>
           </w:pPr>
-          <w:hyperlink w:anchor="_Toc220871064" w:history="1">
+          <w:hyperlink w:anchor="_Toc221127134" w:history="1">
             <w:r>
               <w:rPr>
                 <w:rStyle w:val="a6"/>
-                <w:rFonts w:ascii="Times New Roman" w:hAnsi="Times New Roman" w:cs="Times New Roman"/>
                 <w:noProof/>
               </w:rPr>
               <w:t>2.2.</w:t>
             </w:r>
             <w:r>
               <w:rPr>
-                <w:rFonts w:ascii="Times New Roman" w:eastAsiaTheme="minorEastAsia" w:hAnsi="Times New Roman" w:cs="Times New Roman"/>
+                <w:rFonts w:eastAsiaTheme="minorEastAsia" w:cstheme="minorBidi"/>
                 <w:b w:val="0"/>
                 <w:bCs w:val="0"/>
                 <w:noProof/>
@@ -1969,7 +1856,6 @@
             <w:r>
               <w:rPr>
                 <w:rStyle w:val="a6"/>
-                <w:rFonts w:ascii="Times New Roman" w:hAnsi="Times New Roman" w:cs="Times New Roman"/>
                 <w:noProof/>
               </w:rPr>
               <w:t>Практическая</w:t>
@@ -1977,7 +1863,6 @@
             <w:r>
               <w:rPr>
                 <w:rStyle w:val="a6"/>
-                <w:rFonts w:ascii="Times New Roman" w:hAnsi="Times New Roman" w:cs="Times New Roman"/>
                 <w:noProof/>
                 <w:spacing w:val="29"/>
               </w:rPr>
@@ -1986,7 +1871,6 @@
             <w:r>
               <w:rPr>
                 <w:rStyle w:val="a6"/>
-                <w:rFonts w:ascii="Times New Roman" w:hAnsi="Times New Roman" w:cs="Times New Roman"/>
                 <w:noProof/>
               </w:rPr>
               <w:t>ценность</w:t>
@@ -1994,7 +1878,6 @@
             <w:r>
               <w:rPr>
                 <w:rStyle w:val="a6"/>
-                <w:rFonts w:ascii="Times New Roman" w:hAnsi="Times New Roman" w:cs="Times New Roman"/>
                 <w:noProof/>
                 <w:spacing w:val="29"/>
               </w:rPr>
@@ -2003,7 +1886,6 @@
             <w:r>
               <w:rPr>
                 <w:rStyle w:val="a6"/>
-                <w:rFonts w:ascii="Times New Roman" w:hAnsi="Times New Roman" w:cs="Times New Roman"/>
                 <w:noProof/>
                 <w:spacing w:val="-2"/>
               </w:rPr>
@@ -2011,7 +1893,6 @@
             </w:r>
             <w:r>
               <w:rPr>
-                <w:rFonts w:ascii="Times New Roman" w:hAnsi="Times New Roman" w:cs="Times New Roman"/>
                 <w:noProof/>
                 <w:webHidden/>
               </w:rPr>
@@ -2019,7 +1900,6 @@
             </w:r>
             <w:r>
               <w:rPr>
-                <w:rFonts w:ascii="Times New Roman" w:hAnsi="Times New Roman" w:cs="Times New Roman"/>
                 <w:noProof/>
                 <w:webHidden/>
               </w:rPr>
@@ -2027,22 +1907,19 @@
             </w:r>
             <w:r>
               <w:rPr>
-                <w:rFonts w:ascii="Times New Roman" w:hAnsi="Times New Roman" w:cs="Times New Roman"/>
-                <w:noProof/>
-                <w:webHidden/>
-              </w:rPr>
-              <w:instrText xml:space="preserve"> PAGEREF _Toc220871064 \h </w:instrText>
-            </w:r>
-            <w:r>
-              <w:rPr>
-                <w:rFonts w:ascii="Times New Roman" w:hAnsi="Times New Roman" w:cs="Times New Roman"/>
-                <w:noProof/>
-                <w:webHidden/>
-              </w:rPr>
-            </w:r>
-            <w:r>
-              <w:rPr>
-                <w:rFonts w:ascii="Times New Roman" w:hAnsi="Times New Roman" w:cs="Times New Roman"/>
+                <w:noProof/>
+                <w:webHidden/>
+              </w:rPr>
+              <w:instrText xml:space="preserve"> PAGEREF _Toc221127134 \h </w:instrText>
+            </w:r>
+            <w:r>
+              <w:rPr>
+                <w:noProof/>
+                <w:webHidden/>
+              </w:rPr>
+            </w:r>
+            <w:r>
+              <w:rPr>
                 <w:noProof/>
                 <w:webHidden/>
               </w:rPr>
@@ -2050,15 +1927,13 @@
             </w:r>
             <w:r>
               <w:rPr>
-                <w:rFonts w:ascii="Times New Roman" w:hAnsi="Times New Roman" w:cs="Times New Roman"/>
-                <w:noProof/>
-                <w:webHidden/>
-              </w:rPr>
-              <w:t>3</w:t>
-            </w:r>
-            <w:r>
-              <w:rPr>
-                <w:rFonts w:ascii="Times New Roman" w:hAnsi="Times New Roman" w:cs="Times New Roman"/>
+                <w:noProof/>
+                <w:webHidden/>
+              </w:rPr>
+              <w:t>4</w:t>
+            </w:r>
+            <w:r>
+              <w:rPr>
                 <w:noProof/>
                 <w:webHidden/>
               </w:rPr>
@@ -2074,7 +1949,7 @@
               <w:tab w:val="right" w:leader="dot" w:pos="9350"/>
             </w:tabs>
             <w:rPr>
-              <w:rFonts w:ascii="Times New Roman" w:eastAsiaTheme="minorEastAsia" w:hAnsi="Times New Roman" w:cs="Times New Roman"/>
+              <w:rFonts w:eastAsiaTheme="minorEastAsia" w:cstheme="minorBidi"/>
               <w:b w:val="0"/>
               <w:bCs w:val="0"/>
               <w:i w:val="0"/>
@@ -2085,11 +1960,10 @@
               <w14:ligatures w14:val="standardContextual"/>
             </w:rPr>
           </w:pPr>
-          <w:hyperlink w:anchor="_Toc220871065" w:history="1">
+          <w:hyperlink w:anchor="_Toc221127135" w:history="1">
             <w:r>
               <w:rPr>
                 <w:rStyle w:val="a6"/>
-                <w:rFonts w:ascii="Times New Roman" w:hAnsi="Times New Roman" w:cs="Times New Roman"/>
                 <w:noProof/>
                 <w:w w:val="101"/>
               </w:rPr>
@@ -2097,7 +1971,7 @@
             </w:r>
             <w:r>
               <w:rPr>
-                <w:rFonts w:ascii="Times New Roman" w:eastAsiaTheme="minorEastAsia" w:hAnsi="Times New Roman" w:cs="Times New Roman"/>
+                <w:rFonts w:eastAsiaTheme="minorEastAsia" w:cstheme="minorBidi"/>
                 <w:b w:val="0"/>
                 <w:bCs w:val="0"/>
                 <w:i w:val="0"/>
@@ -2112,7 +1986,6 @@
             <w:r>
               <w:rPr>
                 <w:rStyle w:val="a6"/>
-                <w:rFonts w:ascii="Times New Roman" w:hAnsi="Times New Roman" w:cs="Times New Roman"/>
                 <w:noProof/>
               </w:rPr>
               <w:t>Обзор</w:t>
@@ -2120,7 +1993,6 @@
             <w:r>
               <w:rPr>
                 <w:rStyle w:val="a6"/>
-                <w:rFonts w:ascii="Times New Roman" w:hAnsi="Times New Roman" w:cs="Times New Roman"/>
                 <w:noProof/>
                 <w:spacing w:val="6"/>
               </w:rPr>
@@ -2129,7 +2001,6 @@
             <w:r>
               <w:rPr>
                 <w:rStyle w:val="a6"/>
-                <w:rFonts w:ascii="Times New Roman" w:hAnsi="Times New Roman" w:cs="Times New Roman"/>
                 <w:noProof/>
               </w:rPr>
               <w:t>данных</w:t>
@@ -2137,7 +2008,6 @@
             <w:r>
               <w:rPr>
                 <w:rStyle w:val="a6"/>
-                <w:rFonts w:ascii="Times New Roman" w:hAnsi="Times New Roman" w:cs="Times New Roman"/>
                 <w:noProof/>
                 <w:spacing w:val="8"/>
               </w:rPr>
@@ -2146,7 +2016,6 @@
             <w:r>
               <w:rPr>
                 <w:rStyle w:val="a6"/>
-                <w:rFonts w:ascii="Times New Roman" w:hAnsi="Times New Roman" w:cs="Times New Roman"/>
                 <w:noProof/>
               </w:rPr>
               <w:t>и</w:t>
@@ -2154,7 +2023,6 @@
             <w:r>
               <w:rPr>
                 <w:rStyle w:val="a6"/>
-                <w:rFonts w:ascii="Times New Roman" w:hAnsi="Times New Roman" w:cs="Times New Roman"/>
                 <w:noProof/>
                 <w:spacing w:val="7"/>
               </w:rPr>
@@ -2163,7 +2031,6 @@
             <w:r>
               <w:rPr>
                 <w:rStyle w:val="a6"/>
-                <w:rFonts w:ascii="Times New Roman" w:hAnsi="Times New Roman" w:cs="Times New Roman"/>
                 <w:noProof/>
                 <w:spacing w:val="-2"/>
               </w:rPr>
@@ -2171,7 +2038,6 @@
             </w:r>
             <w:r>
               <w:rPr>
-                <w:rFonts w:ascii="Times New Roman" w:hAnsi="Times New Roman" w:cs="Times New Roman"/>
                 <w:noProof/>
                 <w:webHidden/>
               </w:rPr>
@@ -2179,7 +2045,6 @@
             </w:r>
             <w:r>
               <w:rPr>
-                <w:rFonts w:ascii="Times New Roman" w:hAnsi="Times New Roman" w:cs="Times New Roman"/>
                 <w:noProof/>
                 <w:webHidden/>
               </w:rPr>
@@ -2187,22 +2052,19 @@
             </w:r>
             <w:r>
               <w:rPr>
-                <w:rFonts w:ascii="Times New Roman" w:hAnsi="Times New Roman" w:cs="Times New Roman"/>
-                <w:noProof/>
-                <w:webHidden/>
-              </w:rPr>
-              <w:instrText xml:space="preserve"> PAGEREF _Toc220871065 \h </w:instrText>
-            </w:r>
-            <w:r>
-              <w:rPr>
-                <w:rFonts w:ascii="Times New Roman" w:hAnsi="Times New Roman" w:cs="Times New Roman"/>
-                <w:noProof/>
-                <w:webHidden/>
-              </w:rPr>
-            </w:r>
-            <w:r>
-              <w:rPr>
-                <w:rFonts w:ascii="Times New Roman" w:hAnsi="Times New Roman" w:cs="Times New Roman"/>
+                <w:noProof/>
+                <w:webHidden/>
+              </w:rPr>
+              <w:instrText xml:space="preserve"> PAGEREF _Toc221127135 \h </w:instrText>
+            </w:r>
+            <w:r>
+              <w:rPr>
+                <w:noProof/>
+                <w:webHidden/>
+              </w:rPr>
+            </w:r>
+            <w:r>
+              <w:rPr>
                 <w:noProof/>
                 <w:webHidden/>
               </w:rPr>
@@ -2210,15 +2072,13 @@
             </w:r>
             <w:r>
               <w:rPr>
-                <w:rFonts w:ascii="Times New Roman" w:hAnsi="Times New Roman" w:cs="Times New Roman"/>
-                <w:noProof/>
-                <w:webHidden/>
-              </w:rPr>
-              <w:t>3</w:t>
-            </w:r>
-            <w:r>
-              <w:rPr>
-                <w:rFonts w:ascii="Times New Roman" w:hAnsi="Times New Roman" w:cs="Times New Roman"/>
+                <w:noProof/>
+                <w:webHidden/>
+              </w:rPr>
+              <w:t>4</w:t>
+            </w:r>
+            <w:r>
+              <w:rPr>
                 <w:noProof/>
                 <w:webHidden/>
               </w:rPr>
@@ -2234,7 +2094,7 @@
               <w:tab w:val="right" w:leader="dot" w:pos="9350"/>
             </w:tabs>
             <w:rPr>
-              <w:rFonts w:ascii="Times New Roman" w:eastAsiaTheme="minorEastAsia" w:hAnsi="Times New Roman" w:cs="Times New Roman"/>
+              <w:rFonts w:eastAsiaTheme="minorEastAsia" w:cstheme="minorBidi"/>
               <w:b w:val="0"/>
               <w:bCs w:val="0"/>
               <w:i w:val="0"/>
@@ -2245,18 +2105,17 @@
               <w14:ligatures w14:val="standardContextual"/>
             </w:rPr>
           </w:pPr>
-          <w:hyperlink w:anchor="_Toc220871066" w:history="1">
+          <w:hyperlink w:anchor="_Toc221127136" w:history="1">
             <w:r>
               <w:rPr>
                 <w:rStyle w:val="a6"/>
-                <w:rFonts w:ascii="Times New Roman" w:hAnsi="Times New Roman" w:cs="Times New Roman"/>
                 <w:noProof/>
               </w:rPr>
               <w:t>3.1.</w:t>
             </w:r>
             <w:r>
               <w:rPr>
-                <w:rFonts w:ascii="Times New Roman" w:eastAsiaTheme="minorEastAsia" w:hAnsi="Times New Roman" w:cs="Times New Roman"/>
+                <w:rFonts w:eastAsiaTheme="minorEastAsia" w:cstheme="minorBidi"/>
                 <w:b w:val="0"/>
                 <w:bCs w:val="0"/>
                 <w:i w:val="0"/>
@@ -2271,14 +2130,12 @@
             <w:r>
               <w:rPr>
                 <w:rStyle w:val="a6"/>
-                <w:rFonts w:ascii="Times New Roman" w:hAnsi="Times New Roman" w:cs="Times New Roman"/>
-                <w:noProof/>
-              </w:rPr>
-              <w:t>Данные и бенчмарки</w:t>
-            </w:r>
-            <w:r>
-              <w:rPr>
-                <w:rFonts w:ascii="Times New Roman" w:hAnsi="Times New Roman" w:cs="Times New Roman"/>
+                <w:noProof/>
+              </w:rPr>
+              <w:t>Источники и бенчмарки</w:t>
+            </w:r>
+            <w:r>
+              <w:rPr>
                 <w:noProof/>
                 <w:webHidden/>
               </w:rPr>
@@ -2286,7 +2143,6 @@
             </w:r>
             <w:r>
               <w:rPr>
-                <w:rFonts w:ascii="Times New Roman" w:hAnsi="Times New Roman" w:cs="Times New Roman"/>
                 <w:noProof/>
                 <w:webHidden/>
               </w:rPr>
@@ -2294,22 +2150,19 @@
             </w:r>
             <w:r>
               <w:rPr>
-                <w:rFonts w:ascii="Times New Roman" w:hAnsi="Times New Roman" w:cs="Times New Roman"/>
-                <w:noProof/>
-                <w:webHidden/>
-              </w:rPr>
-              <w:instrText xml:space="preserve"> PAGEREF _Toc220871066 \h </w:instrText>
-            </w:r>
-            <w:r>
-              <w:rPr>
-                <w:rFonts w:ascii="Times New Roman" w:hAnsi="Times New Roman" w:cs="Times New Roman"/>
-                <w:noProof/>
-                <w:webHidden/>
-              </w:rPr>
-            </w:r>
-            <w:r>
-              <w:rPr>
-                <w:rFonts w:ascii="Times New Roman" w:hAnsi="Times New Roman" w:cs="Times New Roman"/>
+                <w:noProof/>
+                <w:webHidden/>
+              </w:rPr>
+              <w:instrText xml:space="preserve"> PAGEREF _Toc221127136 \h </w:instrText>
+            </w:r>
+            <w:r>
+              <w:rPr>
+                <w:noProof/>
+                <w:webHidden/>
+              </w:rPr>
+            </w:r>
+            <w:r>
+              <w:rPr>
                 <w:noProof/>
                 <w:webHidden/>
               </w:rPr>
@@ -2317,7 +2170,6 @@
             </w:r>
             <w:r>
               <w:rPr>
-                <w:rFonts w:ascii="Times New Roman" w:hAnsi="Times New Roman" w:cs="Times New Roman"/>
                 <w:noProof/>
                 <w:webHidden/>
               </w:rPr>
@@ -2325,7 +2177,6 @@
             </w:r>
             <w:r>
               <w:rPr>
-                <w:rFonts w:ascii="Times New Roman" w:hAnsi="Times New Roman" w:cs="Times New Roman"/>
                 <w:noProof/>
                 <w:webHidden/>
               </w:rPr>
@@ -2341,7 +2192,7 @@
               <w:tab w:val="right" w:leader="dot" w:pos="9350"/>
             </w:tabs>
             <w:rPr>
-              <w:rFonts w:ascii="Times New Roman" w:eastAsiaTheme="minorEastAsia" w:hAnsi="Times New Roman" w:cs="Times New Roman"/>
+              <w:rFonts w:eastAsiaTheme="minorEastAsia" w:cstheme="minorBidi"/>
               <w:b w:val="0"/>
               <w:bCs w:val="0"/>
               <w:i w:val="0"/>
@@ -2352,11 +2203,10 @@
               <w14:ligatures w14:val="standardContextual"/>
             </w:rPr>
           </w:pPr>
-          <w:hyperlink w:anchor="_Toc220871067" w:history="1">
+          <w:hyperlink w:anchor="_Toc221127137" w:history="1">
             <w:r>
               <w:rPr>
                 <w:rStyle w:val="a6"/>
-                <w:rFonts w:ascii="Times New Roman" w:hAnsi="Times New Roman" w:cs="Times New Roman"/>
                 <w:noProof/>
                 <w:w w:val="99"/>
               </w:rPr>
@@ -2364,7 +2214,7 @@
             </w:r>
             <w:r>
               <w:rPr>
-                <w:rFonts w:ascii="Times New Roman" w:eastAsiaTheme="minorEastAsia" w:hAnsi="Times New Roman" w:cs="Times New Roman"/>
+                <w:rFonts w:eastAsiaTheme="minorEastAsia" w:cstheme="minorBidi"/>
                 <w:b w:val="0"/>
                 <w:bCs w:val="0"/>
                 <w:i w:val="0"/>
@@ -2379,14 +2229,12 @@
             <w:r>
               <w:rPr>
                 <w:rStyle w:val="a6"/>
-                <w:rFonts w:ascii="Times New Roman" w:hAnsi="Times New Roman" w:cs="Times New Roman"/>
                 <w:noProof/>
               </w:rPr>
               <w:t>Базовый справочник по VRP и основным вариантам</w:t>
             </w:r>
             <w:r>
               <w:rPr>
-                <w:rFonts w:ascii="Times New Roman" w:hAnsi="Times New Roman" w:cs="Times New Roman"/>
                 <w:noProof/>
                 <w:webHidden/>
               </w:rPr>
@@ -2394,7 +2242,6 @@
             </w:r>
             <w:r>
               <w:rPr>
-                <w:rFonts w:ascii="Times New Roman" w:hAnsi="Times New Roman" w:cs="Times New Roman"/>
                 <w:noProof/>
                 <w:webHidden/>
               </w:rPr>
@@ -2402,22 +2249,19 @@
             </w:r>
             <w:r>
               <w:rPr>
-                <w:rFonts w:ascii="Times New Roman" w:hAnsi="Times New Roman" w:cs="Times New Roman"/>
-                <w:noProof/>
-                <w:webHidden/>
-              </w:rPr>
-              <w:instrText xml:space="preserve"> PAGEREF _Toc220871067 \h </w:instrText>
-            </w:r>
-            <w:r>
-              <w:rPr>
-                <w:rFonts w:ascii="Times New Roman" w:hAnsi="Times New Roman" w:cs="Times New Roman"/>
-                <w:noProof/>
-                <w:webHidden/>
-              </w:rPr>
-            </w:r>
-            <w:r>
-              <w:rPr>
-                <w:rFonts w:ascii="Times New Roman" w:hAnsi="Times New Roman" w:cs="Times New Roman"/>
+                <w:noProof/>
+                <w:webHidden/>
+              </w:rPr>
+              <w:instrText xml:space="preserve"> PAGEREF _Toc221127137 \h </w:instrText>
+            </w:r>
+            <w:r>
+              <w:rPr>
+                <w:noProof/>
+                <w:webHidden/>
+              </w:rPr>
+            </w:r>
+            <w:r>
+              <w:rPr>
                 <w:noProof/>
                 <w:webHidden/>
               </w:rPr>
@@ -2425,7 +2269,6 @@
             </w:r>
             <w:r>
               <w:rPr>
-                <w:rFonts w:ascii="Times New Roman" w:hAnsi="Times New Roman" w:cs="Times New Roman"/>
                 <w:noProof/>
                 <w:webHidden/>
               </w:rPr>
@@ -2433,7 +2276,6 @@
             </w:r>
             <w:r>
               <w:rPr>
-                <w:rFonts w:ascii="Times New Roman" w:hAnsi="Times New Roman" w:cs="Times New Roman"/>
                 <w:noProof/>
                 <w:webHidden/>
               </w:rPr>
@@ -2449,7 +2291,7 @@
               <w:tab w:val="right" w:leader="dot" w:pos="9350"/>
             </w:tabs>
             <w:rPr>
-              <w:rFonts w:ascii="Times New Roman" w:eastAsiaTheme="minorEastAsia" w:hAnsi="Times New Roman" w:cs="Times New Roman"/>
+              <w:rFonts w:eastAsiaTheme="minorEastAsia" w:cstheme="minorBidi"/>
               <w:b w:val="0"/>
               <w:bCs w:val="0"/>
               <w:i w:val="0"/>
@@ -2460,11 +2302,10 @@
               <w14:ligatures w14:val="standardContextual"/>
             </w:rPr>
           </w:pPr>
-          <w:hyperlink w:anchor="_Toc220871069" w:history="1">
+          <w:hyperlink w:anchor="_Toc221127139" w:history="1">
             <w:r>
               <w:rPr>
                 <w:rStyle w:val="a6"/>
-                <w:rFonts w:ascii="Times New Roman" w:hAnsi="Times New Roman" w:cs="Times New Roman"/>
                 <w:noProof/>
                 <w:w w:val="99"/>
               </w:rPr>
@@ -2472,7 +2313,7 @@
             </w:r>
             <w:r>
               <w:rPr>
-                <w:rFonts w:ascii="Times New Roman" w:eastAsiaTheme="minorEastAsia" w:hAnsi="Times New Roman" w:cs="Times New Roman"/>
+                <w:rFonts w:eastAsiaTheme="minorEastAsia" w:cstheme="minorBidi"/>
                 <w:b w:val="0"/>
                 <w:bCs w:val="0"/>
                 <w:i w:val="0"/>
@@ -2487,14 +2328,12 @@
             <w:r>
               <w:rPr>
                 <w:rStyle w:val="a6"/>
-                <w:rFonts w:ascii="Times New Roman" w:hAnsi="Times New Roman" w:cs="Times New Roman"/>
                 <w:noProof/>
               </w:rPr>
               <w:t>OR-Tools (Google)</w:t>
             </w:r>
             <w:r>
               <w:rPr>
-                <w:rFonts w:ascii="Times New Roman" w:hAnsi="Times New Roman" w:cs="Times New Roman"/>
                 <w:noProof/>
                 <w:webHidden/>
               </w:rPr>
@@ -2502,7 +2341,6 @@
             </w:r>
             <w:r>
               <w:rPr>
-                <w:rFonts w:ascii="Times New Roman" w:hAnsi="Times New Roman" w:cs="Times New Roman"/>
                 <w:noProof/>
                 <w:webHidden/>
               </w:rPr>
@@ -2510,22 +2348,19 @@
             </w:r>
             <w:r>
               <w:rPr>
-                <w:rFonts w:ascii="Times New Roman" w:hAnsi="Times New Roman" w:cs="Times New Roman"/>
-                <w:noProof/>
-                <w:webHidden/>
-              </w:rPr>
-              <w:instrText xml:space="preserve"> PAGEREF _Toc220871069 \h </w:instrText>
-            </w:r>
-            <w:r>
-              <w:rPr>
-                <w:rFonts w:ascii="Times New Roman" w:hAnsi="Times New Roman" w:cs="Times New Roman"/>
-                <w:noProof/>
-                <w:webHidden/>
-              </w:rPr>
-            </w:r>
-            <w:r>
-              <w:rPr>
-                <w:rFonts w:ascii="Times New Roman" w:hAnsi="Times New Roman" w:cs="Times New Roman"/>
+                <w:noProof/>
+                <w:webHidden/>
+              </w:rPr>
+              <w:instrText xml:space="preserve"> PAGEREF _Toc221127139 \h </w:instrText>
+            </w:r>
+            <w:r>
+              <w:rPr>
+                <w:noProof/>
+                <w:webHidden/>
+              </w:rPr>
+            </w:r>
+            <w:r>
+              <w:rPr>
                 <w:noProof/>
                 <w:webHidden/>
               </w:rPr>
@@ -2533,15 +2368,13 @@
             </w:r>
             <w:r>
               <w:rPr>
-                <w:rFonts w:ascii="Times New Roman" w:hAnsi="Times New Roman" w:cs="Times New Roman"/>
-                <w:noProof/>
-                <w:webHidden/>
-              </w:rPr>
-              <w:t>4</w:t>
-            </w:r>
-            <w:r>
-              <w:rPr>
-                <w:rFonts w:ascii="Times New Roman" w:hAnsi="Times New Roman" w:cs="Times New Roman"/>
+                <w:noProof/>
+                <w:webHidden/>
+              </w:rPr>
+              <w:t>5</w:t>
+            </w:r>
+            <w:r>
+              <w:rPr>
                 <w:noProof/>
                 <w:webHidden/>
               </w:rPr>
@@ -2557,7 +2390,7 @@
               <w:tab w:val="right" w:leader="dot" w:pos="9350"/>
             </w:tabs>
             <w:rPr>
-              <w:rFonts w:ascii="Times New Roman" w:eastAsiaTheme="minorEastAsia" w:hAnsi="Times New Roman" w:cs="Times New Roman"/>
+              <w:rFonts w:eastAsiaTheme="minorEastAsia" w:cstheme="minorBidi"/>
               <w:b w:val="0"/>
               <w:bCs w:val="0"/>
               <w:i w:val="0"/>
@@ -2568,18 +2401,17 @@
               <w14:ligatures w14:val="standardContextual"/>
             </w:rPr>
           </w:pPr>
-          <w:hyperlink w:anchor="_Toc220871071" w:history="1">
+          <w:hyperlink w:anchor="_Toc221127141" w:history="1">
             <w:r>
               <w:rPr>
                 <w:rStyle w:val="a6"/>
-                <w:rFonts w:ascii="Times New Roman" w:hAnsi="Times New Roman" w:cs="Times New Roman"/>
                 <w:noProof/>
               </w:rPr>
               <w:t>3.2.</w:t>
             </w:r>
             <w:r>
               <w:rPr>
-                <w:rFonts w:ascii="Times New Roman" w:eastAsiaTheme="minorEastAsia" w:hAnsi="Times New Roman" w:cs="Times New Roman"/>
+                <w:rFonts w:eastAsiaTheme="minorEastAsia" w:cstheme="minorBidi"/>
                 <w:b w:val="0"/>
                 <w:bCs w:val="0"/>
                 <w:i w:val="0"/>
@@ -2594,14 +2426,12 @@
             <w:r>
               <w:rPr>
                 <w:rStyle w:val="a6"/>
-                <w:rFonts w:ascii="Times New Roman" w:hAnsi="Times New Roman" w:cs="Times New Roman"/>
                 <w:noProof/>
               </w:rPr>
               <w:t>Библиотеки и солверы</w:t>
             </w:r>
             <w:r>
               <w:rPr>
-                <w:rFonts w:ascii="Times New Roman" w:hAnsi="Times New Roman" w:cs="Times New Roman"/>
                 <w:noProof/>
                 <w:webHidden/>
               </w:rPr>
@@ -2609,7 +2439,6 @@
             </w:r>
             <w:r>
               <w:rPr>
-                <w:rFonts w:ascii="Times New Roman" w:hAnsi="Times New Roman" w:cs="Times New Roman"/>
                 <w:noProof/>
                 <w:webHidden/>
               </w:rPr>
@@ -2617,22 +2446,19 @@
             </w:r>
             <w:r>
               <w:rPr>
-                <w:rFonts w:ascii="Times New Roman" w:hAnsi="Times New Roman" w:cs="Times New Roman"/>
-                <w:noProof/>
-                <w:webHidden/>
-              </w:rPr>
-              <w:instrText xml:space="preserve"> PAGEREF _Toc220871071 \h </w:instrText>
-            </w:r>
-            <w:r>
-              <w:rPr>
-                <w:rFonts w:ascii="Times New Roman" w:hAnsi="Times New Roman" w:cs="Times New Roman"/>
-                <w:noProof/>
-                <w:webHidden/>
-              </w:rPr>
-            </w:r>
-            <w:r>
-              <w:rPr>
-                <w:rFonts w:ascii="Times New Roman" w:hAnsi="Times New Roman" w:cs="Times New Roman"/>
+                <w:noProof/>
+                <w:webHidden/>
+              </w:rPr>
+              <w:instrText xml:space="preserve"> PAGEREF _Toc221127141 \h </w:instrText>
+            </w:r>
+            <w:r>
+              <w:rPr>
+                <w:noProof/>
+                <w:webHidden/>
+              </w:rPr>
+            </w:r>
+            <w:r>
+              <w:rPr>
                 <w:noProof/>
                 <w:webHidden/>
               </w:rPr>
@@ -2640,15 +2466,13 @@
             </w:r>
             <w:r>
               <w:rPr>
-                <w:rFonts w:ascii="Times New Roman" w:hAnsi="Times New Roman" w:cs="Times New Roman"/>
-                <w:noProof/>
-                <w:webHidden/>
-              </w:rPr>
-              <w:t>4</w:t>
-            </w:r>
-            <w:r>
-              <w:rPr>
-                <w:rFonts w:ascii="Times New Roman" w:hAnsi="Times New Roman" w:cs="Times New Roman"/>
+                <w:noProof/>
+                <w:webHidden/>
+              </w:rPr>
+              <w:t>5</w:t>
+            </w:r>
+            <w:r>
+              <w:rPr>
                 <w:noProof/>
                 <w:webHidden/>
               </w:rPr>
@@ -2664,7 +2488,7 @@
               <w:tab w:val="right" w:leader="dot" w:pos="9350"/>
             </w:tabs>
             <w:rPr>
-              <w:rFonts w:ascii="Times New Roman" w:eastAsiaTheme="minorEastAsia" w:hAnsi="Times New Roman" w:cs="Times New Roman"/>
+              <w:rFonts w:eastAsiaTheme="minorEastAsia" w:cstheme="minorBidi"/>
               <w:b w:val="0"/>
               <w:bCs w:val="0"/>
               <w:i w:val="0"/>
@@ -2675,11 +2499,10 @@
               <w14:ligatures w14:val="standardContextual"/>
             </w:rPr>
           </w:pPr>
-          <w:hyperlink w:anchor="_Toc220871072" w:history="1">
+          <w:hyperlink w:anchor="_Toc221127142" w:history="1">
             <w:r>
               <w:rPr>
                 <w:rStyle w:val="a6"/>
-                <w:rFonts w:ascii="Times New Roman" w:hAnsi="Times New Roman" w:cs="Times New Roman"/>
                 <w:noProof/>
                 <w:w w:val="99"/>
               </w:rPr>
@@ -2687,7 +2510,7 @@
             </w:r>
             <w:r>
               <w:rPr>
-                <w:rFonts w:ascii="Times New Roman" w:eastAsiaTheme="minorEastAsia" w:hAnsi="Times New Roman" w:cs="Times New Roman"/>
+                <w:rFonts w:eastAsiaTheme="minorEastAsia" w:cstheme="minorBidi"/>
                 <w:b w:val="0"/>
                 <w:bCs w:val="0"/>
                 <w:i w:val="0"/>
@@ -2702,7 +2525,6 @@
             <w:r>
               <w:rPr>
                 <w:rStyle w:val="a6"/>
-                <w:rFonts w:ascii="Times New Roman" w:hAnsi="Times New Roman" w:cs="Times New Roman"/>
                 <w:noProof/>
                 <w:lang w:val="en-US"/>
               </w:rPr>
@@ -2711,14 +2533,12 @@
             <w:r>
               <w:rPr>
                 <w:rStyle w:val="a6"/>
-                <w:rFonts w:ascii="Times New Roman" w:hAnsi="Times New Roman" w:cs="Times New Roman"/>
                 <w:noProof/>
               </w:rPr>
               <w:t>95</w:t>
             </w:r>
             <w:r>
               <w:rPr>
-                <w:rFonts w:ascii="Times New Roman" w:hAnsi="Times New Roman" w:cs="Times New Roman"/>
                 <w:noProof/>
                 <w:webHidden/>
               </w:rPr>
@@ -2726,7 +2546,6 @@
             </w:r>
             <w:r>
               <w:rPr>
-                <w:rFonts w:ascii="Times New Roman" w:hAnsi="Times New Roman" w:cs="Times New Roman"/>
                 <w:noProof/>
                 <w:webHidden/>
               </w:rPr>
@@ -2734,22 +2553,19 @@
             </w:r>
             <w:r>
               <w:rPr>
-                <w:rFonts w:ascii="Times New Roman" w:hAnsi="Times New Roman" w:cs="Times New Roman"/>
-                <w:noProof/>
-                <w:webHidden/>
-              </w:rPr>
-              <w:instrText xml:space="preserve"> PAGEREF _Toc220871072 \h </w:instrText>
-            </w:r>
-            <w:r>
-              <w:rPr>
-                <w:rFonts w:ascii="Times New Roman" w:hAnsi="Times New Roman" w:cs="Times New Roman"/>
-                <w:noProof/>
-                <w:webHidden/>
-              </w:rPr>
-            </w:r>
-            <w:r>
-              <w:rPr>
-                <w:rFonts w:ascii="Times New Roman" w:hAnsi="Times New Roman" w:cs="Times New Roman"/>
+                <w:noProof/>
+                <w:webHidden/>
+              </w:rPr>
+              <w:instrText xml:space="preserve"> PAGEREF _Toc221127142 \h </w:instrText>
+            </w:r>
+            <w:r>
+              <w:rPr>
+                <w:noProof/>
+                <w:webHidden/>
+              </w:rPr>
+            </w:r>
+            <w:r>
+              <w:rPr>
                 <w:noProof/>
                 <w:webHidden/>
               </w:rPr>
@@ -2757,15 +2573,13 @@
             </w:r>
             <w:r>
               <w:rPr>
-                <w:rFonts w:ascii="Times New Roman" w:hAnsi="Times New Roman" w:cs="Times New Roman"/>
-                <w:noProof/>
-                <w:webHidden/>
-              </w:rPr>
-              <w:t>4</w:t>
-            </w:r>
-            <w:r>
-              <w:rPr>
-                <w:rFonts w:ascii="Times New Roman" w:hAnsi="Times New Roman" w:cs="Times New Roman"/>
+                <w:noProof/>
+                <w:webHidden/>
+              </w:rPr>
+              <w:t>5</w:t>
+            </w:r>
+            <w:r>
+              <w:rPr>
                 <w:noProof/>
                 <w:webHidden/>
               </w:rPr>
@@ -2781,7 +2595,7 @@
               <w:tab w:val="right" w:leader="dot" w:pos="9350"/>
             </w:tabs>
             <w:rPr>
-              <w:rFonts w:ascii="Times New Roman" w:eastAsiaTheme="minorEastAsia" w:hAnsi="Times New Roman" w:cs="Times New Roman"/>
+              <w:rFonts w:eastAsiaTheme="minorEastAsia" w:cstheme="minorBidi"/>
               <w:b w:val="0"/>
               <w:bCs w:val="0"/>
               <w:i w:val="0"/>
@@ -2792,11 +2606,10 @@
               <w14:ligatures w14:val="standardContextual"/>
             </w:rPr>
           </w:pPr>
-          <w:hyperlink w:anchor="_Toc220871074" w:history="1">
+          <w:hyperlink w:anchor="_Toc221127144" w:history="1">
             <w:r>
               <w:rPr>
                 <w:rStyle w:val="a6"/>
-                <w:rFonts w:ascii="Times New Roman" w:hAnsi="Times New Roman" w:cs="Times New Roman"/>
                 <w:noProof/>
                 <w:w w:val="99"/>
               </w:rPr>
@@ -2804,7 +2617,7 @@
             </w:r>
             <w:r>
               <w:rPr>
-                <w:rFonts w:ascii="Times New Roman" w:eastAsiaTheme="minorEastAsia" w:hAnsi="Times New Roman" w:cs="Times New Roman"/>
+                <w:rFonts w:eastAsiaTheme="minorEastAsia" w:cstheme="minorBidi"/>
                 <w:b w:val="0"/>
                 <w:bCs w:val="0"/>
                 <w:i w:val="0"/>
@@ -2819,14 +2632,12 @@
             <w:r>
               <w:rPr>
                 <w:rStyle w:val="a6"/>
-                <w:rFonts w:ascii="Times New Roman" w:hAnsi="Times New Roman" w:cs="Times New Roman"/>
                 <w:noProof/>
               </w:rPr>
               <w:t>LKH-3</w:t>
             </w:r>
             <w:r>
               <w:rPr>
-                <w:rFonts w:ascii="Times New Roman" w:hAnsi="Times New Roman" w:cs="Times New Roman"/>
                 <w:noProof/>
                 <w:webHidden/>
               </w:rPr>
@@ -2834,7 +2645,6 @@
             </w:r>
             <w:r>
               <w:rPr>
-                <w:rFonts w:ascii="Times New Roman" w:hAnsi="Times New Roman" w:cs="Times New Roman"/>
                 <w:noProof/>
                 <w:webHidden/>
               </w:rPr>
@@ -2842,22 +2652,19 @@
             </w:r>
             <w:r>
               <w:rPr>
-                <w:rFonts w:ascii="Times New Roman" w:hAnsi="Times New Roman" w:cs="Times New Roman"/>
-                <w:noProof/>
-                <w:webHidden/>
-              </w:rPr>
-              <w:instrText xml:space="preserve"> PAGEREF _Toc220871074 \h </w:instrText>
-            </w:r>
-            <w:r>
-              <w:rPr>
-                <w:rFonts w:ascii="Times New Roman" w:hAnsi="Times New Roman" w:cs="Times New Roman"/>
-                <w:noProof/>
-                <w:webHidden/>
-              </w:rPr>
-            </w:r>
-            <w:r>
-              <w:rPr>
-                <w:rFonts w:ascii="Times New Roman" w:hAnsi="Times New Roman" w:cs="Times New Roman"/>
+                <w:noProof/>
+                <w:webHidden/>
+              </w:rPr>
+              <w:instrText xml:space="preserve"> PAGEREF _Toc221127144 \h </w:instrText>
+            </w:r>
+            <w:r>
+              <w:rPr>
+                <w:noProof/>
+                <w:webHidden/>
+              </w:rPr>
+            </w:r>
+            <w:r>
+              <w:rPr>
                 <w:noProof/>
                 <w:webHidden/>
               </w:rPr>
@@ -2865,15 +2672,13 @@
             </w:r>
             <w:r>
               <w:rPr>
-                <w:rFonts w:ascii="Times New Roman" w:hAnsi="Times New Roman" w:cs="Times New Roman"/>
-                <w:noProof/>
-                <w:webHidden/>
-              </w:rPr>
-              <w:t>4</w:t>
-            </w:r>
-            <w:r>
-              <w:rPr>
-                <w:rFonts w:ascii="Times New Roman" w:hAnsi="Times New Roman" w:cs="Times New Roman"/>
+                <w:noProof/>
+                <w:webHidden/>
+              </w:rPr>
+              <w:t>5</w:t>
+            </w:r>
+            <w:r>
+              <w:rPr>
                 <w:noProof/>
                 <w:webHidden/>
               </w:rPr>
@@ -2889,7 +2694,7 @@
               <w:tab w:val="right" w:leader="dot" w:pos="9350"/>
             </w:tabs>
             <w:rPr>
-              <w:rFonts w:ascii="Times New Roman" w:eastAsiaTheme="minorEastAsia" w:hAnsi="Times New Roman" w:cs="Times New Roman"/>
+              <w:rFonts w:eastAsiaTheme="minorEastAsia" w:cstheme="minorBidi"/>
               <w:b w:val="0"/>
               <w:bCs w:val="0"/>
               <w:i w:val="0"/>
@@ -2900,11 +2705,10 @@
               <w14:ligatures w14:val="standardContextual"/>
             </w:rPr>
           </w:pPr>
-          <w:hyperlink w:anchor="_Toc220871076" w:history="1">
+          <w:hyperlink w:anchor="_Toc221127146" w:history="1">
             <w:r>
               <w:rPr>
                 <w:rStyle w:val="a6"/>
-                <w:rFonts w:ascii="Times New Roman" w:hAnsi="Times New Roman" w:cs="Times New Roman"/>
                 <w:noProof/>
                 <w:w w:val="101"/>
               </w:rPr>
@@ -2912,7 +2716,7 @@
             </w:r>
             <w:r>
               <w:rPr>
-                <w:rFonts w:ascii="Times New Roman" w:eastAsiaTheme="minorEastAsia" w:hAnsi="Times New Roman" w:cs="Times New Roman"/>
+                <w:rFonts w:eastAsiaTheme="minorEastAsia" w:cstheme="minorBidi"/>
                 <w:b w:val="0"/>
                 <w:bCs w:val="0"/>
                 <w:i w:val="0"/>
@@ -2927,7 +2731,6 @@
             <w:r>
               <w:rPr>
                 <w:rStyle w:val="a6"/>
-                <w:rFonts w:ascii="Times New Roman" w:hAnsi="Times New Roman" w:cs="Times New Roman"/>
                 <w:noProof/>
               </w:rPr>
               <w:t>Основные</w:t>
@@ -2935,7 +2738,6 @@
             <w:r>
               <w:rPr>
                 <w:rStyle w:val="a6"/>
-                <w:rFonts w:ascii="Times New Roman" w:hAnsi="Times New Roman" w:cs="Times New Roman"/>
                 <w:noProof/>
                 <w:spacing w:val="4"/>
               </w:rPr>
@@ -2944,7 +2746,6 @@
             <w:r>
               <w:rPr>
                 <w:rStyle w:val="a6"/>
-                <w:rFonts w:ascii="Times New Roman" w:hAnsi="Times New Roman" w:cs="Times New Roman"/>
                 <w:noProof/>
               </w:rPr>
               <w:t>термины</w:t>
@@ -2952,7 +2753,6 @@
             <w:r>
               <w:rPr>
                 <w:rStyle w:val="a6"/>
-                <w:rFonts w:ascii="Times New Roman" w:hAnsi="Times New Roman" w:cs="Times New Roman"/>
                 <w:noProof/>
                 <w:spacing w:val="5"/>
               </w:rPr>
@@ -2961,7 +2761,6 @@
             <w:r>
               <w:rPr>
                 <w:rStyle w:val="a6"/>
-                <w:rFonts w:ascii="Times New Roman" w:hAnsi="Times New Roman" w:cs="Times New Roman"/>
                 <w:noProof/>
               </w:rPr>
               <w:t>и</w:t>
@@ -2969,7 +2768,6 @@
             <w:r>
               <w:rPr>
                 <w:rStyle w:val="a6"/>
-                <w:rFonts w:ascii="Times New Roman" w:hAnsi="Times New Roman" w:cs="Times New Roman"/>
                 <w:noProof/>
                 <w:spacing w:val="6"/>
               </w:rPr>
@@ -2978,7 +2776,6 @@
             <w:r>
               <w:rPr>
                 <w:rStyle w:val="a6"/>
-                <w:rFonts w:ascii="Times New Roman" w:hAnsi="Times New Roman" w:cs="Times New Roman"/>
                 <w:noProof/>
                 <w:spacing w:val="-2"/>
               </w:rPr>
@@ -2986,7 +2783,6 @@
             </w:r>
             <w:r>
               <w:rPr>
-                <w:rFonts w:ascii="Times New Roman" w:hAnsi="Times New Roman" w:cs="Times New Roman"/>
                 <w:noProof/>
                 <w:webHidden/>
               </w:rPr>
@@ -2994,7 +2790,6 @@
             </w:r>
             <w:r>
               <w:rPr>
-                <w:rFonts w:ascii="Times New Roman" w:hAnsi="Times New Roman" w:cs="Times New Roman"/>
                 <w:noProof/>
                 <w:webHidden/>
               </w:rPr>
@@ -3002,22 +2797,19 @@
             </w:r>
             <w:r>
               <w:rPr>
-                <w:rFonts w:ascii="Times New Roman" w:hAnsi="Times New Roman" w:cs="Times New Roman"/>
-                <w:noProof/>
-                <w:webHidden/>
-              </w:rPr>
-              <w:instrText xml:space="preserve"> PAGEREF _Toc220871076 \h </w:instrText>
-            </w:r>
-            <w:r>
-              <w:rPr>
-                <w:rFonts w:ascii="Times New Roman" w:hAnsi="Times New Roman" w:cs="Times New Roman"/>
-                <w:noProof/>
-                <w:webHidden/>
-              </w:rPr>
-            </w:r>
-            <w:r>
-              <w:rPr>
-                <w:rFonts w:ascii="Times New Roman" w:hAnsi="Times New Roman" w:cs="Times New Roman"/>
+                <w:noProof/>
+                <w:webHidden/>
+              </w:rPr>
+              <w:instrText xml:space="preserve"> PAGEREF _Toc221127146 \h </w:instrText>
+            </w:r>
+            <w:r>
+              <w:rPr>
+                <w:noProof/>
+                <w:webHidden/>
+              </w:rPr>
+            </w:r>
+            <w:r>
+              <w:rPr>
                 <w:noProof/>
                 <w:webHidden/>
               </w:rPr>
@@ -3025,15 +2817,13 @@
             </w:r>
             <w:r>
               <w:rPr>
-                <w:rFonts w:ascii="Times New Roman" w:hAnsi="Times New Roman" w:cs="Times New Roman"/>
-                <w:noProof/>
-                <w:webHidden/>
-              </w:rPr>
-              <w:t>4</w:t>
-            </w:r>
-            <w:r>
-              <w:rPr>
-                <w:rFonts w:ascii="Times New Roman" w:hAnsi="Times New Roman" w:cs="Times New Roman"/>
+                <w:noProof/>
+                <w:webHidden/>
+              </w:rPr>
+              <w:t>5</w:t>
+            </w:r>
+            <w:r>
+              <w:rPr>
                 <w:noProof/>
                 <w:webHidden/>
               </w:rPr>
@@ -3049,7 +2839,7 @@
               <w:tab w:val="right" w:leader="dot" w:pos="9350"/>
             </w:tabs>
             <w:rPr>
-              <w:rFonts w:ascii="Times New Roman" w:eastAsiaTheme="minorEastAsia" w:hAnsi="Times New Roman" w:cs="Times New Roman"/>
+              <w:rFonts w:eastAsiaTheme="minorEastAsia" w:cstheme="minorBidi"/>
               <w:b w:val="0"/>
               <w:bCs w:val="0"/>
               <w:i w:val="0"/>
@@ -3060,11 +2850,10 @@
               <w14:ligatures w14:val="standardContextual"/>
             </w:rPr>
           </w:pPr>
-          <w:hyperlink w:anchor="_Toc220871077" w:history="1">
+          <w:hyperlink w:anchor="_Toc221127147" w:history="1">
             <w:r>
               <w:rPr>
                 <w:rStyle w:val="a6"/>
-                <w:rFonts w:ascii="Times New Roman" w:hAnsi="Times New Roman" w:cs="Times New Roman"/>
                 <w:noProof/>
                 <w:w w:val="101"/>
               </w:rPr>
@@ -3072,7 +2861,7 @@
             </w:r>
             <w:r>
               <w:rPr>
-                <w:rFonts w:ascii="Times New Roman" w:eastAsiaTheme="minorEastAsia" w:hAnsi="Times New Roman" w:cs="Times New Roman"/>
+                <w:rFonts w:eastAsiaTheme="minorEastAsia" w:cstheme="minorBidi"/>
                 <w:b w:val="0"/>
                 <w:bCs w:val="0"/>
                 <w:i w:val="0"/>
@@ -3087,7 +2876,6 @@
             <w:r>
               <w:rPr>
                 <w:rStyle w:val="a6"/>
-                <w:rFonts w:ascii="Times New Roman" w:hAnsi="Times New Roman" w:cs="Times New Roman"/>
                 <w:noProof/>
               </w:rPr>
               <w:t>Календарный</w:t>
@@ -3095,7 +2883,6 @@
             <w:r>
               <w:rPr>
                 <w:rStyle w:val="a6"/>
-                <w:rFonts w:ascii="Times New Roman" w:hAnsi="Times New Roman" w:cs="Times New Roman"/>
                 <w:noProof/>
                 <w:spacing w:val="8"/>
               </w:rPr>
@@ -3104,7 +2891,6 @@
             <w:r>
               <w:rPr>
                 <w:rStyle w:val="a6"/>
-                <w:rFonts w:ascii="Times New Roman" w:hAnsi="Times New Roman" w:cs="Times New Roman"/>
                 <w:noProof/>
               </w:rPr>
               <w:t>план</w:t>
@@ -3112,7 +2898,6 @@
             <w:r>
               <w:rPr>
                 <w:rStyle w:val="a6"/>
-                <w:rFonts w:ascii="Times New Roman" w:hAnsi="Times New Roman" w:cs="Times New Roman"/>
                 <w:noProof/>
                 <w:spacing w:val="8"/>
               </w:rPr>
@@ -3121,7 +2906,6 @@
             <w:r>
               <w:rPr>
                 <w:rStyle w:val="a6"/>
-                <w:rFonts w:ascii="Times New Roman" w:hAnsi="Times New Roman" w:cs="Times New Roman"/>
                 <w:noProof/>
                 <w:spacing w:val="-4"/>
               </w:rPr>
@@ -3129,7 +2913,6 @@
             </w:r>
             <w:r>
               <w:rPr>
-                <w:rFonts w:ascii="Times New Roman" w:hAnsi="Times New Roman" w:cs="Times New Roman"/>
                 <w:noProof/>
                 <w:webHidden/>
               </w:rPr>
@@ -3137,7 +2920,6 @@
             </w:r>
             <w:r>
               <w:rPr>
-                <w:rFonts w:ascii="Times New Roman" w:hAnsi="Times New Roman" w:cs="Times New Roman"/>
                 <w:noProof/>
                 <w:webHidden/>
               </w:rPr>
@@ -3145,22 +2927,19 @@
             </w:r>
             <w:r>
               <w:rPr>
-                <w:rFonts w:ascii="Times New Roman" w:hAnsi="Times New Roman" w:cs="Times New Roman"/>
-                <w:noProof/>
-                <w:webHidden/>
-              </w:rPr>
-              <w:instrText xml:space="preserve"> PAGEREF _Toc220871077 \h </w:instrText>
-            </w:r>
-            <w:r>
-              <w:rPr>
-                <w:rFonts w:ascii="Times New Roman" w:hAnsi="Times New Roman" w:cs="Times New Roman"/>
-                <w:noProof/>
-                <w:webHidden/>
-              </w:rPr>
-            </w:r>
-            <w:r>
-              <w:rPr>
-                <w:rFonts w:ascii="Times New Roman" w:hAnsi="Times New Roman" w:cs="Times New Roman"/>
+                <w:noProof/>
+                <w:webHidden/>
+              </w:rPr>
+              <w:instrText xml:space="preserve"> PAGEREF _Toc221127147 \h </w:instrText>
+            </w:r>
+            <w:r>
+              <w:rPr>
+                <w:noProof/>
+                <w:webHidden/>
+              </w:rPr>
+            </w:r>
+            <w:r>
+              <w:rPr>
                 <w:noProof/>
                 <w:webHidden/>
               </w:rPr>
@@ -3168,15 +2947,13 @@
             </w:r>
             <w:r>
               <w:rPr>
-                <w:rFonts w:ascii="Times New Roman" w:hAnsi="Times New Roman" w:cs="Times New Roman"/>
-                <w:noProof/>
-                <w:webHidden/>
-              </w:rPr>
-              <w:t>6</w:t>
-            </w:r>
-            <w:r>
-              <w:rPr>
-                <w:rFonts w:ascii="Times New Roman" w:hAnsi="Times New Roman" w:cs="Times New Roman"/>
+                <w:noProof/>
+                <w:webHidden/>
+              </w:rPr>
+              <w:t>7</w:t>
+            </w:r>
+            <w:r>
+              <w:rPr>
                 <w:noProof/>
                 <w:webHidden/>
               </w:rPr>
@@ -3192,7 +2969,7 @@
               <w:tab w:val="right" w:leader="dot" w:pos="9350"/>
             </w:tabs>
             <w:rPr>
-              <w:rFonts w:ascii="Times New Roman" w:eastAsiaTheme="minorEastAsia" w:hAnsi="Times New Roman" w:cs="Times New Roman"/>
+              <w:rFonts w:eastAsiaTheme="minorEastAsia" w:cstheme="minorBidi"/>
               <w:b w:val="0"/>
               <w:bCs w:val="0"/>
               <w:i w:val="0"/>
@@ -3203,11 +2980,10 @@
               <w14:ligatures w14:val="standardContextual"/>
             </w:rPr>
           </w:pPr>
-          <w:hyperlink w:anchor="_Toc220871078" w:history="1">
+          <w:hyperlink w:anchor="_Toc221127148" w:history="1">
             <w:r>
               <w:rPr>
                 <w:rStyle w:val="a6"/>
-                <w:rFonts w:ascii="Times New Roman" w:hAnsi="Times New Roman" w:cs="Times New Roman"/>
                 <w:noProof/>
                 <w:w w:val="101"/>
               </w:rPr>
@@ -3215,7 +2991,7 @@
             </w:r>
             <w:r>
               <w:rPr>
-                <w:rFonts w:ascii="Times New Roman" w:eastAsiaTheme="minorEastAsia" w:hAnsi="Times New Roman" w:cs="Times New Roman"/>
+                <w:rFonts w:eastAsiaTheme="minorEastAsia" w:cstheme="minorBidi"/>
                 <w:b w:val="0"/>
                 <w:bCs w:val="0"/>
                 <w:i w:val="0"/>
@@ -3230,7 +3006,6 @@
             <w:r>
               <w:rPr>
                 <w:rStyle w:val="a6"/>
-                <w:rFonts w:ascii="Times New Roman" w:hAnsi="Times New Roman" w:cs="Times New Roman"/>
                 <w:noProof/>
               </w:rPr>
               <w:t>Список</w:t>
@@ -3238,7 +3013,6 @@
             <w:r>
               <w:rPr>
                 <w:rStyle w:val="a6"/>
-                <w:rFonts w:ascii="Times New Roman" w:hAnsi="Times New Roman" w:cs="Times New Roman"/>
                 <w:noProof/>
                 <w:spacing w:val="7"/>
               </w:rPr>
@@ -3247,7 +3021,6 @@
             <w:r>
               <w:rPr>
                 <w:rStyle w:val="a6"/>
-                <w:rFonts w:ascii="Times New Roman" w:hAnsi="Times New Roman" w:cs="Times New Roman"/>
                 <w:noProof/>
                 <w:spacing w:val="-2"/>
               </w:rPr>
@@ -3255,7 +3028,6 @@
             </w:r>
             <w:r>
               <w:rPr>
-                <w:rFonts w:ascii="Times New Roman" w:hAnsi="Times New Roman" w:cs="Times New Roman"/>
                 <w:noProof/>
                 <w:webHidden/>
               </w:rPr>
@@ -3263,7 +3035,6 @@
             </w:r>
             <w:r>
               <w:rPr>
-                <w:rFonts w:ascii="Times New Roman" w:hAnsi="Times New Roman" w:cs="Times New Roman"/>
                 <w:noProof/>
                 <w:webHidden/>
               </w:rPr>
@@ -3271,22 +3042,19 @@
             </w:r>
             <w:r>
               <w:rPr>
-                <w:rFonts w:ascii="Times New Roman" w:hAnsi="Times New Roman" w:cs="Times New Roman"/>
-                <w:noProof/>
-                <w:webHidden/>
-              </w:rPr>
-              <w:instrText xml:space="preserve"> PAGEREF _Toc220871078 \h </w:instrText>
-            </w:r>
-            <w:r>
-              <w:rPr>
-                <w:rFonts w:ascii="Times New Roman" w:hAnsi="Times New Roman" w:cs="Times New Roman"/>
-                <w:noProof/>
-                <w:webHidden/>
-              </w:rPr>
-            </w:r>
-            <w:r>
-              <w:rPr>
-                <w:rFonts w:ascii="Times New Roman" w:hAnsi="Times New Roman" w:cs="Times New Roman"/>
+                <w:noProof/>
+                <w:webHidden/>
+              </w:rPr>
+              <w:instrText xml:space="preserve"> PAGEREF _Toc221127148 \h </w:instrText>
+            </w:r>
+            <w:r>
+              <w:rPr>
+                <w:noProof/>
+                <w:webHidden/>
+              </w:rPr>
+            </w:r>
+            <w:r>
+              <w:rPr>
                 <w:noProof/>
                 <w:webHidden/>
               </w:rPr>
@@ -3294,15 +3062,13 @@
             </w:r>
             <w:r>
               <w:rPr>
-                <w:rFonts w:ascii="Times New Roman" w:hAnsi="Times New Roman" w:cs="Times New Roman"/>
-                <w:noProof/>
-                <w:webHidden/>
-              </w:rPr>
-              <w:t>8</w:t>
-            </w:r>
-            <w:r>
-              <w:rPr>
-                <w:rFonts w:ascii="Times New Roman" w:hAnsi="Times New Roman" w:cs="Times New Roman"/>
+                <w:noProof/>
+                <w:webHidden/>
+              </w:rPr>
+              <w:t>9</w:t>
+            </w:r>
+            <w:r>
+              <w:rPr>
                 <w:noProof/>
                 <w:webHidden/>
               </w:rPr>
@@ -3351,7 +3117,7 @@
         <w:ind w:hanging="430"/>
       </w:pPr>
       <w:bookmarkStart w:id="2" w:name="Введение"/>
-      <w:bookmarkStart w:id="3" w:name="_Toc220871056"/>
+      <w:bookmarkStart w:id="3" w:name="_Toc221127126"/>
       <w:bookmarkEnd w:id="2"/>
       <w:r>
         <w:rPr>
@@ -3384,7 +3150,7 @@
         <w:ind w:left="715" w:hanging="573"/>
       </w:pPr>
       <w:bookmarkStart w:id="4" w:name="Актуальность"/>
-      <w:bookmarkStart w:id="5" w:name="_Toc220871057"/>
+      <w:bookmarkStart w:id="5" w:name="_Toc221127127"/>
       <w:bookmarkEnd w:id="4"/>
       <w:r>
         <w:rPr>
@@ -3398,24 +3164,61 @@
       <w:pPr>
         <w:pStyle w:val="a3"/>
         <w:spacing w:before="235"/>
-        <w:ind w:left="142" w:right="142" w:firstLine="573"/>
+        <w:ind w:left="142" w:right="142" w:firstLine="567"/>
         <w:jc w:val="both"/>
-        <w:rPr>
-          <w:rFonts w:eastAsiaTheme="minorHAnsi"/>
-        </w:rPr>
-      </w:pPr>
-      <w:r>
-        <w:rPr>
-          <w:rFonts w:eastAsiaTheme="minorHAnsi"/>
-        </w:rPr>
-        <w:t>Актуальность исследования MDMTSP обусловлена тем, что в практических задачах логистики и распределения (мультидепо-доставка, распределительные сети, last-mile) требуется одновременно планировать несколько маршрутов, стартующих из разных баз, при больших объёмах данных и жёстких ограничениях по времени расчёта. При этом MDMTSP вычислительно сложна (NP-трудна) и тесно связана с ключевыми много-депо задачами маршрутизации (MDVRP/Location Routing), поэтому прямые точные методы быстро становятся непригодны на крупном масштабе. Наиболее перспективным направлением остаются высокопроизводительные эвристики уровня Lin–Kernighan–Helsgaun (LKH), которые показывают сильные результаты для больших TSP и используются как базовый «солвер» локального поиска. Однако учёт нескольких депо и распределения клиентов между турами требует специальных адаптаций: даже классические преобразования MDMTSP в ATSP с последующим запуском LKH демонстрируют потенциал подхода, но одновременно подчёркивают важность корректного моделирования и настройки поиска.</w:t>
+      </w:pPr>
+      <w:r>
+        <w:t>Актуальность исследования MDMTSP обусловлена тем, что в практических задачах логистики и распределения, таких как доставка из нескольких баз, распределительные сети, требуется одновременно планировать несколько маршрутов, стартующих из разных депо, при больших объёмах данных и ограничениях по времени расчёта. При этом MDMTSP является вычислительно сложной задачей и тесно связана с ключевыми многодепо задачами маршрутизации, поэтому прямые точные методы быстро становятся не</w:t>
+      </w:r>
+      <w:r>
+        <w:t>жизнеспособны</w:t>
+      </w:r>
+      <w:r>
+        <w:t xml:space="preserve"> на </w:t>
+      </w:r>
+      <w:r>
+        <w:t>данных крупного размера</w:t>
+      </w:r>
+      <w:r>
+        <w:t>. Наиболее перспективным направлением остаются высокопроизводительные эвристики</w:t>
+      </w:r>
+      <w:r>
+        <w:t xml:space="preserve"> (</w:t>
+      </w:r>
+      <w:r>
+        <w:rPr>
+          <w:lang w:val="en-US"/>
+        </w:rPr>
+        <w:t>LKH</w:t>
+      </w:r>
+      <w:r>
+        <w:t xml:space="preserve"> </w:t>
+      </w:r>
+      <w:r>
+        <w:t>и т.п.)</w:t>
+      </w:r>
+      <w:r>
+        <w:t xml:space="preserve">, которые показывают </w:t>
+      </w:r>
+      <w:r>
+        <w:t>хорошие</w:t>
+      </w:r>
+      <w:r>
+        <w:t xml:space="preserve"> результаты для больших задач коммивояжёра и используются как базовый </w:t>
+      </w:r>
+      <w:r>
+        <w:t>солвер</w:t>
+      </w:r>
+      <w:r>
+        <w:t xml:space="preserve"> локального поиска. Однако учёт нескольких депо и распределение клиентов между маршрутами требуют специальных адаптаций: даже классические преобразования MDMTSP в асимметричную задачу коммивояжёра с последующим запуском таких эвристик демонстрируют потенциал подхода, но одновременно подчёркивают важность корректного моделирования и настройки поиска.</w:t>
       </w:r>
     </w:p>
     <w:p>
       <w:pPr>
         <w:pStyle w:val="a3"/>
-        <w:spacing w:before="112"/>
-        <w:ind w:firstLine="142"/>
+        <w:spacing w:before="235"/>
+        <w:ind w:left="142" w:right="142" w:firstLine="142"/>
+        <w:jc w:val="both"/>
       </w:pPr>
     </w:p>
     <w:p>
@@ -3431,7 +3234,7 @@
         <w:ind w:left="715" w:hanging="573"/>
       </w:pPr>
       <w:bookmarkStart w:id="6" w:name="Объект_и_предмет_исследования"/>
-      <w:bookmarkStart w:id="7" w:name="_Toc220871058"/>
+      <w:bookmarkStart w:id="7" w:name="_Toc221127128"/>
       <w:bookmarkEnd w:id="6"/>
       <w:r>
         <w:t>Объект</w:t>
@@ -3599,7 +3402,7 @@
         <w:ind w:left="715" w:hanging="573"/>
       </w:pPr>
       <w:bookmarkStart w:id="8" w:name="Методы_исследования"/>
-      <w:bookmarkStart w:id="9" w:name="_Toc220871059"/>
+      <w:bookmarkStart w:id="9" w:name="_Toc221127129"/>
       <w:bookmarkEnd w:id="8"/>
       <w:r>
         <w:t>Методы</w:t>
@@ -3633,7 +3436,7 @@
           <w:sz w:val="24"/>
           <w:szCs w:val="24"/>
         </w:rPr>
-        <w:t>Основной метод исследования — вычислительный эксперимент: формализация выбранной постановки MDMTSP (ограничения и целевая функция); реализация набора эвристик (назначение клиентов/агентов, построение маршрутов, межмаршрутные операторы улучшения) и базовых методов сравнения; серия прогонов на стандартизированных инстансах при фиксированном бюджете времени/итераций и фиксируемых случайных seed; сбор метрик качества (суммарная стоимость, максимальная длина маршрута, показатели баланса), времени и памяти; статистическое сравнение и анализ устойчивости методов к параметрам и масштабу</w:t>
+        <w:t>Основной метод исследования — вычислительный эксперимент</w:t>
       </w:r>
       <w:r>
         <w:rPr>
@@ -3641,6 +3444,20 @@
           <w:szCs w:val="24"/>
         </w:rPr>
         <w:t>.</w:t>
+      </w:r>
+      <w:r>
+        <w:rPr>
+          <w:sz w:val="24"/>
+          <w:szCs w:val="24"/>
+        </w:rPr>
+        <w:t xml:space="preserve"> </w:t>
+      </w:r>
+      <w:r>
+        <w:rPr>
+          <w:sz w:val="24"/>
+          <w:szCs w:val="24"/>
+        </w:rPr>
+        <w:t>Сначала формализуется выбранная постановка MDMTSP, включая ограничения и целевую функцию. Затем реализуются эвристики для назначения клиентов и агентов, построения маршрутов и межмаршрутного улучшения, а также базовые методы для сравнения. После этого проводится серия прогонов на стандартизированных инстансах при фиксированном бюджете времени или итераций и фиксируемых случайных seed. Далее собираются метрики качества, такие как суммарная стоимость, максимальная длина маршрута и показатели баланса, а также метрики времени и памяти. В конце выполняется статистическое сравнение и анализ устойчивости методов к параметрам и масштабу.</w:t>
       </w:r>
     </w:p>
     <w:p>
@@ -3664,7 +3481,7 @@
         <w:ind w:left="715" w:hanging="573"/>
       </w:pPr>
       <w:bookmarkStart w:id="10" w:name="Цель_исследования"/>
-      <w:bookmarkStart w:id="11" w:name="_Toc220871060"/>
+      <w:bookmarkStart w:id="11" w:name="_Toc221127130"/>
       <w:bookmarkEnd w:id="10"/>
       <w:r>
         <w:t>Цель</w:t>
@@ -3691,11 +3508,8 @@
         <w:jc w:val="both"/>
       </w:pPr>
       <w:r>
-        <w:t xml:space="preserve">Разработать и исследовать эффективные и масштабируемые эвристические методы оптимизации маршрутов для задачи нескольких коммивояжёров с несколькими депо </w:t>
-      </w:r>
-      <w:r>
         <w:lastRenderedPageBreak/>
-        <w:t>(MDMTSP), обеспечивающие высокое качество решений при больших размерах входных данных.</w:t>
+        <w:t>Разработать и исследовать эффективные и масштабируемые эвристические методы оптимизации маршрутов для задачи нескольких коммивояжёров с несколькими депо (MDMTSP), обеспечивающие высокое качество решений при больших размерах входных данных.</w:t>
       </w:r>
     </w:p>
     <w:p>
@@ -3719,7 +3533,7 @@
         <w:ind w:left="715" w:hanging="573"/>
       </w:pPr>
       <w:bookmarkStart w:id="12" w:name="Задачи_исследования"/>
-      <w:bookmarkStart w:id="13" w:name="_Toc220871061"/>
+      <w:bookmarkStart w:id="13" w:name="_Toc221127131"/>
       <w:bookmarkEnd w:id="12"/>
       <w:r>
         <w:t>Задачи</w:t>
@@ -3919,8 +3733,79 @@
     <w:p>
       <w:pPr>
         <w:pStyle w:val="a8"/>
+        <w:numPr>
+          <w:ilvl w:val="1"/>
+          <w:numId w:val="3"/>
+        </w:numPr>
         <w:spacing w:before="235" w:beforeAutospacing="0"/>
-        <w:ind w:left="646" w:right="142"/>
+        <w:ind w:right="142" w:hanging="650"/>
+        <w:jc w:val="both"/>
+        <w:rPr>
+          <w:b/>
+          <w:bCs/>
+          <w:sz w:val="28"/>
+          <w:szCs w:val="28"/>
+        </w:rPr>
+      </w:pPr>
+      <w:r>
+        <w:rPr>
+          <w:b/>
+          <w:bCs/>
+          <w:sz w:val="28"/>
+          <w:szCs w:val="28"/>
+        </w:rPr>
+        <w:t xml:space="preserve"> </w:t>
+      </w:r>
+      <w:r>
+        <w:rPr>
+          <w:b/>
+          <w:bCs/>
+          <w:sz w:val="28"/>
+          <w:szCs w:val="28"/>
+        </w:rPr>
+        <w:t>Гипотеза</w:t>
+      </w:r>
+    </w:p>
+    <w:p>
+      <w:pPr>
+        <w:pStyle w:val="a8"/>
+        <w:spacing w:before="235" w:beforeAutospacing="0"/>
+        <w:ind w:left="142" w:right="142" w:firstLine="360"/>
+        <w:jc w:val="both"/>
+      </w:pPr>
+      <w:r>
+        <w:t>Предполагается, что задачу MDMTSP можно решать заметно эффективнее, если разбивать её на несколько последовательных этапов: сначала распределять клиентов между депо и агентами, затем строить маршруты внутри получившихся групп, а после этого дополнительно улучшать решение за счёт обменов и перестановок между маршрутами. Такой подход должен давать более качественные решения при том же ограничении по времени, чем прямые или наивные методы.</w:t>
+      </w:r>
+    </w:p>
+    <w:p>
+      <w:pPr>
+        <w:pStyle w:val="a8"/>
+        <w:spacing w:before="235" w:beforeAutospacing="0"/>
+        <w:ind w:left="142" w:right="142" w:firstLine="360"/>
+        <w:jc w:val="both"/>
+      </w:pPr>
+      <w:r>
+        <w:t>На каждом этапе ключевую роль будут играть эвристики. Для назначения можно использовать простые правила (например, близость к депо) и более «умные» варианты, которые учитывают баланс нагрузки между агентами. Для построения маршрутов внутри групп подойдут быстрые начальные эвристики и локальный поиск, а для финального улучшения важны межмаршрутные операции, которые позволяют переносить клиентов между маршрутами, менять их местами и пересобирать участки маршрутов. Идея в том, что даже если стартовое решение не идеальное, последовательное применение таких эвристик позволяет стабильно “дожимать” качество без взрывного роста времени.</w:t>
+      </w:r>
+    </w:p>
+    <w:p>
+      <w:pPr>
+        <w:pStyle w:val="a8"/>
+        <w:spacing w:before="235" w:beforeAutospacing="0"/>
+        <w:ind w:left="142" w:right="142" w:firstLine="360"/>
+        <w:jc w:val="both"/>
+      </w:pPr>
+      <w:r>
+        <w:lastRenderedPageBreak/>
+        <w:t>Ожидается, что наибольший эффект даст сочетание разумного назначения с сильным локальным улучшением маршрутов и последующей межмаршрутной доработкой. Особенно заметным преимущество должно быть на больших задачах и в сценариях с несколькими депо, где простые схемы быстро упираются в ограничения, а универсальные решатели могут сильнее зависеть от настроек. Поэтому предполагается, что комбинированная стратегия будет стабильно давать лучший компромисс между качеством решения и временем расчёта по сравнению с базовыми вариантами вроде «ближайшее депо и отдельные маршруты» или стандартной конфигурации общего VRP-решателя.</w:t>
+      </w:r>
+    </w:p>
+    <w:p>
+      <w:pPr>
+        <w:pStyle w:val="a8"/>
+        <w:spacing w:before="235" w:beforeAutospacing="0"/>
+        <w:ind w:left="142" w:right="142" w:firstLine="360"/>
+        <w:jc w:val="both"/>
       </w:pPr>
     </w:p>
     <w:p>
@@ -3936,7 +3821,7 @@
         <w:ind w:hanging="430"/>
       </w:pPr>
       <w:bookmarkStart w:id="14" w:name="Новизна_и_достоверность_результатов"/>
-      <w:bookmarkStart w:id="15" w:name="_Toc220871062"/>
+      <w:bookmarkStart w:id="15" w:name="_Toc221127132"/>
       <w:bookmarkEnd w:id="14"/>
       <w:r>
         <w:t>Новизна</w:t>
@@ -4017,7 +3902,7 @@
         <w:ind w:left="715" w:hanging="573"/>
       </w:pPr>
       <w:bookmarkStart w:id="16" w:name="Теоретическая_значимость_результатов"/>
-      <w:bookmarkStart w:id="17" w:name="_Toc220871063"/>
+      <w:bookmarkStart w:id="17" w:name="_Toc221127133"/>
       <w:bookmarkEnd w:id="16"/>
       <w:r>
         <w:t>Теоретическая</w:t>
@@ -4061,11 +3946,7 @@
         <w:t>Теоретическая значимость результатов</w:t>
       </w:r>
       <w:r>
-        <w:t xml:space="preserve"> заключается в систематизации и уточнении подходов к решению MDMTSP, а также в выявлении закономерностей влияния структуры задачи и параметров эвристических методов на качество решений и вычислительную сложность. Полученные выводы могут быть использованы для обоснования выбора классов эвристик, разработки критериев настройки и построения более эффективных схем локального поиска для многомаршрутных задач </w:t>
-      </w:r>
-      <w:r>
-        <w:lastRenderedPageBreak/>
-        <w:t>маршрутизации.</w:t>
+        <w:t xml:space="preserve"> заключается в систематизации и уточнении подходов к решению MDMTSP, а также в выявлении закономерностей влияния структуры задачи и параметров эвристических методов на качество решений и вычислительную сложность. Полученные выводы могут быть использованы для обоснования выбора классов эвристик, разработки критериев настройки и построения более эффективных схем локального поиска для многомаршрутных задач маршрутизации.</w:t>
       </w:r>
     </w:p>
     <w:p>
@@ -4089,7 +3970,7 @@
         <w:ind w:left="715" w:hanging="573"/>
       </w:pPr>
       <w:bookmarkStart w:id="18" w:name="Практическая_ценность_результатов"/>
-      <w:bookmarkStart w:id="19" w:name="_Toc220871064"/>
+      <w:bookmarkStart w:id="19" w:name="_Toc221127134"/>
       <w:bookmarkEnd w:id="18"/>
       <w:r>
         <w:t>Практическая</w:t>
@@ -4166,7 +4047,7 @@
         <w:ind w:hanging="430"/>
       </w:pPr>
       <w:bookmarkStart w:id="20" w:name="Обзор_и_анализ_источников,_выбор_методов"/>
-      <w:bookmarkStart w:id="21" w:name="_Toc220871065"/>
+      <w:bookmarkStart w:id="21" w:name="_Toc221127135"/>
       <w:bookmarkEnd w:id="20"/>
       <w:r>
         <w:t>Обзор</w:t>
@@ -4237,6 +4118,7 @@
         </w:rPr>
         <w:t xml:space="preserve"> </w:t>
       </w:r>
+      <w:bookmarkStart w:id="22" w:name="_Toc221127136"/>
       <w:r>
         <w:rPr>
           <w:sz w:val="28"/>
@@ -4244,6 +4126,7 @@
         </w:rPr>
         <w:t>Источники и бенчмарки</w:t>
       </w:r>
+      <w:bookmarkEnd w:id="22"/>
     </w:p>
     <w:p>
       <w:pPr>
@@ -4265,7 +4148,7 @@
           <w:szCs w:val="24"/>
         </w:rPr>
       </w:pPr>
-      <w:bookmarkStart w:id="22" w:name="_Toc220871067"/>
+      <w:bookmarkStart w:id="23" w:name="_Toc221127137"/>
       <w:r>
         <w:rPr>
           <w:rStyle w:val="a7"/>
@@ -4274,7 +4157,7 @@
         </w:rPr>
         <w:t>Базовый справочник по VRP и основным вариантам</w:t>
       </w:r>
-      <w:bookmarkEnd w:id="22"/>
+      <w:bookmarkEnd w:id="23"/>
     </w:p>
     <w:p>
       <w:pPr>
@@ -4282,7 +4165,6 @@
         <w:tabs>
           <w:tab w:val="left" w:pos="709"/>
         </w:tabs>
-        <w:spacing w:before="235"/>
         <w:ind w:left="142" w:right="142" w:firstLine="0"/>
         <w:jc w:val="both"/>
         <w:rPr>
@@ -4292,7 +4174,7 @@
           <w:szCs w:val="24"/>
         </w:rPr>
       </w:pPr>
-      <w:bookmarkStart w:id="23" w:name="_Toc220690599"/>
+      <w:bookmarkStart w:id="24" w:name="_Toc220690599"/>
       <w:r>
         <w:rPr>
           <w:b w:val="0"/>
@@ -4302,7 +4184,8 @@
         </w:rPr>
         <w:tab/>
       </w:r>
-      <w:bookmarkStart w:id="24" w:name="_Toc220871068"/>
+      <w:bookmarkStart w:id="25" w:name="_Toc220871068"/>
+      <w:bookmarkStart w:id="26" w:name="_Toc221127138"/>
       <w:r>
         <w:rPr>
           <w:b w:val="0"/>
@@ -4331,8 +4214,9 @@
         </w:rPr>
         <w:t xml:space="preserve"> (охватывает постановки, методы, практические аспекты и связи вариантов задач).</w:t>
       </w:r>
-      <w:bookmarkEnd w:id="23"/>
       <w:bookmarkEnd w:id="24"/>
+      <w:bookmarkEnd w:id="25"/>
+      <w:bookmarkEnd w:id="26"/>
     </w:p>
     <w:p>
       <w:pPr>
@@ -4354,16 +4238,17 @@
           <w:szCs w:val="24"/>
         </w:rPr>
       </w:pPr>
-      <w:bookmarkStart w:id="25" w:name="_Toc220871069"/>
+      <w:bookmarkStart w:id="27" w:name="_Toc221127139"/>
       <w:r>
         <w:rPr>
           <w:rStyle w:val="a7"/>
           <w:sz w:val="24"/>
           <w:szCs w:val="24"/>
         </w:rPr>
+        <w:lastRenderedPageBreak/>
         <w:t>OR-Tools (Google)</w:t>
       </w:r>
-      <w:bookmarkEnd w:id="25"/>
+      <w:bookmarkEnd w:id="27"/>
     </w:p>
     <w:p>
       <w:pPr>
@@ -4371,7 +4256,6 @@
         <w:tabs>
           <w:tab w:val="left" w:pos="709"/>
         </w:tabs>
-        <w:spacing w:before="235"/>
         <w:ind w:left="142" w:right="142" w:firstLine="0"/>
         <w:jc w:val="both"/>
         <w:rPr>
@@ -4381,7 +4265,7 @@
           <w:szCs w:val="24"/>
         </w:rPr>
       </w:pPr>
-      <w:bookmarkStart w:id="26" w:name="_Toc220690601"/>
+      <w:bookmarkStart w:id="28" w:name="_Toc220690601"/>
       <w:r>
         <w:rPr>
           <w:b w:val="0"/>
@@ -4391,7 +4275,8 @@
         </w:rPr>
         <w:tab/>
       </w:r>
-      <w:bookmarkStart w:id="27" w:name="_Toc220871070"/>
+      <w:bookmarkStart w:id="29" w:name="_Toc220871070"/>
+      <w:bookmarkStart w:id="30" w:name="_Toc221127140"/>
       <w:r>
         <w:rPr>
           <w:b w:val="0"/>
@@ -4410,8 +4295,9 @@
         </w:rPr>
         <w:t>латформа для моделирования VRP с ограничениями; поддерживает многодепо постановки (разные старты/финиши для машин).</w:t>
       </w:r>
-      <w:bookmarkEnd w:id="26"/>
-      <w:bookmarkEnd w:id="27"/>
+      <w:bookmarkEnd w:id="28"/>
+      <w:bookmarkEnd w:id="29"/>
+      <w:bookmarkEnd w:id="30"/>
     </w:p>
     <w:p>
       <w:pPr>
@@ -4454,7 +4340,7 @@
         </w:rPr>
         <w:t xml:space="preserve"> </w:t>
       </w:r>
-      <w:bookmarkStart w:id="28" w:name="_Toc220871071"/>
+      <w:bookmarkStart w:id="31" w:name="_Toc221127141"/>
       <w:r>
         <w:rPr>
           <w:sz w:val="28"/>
@@ -4462,7 +4348,7 @@
         </w:rPr>
         <w:t>Библиотеки и солверы</w:t>
       </w:r>
-      <w:bookmarkEnd w:id="28"/>
+      <w:bookmarkEnd w:id="31"/>
     </w:p>
     <w:p>
       <w:pPr>
@@ -4484,7 +4370,7 @@
           <w:szCs w:val="24"/>
         </w:rPr>
       </w:pPr>
-      <w:bookmarkStart w:id="29" w:name="_Toc220871072"/>
+      <w:bookmarkStart w:id="32" w:name="_Toc221127142"/>
       <w:r>
         <w:rPr>
           <w:b w:val="0"/>
@@ -4504,7 +4390,7 @@
         </w:rPr>
         <w:t>95</w:t>
       </w:r>
-      <w:bookmarkEnd w:id="29"/>
+      <w:bookmarkEnd w:id="32"/>
     </w:p>
     <w:p>
       <w:pPr>
@@ -4512,7 +4398,6 @@
         <w:tabs>
           <w:tab w:val="left" w:pos="709"/>
         </w:tabs>
-        <w:spacing w:before="235"/>
         <w:ind w:left="142" w:right="142" w:firstLine="0"/>
         <w:jc w:val="both"/>
         <w:rPr>
@@ -4522,7 +4407,7 @@
           <w:szCs w:val="24"/>
         </w:rPr>
       </w:pPr>
-      <w:bookmarkStart w:id="30" w:name="_Toc220690604"/>
+      <w:bookmarkStart w:id="33" w:name="_Toc220690604"/>
       <w:r>
         <w:rPr>
           <w:rStyle w:val="a7"/>
@@ -4531,7 +4416,8 @@
         </w:rPr>
         <w:tab/>
       </w:r>
-      <w:bookmarkStart w:id="31" w:name="_Toc220871073"/>
+      <w:bookmarkStart w:id="34" w:name="_Toc220871073"/>
+      <w:bookmarkStart w:id="35" w:name="_Toc221127143"/>
       <w:r>
         <w:rPr>
           <w:rStyle w:val="a7"/>
@@ -4588,8 +4474,9 @@
         </w:rPr>
         <w:t xml:space="preserve"> для задач коммивояжёра и близких задач (в TSPLIB95 прямо перечислены: TSP, ATSP, SOP, HCP, CVRP, а также файлы с турами).</w:t>
       </w:r>
-      <w:bookmarkEnd w:id="30"/>
-      <w:bookmarkEnd w:id="31"/>
+      <w:bookmarkEnd w:id="33"/>
+      <w:bookmarkEnd w:id="34"/>
+      <w:bookmarkEnd w:id="35"/>
     </w:p>
     <w:p>
       <w:pPr>
@@ -4611,7 +4498,7 @@
           <w:szCs w:val="24"/>
         </w:rPr>
       </w:pPr>
-      <w:bookmarkStart w:id="32" w:name="_Toc220871074"/>
+      <w:bookmarkStart w:id="36" w:name="_Toc221127144"/>
       <w:r>
         <w:rPr>
           <w:rStyle w:val="a7"/>
@@ -4620,7 +4507,7 @@
         </w:rPr>
         <w:t>LKH-3</w:t>
       </w:r>
-      <w:bookmarkEnd w:id="32"/>
+      <w:bookmarkEnd w:id="36"/>
     </w:p>
     <w:p>
       <w:pPr>
@@ -4628,7 +4515,6 @@
         <w:tabs>
           <w:tab w:val="left" w:pos="709"/>
         </w:tabs>
-        <w:spacing w:before="235"/>
         <w:ind w:left="142" w:right="142" w:firstLine="0"/>
         <w:jc w:val="both"/>
         <w:rPr>
@@ -4638,7 +4524,7 @@
           <w:szCs w:val="24"/>
         </w:rPr>
       </w:pPr>
-      <w:bookmarkStart w:id="33" w:name="_Toc220690606"/>
+      <w:bookmarkStart w:id="37" w:name="_Toc220690606"/>
       <w:r>
         <w:rPr>
           <w:b w:val="0"/>
@@ -4648,7 +4534,8 @@
         </w:rPr>
         <w:tab/>
       </w:r>
-      <w:bookmarkStart w:id="34" w:name="_Toc220871075"/>
+      <w:bookmarkStart w:id="38" w:name="_Toc220871075"/>
+      <w:bookmarkStart w:id="39" w:name="_Toc221127145"/>
       <w:r>
         <w:rPr>
           <w:b w:val="0"/>
@@ -4667,8 +4554,9 @@
         </w:rPr>
         <w:t>лассический высокоэффективный солвер (TSP и ряд VRP/констрейнтовых вариантов), часто используется как базовый бэкенд эвристического поиска.</w:t>
       </w:r>
-      <w:bookmarkEnd w:id="33"/>
-      <w:bookmarkEnd w:id="34"/>
+      <w:bookmarkEnd w:id="37"/>
+      <w:bookmarkEnd w:id="38"/>
+      <w:bookmarkEnd w:id="39"/>
     </w:p>
     <w:p>
       <w:pPr>
@@ -4694,9 +4582,9 @@
         </w:tabs>
         <w:ind w:hanging="430"/>
       </w:pPr>
-      <w:bookmarkStart w:id="35" w:name="Журнал_эксперимента"/>
-      <w:bookmarkStart w:id="36" w:name="_Toc220871076"/>
-      <w:bookmarkEnd w:id="35"/>
+      <w:bookmarkStart w:id="40" w:name="Журнал_эксперимента"/>
+      <w:bookmarkStart w:id="41" w:name="_Toc221127146"/>
+      <w:bookmarkEnd w:id="40"/>
       <w:r>
         <w:t>Основные</w:t>
       </w:r>
@@ -4730,7 +4618,7 @@
         </w:rPr>
         <w:t>сокращения</w:t>
       </w:r>
-      <w:bookmarkEnd w:id="36"/>
+      <w:bookmarkEnd w:id="41"/>
     </w:p>
     <w:p>
       <w:pPr>
@@ -4756,733 +4644,29 @@
     <w:p>
       <w:pPr>
         <w:pStyle w:val="a8"/>
+        <w:tabs>
+          <w:tab w:val="left" w:pos="709"/>
+        </w:tabs>
         <w:ind w:firstLine="709"/>
         <w:jc w:val="both"/>
       </w:pPr>
       <w:r>
         <w:rPr>
-          <w:rStyle w:val="a9"/>
           <w:b/>
           <w:bCs/>
-        </w:rPr>
-        <w:t>Эвристика</w:t>
-      </w:r>
-      <w:r>
-        <w:t xml:space="preserve"> — приближённый метод, не гарантирующий оптимум, но ориентированный на хорошие решения за разумное время.</w:t>
-      </w:r>
-    </w:p>
-    <w:p>
-      <w:pPr>
-        <w:pStyle w:val="a8"/>
-        <w:ind w:firstLine="709"/>
-        <w:jc w:val="both"/>
-      </w:pPr>
-      <w:r>
-        <w:rPr>
-          <w:rStyle w:val="a9"/>
-          <w:b/>
-          <w:bCs/>
-        </w:rPr>
-        <w:t>Алгоритмы маршрутизации</w:t>
-      </w:r>
-      <w:r>
-        <w:t xml:space="preserve"> — </w:t>
-      </w:r>
-      <w:r>
-        <w:t xml:space="preserve">методы построения набора маршрутов (путей/туров) для обслуживания заданных точек при ограничениях и оптимизации выбранного критерия; включают точные, эвристические и </w:t>
-      </w:r>
-      <w:proofErr w:type="spellStart"/>
-      <w:r>
-        <w:t>метаэвристические</w:t>
-      </w:r>
-      <w:proofErr w:type="spellEnd"/>
-      <w:r>
-        <w:t xml:space="preserve"> подходы.</w:t>
-      </w:r>
-    </w:p>
-    <w:p>
-      <w:pPr>
-        <w:pStyle w:val="a8"/>
-        <w:ind w:firstLine="709"/>
-        <w:jc w:val="both"/>
-      </w:pPr>
-      <w:r>
-        <w:rPr>
-          <w:rStyle w:val="a9"/>
-          <w:b/>
-          <w:bCs/>
-        </w:rPr>
-        <w:lastRenderedPageBreak/>
-        <w:t>Граф</w:t>
-      </w:r>
-      <w:r>
-        <w:t xml:space="preserve"> — модель «вершины + рёбра», используемая для представления точек и допустимых переходов между ними.</w:t>
-      </w:r>
-    </w:p>
-    <w:p>
-      <w:pPr>
-        <w:pStyle w:val="a8"/>
-        <w:ind w:firstLine="709"/>
-        <w:jc w:val="both"/>
-      </w:pPr>
-      <w:r>
-        <w:rPr>
-          <w:rStyle w:val="a9"/>
-          <w:b/>
-          <w:bCs/>
-        </w:rPr>
-        <w:t>Гамильтонов цикл</w:t>
-      </w:r>
-      <w:r>
-        <w:t xml:space="preserve"> — замкнутый обход графа, проходящий через каждую вершину ровно один раз.</w:t>
-      </w:r>
-    </w:p>
-    <w:p>
-      <w:pPr>
-        <w:pStyle w:val="a8"/>
-        <w:ind w:firstLine="709"/>
-        <w:jc w:val="both"/>
-      </w:pPr>
-      <w:r>
-        <w:rPr>
-          <w:rStyle w:val="a9"/>
-          <w:b/>
-          <w:bCs/>
-        </w:rPr>
-        <w:t>TSP (задача коммивояжёра)</w:t>
-      </w:r>
-      <w:r>
-        <w:rPr>
-          <w:b/>
-          <w:bCs/>
-        </w:rPr>
-        <w:t xml:space="preserve"> </w:t>
-      </w:r>
-      <w:r>
-        <w:t>— поиск минимального по стоимости гамильтонова цикла по всем вершинам.</w:t>
-      </w:r>
-    </w:p>
-    <w:p>
-      <w:pPr>
-        <w:pStyle w:val="a8"/>
-        <w:ind w:firstLine="709"/>
-        <w:jc w:val="both"/>
-      </w:pPr>
-      <w:r>
-        <w:rPr>
-          <w:rStyle w:val="a9"/>
-          <w:b/>
-          <w:bCs/>
-        </w:rPr>
-        <w:t>Асимметричная задача коммивояжёра (ATSP)</w:t>
-      </w:r>
-      <w:r>
-        <w:t xml:space="preserve"> — вариант TSP, где стоимость перехода </w:t>
-      </w:r>
-      <w:r>
-        <w:rPr>
-          <w:rStyle w:val="a9"/>
-          <w:lang w:val="en-US"/>
-        </w:rPr>
-        <w:t>i</w:t>
-      </w:r>
-      <w:r>
-        <w:rPr>
-          <w:rStyle w:val="a9"/>
-        </w:rPr>
-        <w:t xml:space="preserve"> </w:t>
-      </w:r>
-      <w:r>
-        <w:rPr>
-          <w:rStyle w:val="a9"/>
-          <w:lang w:val="en-US"/>
-        </w:rPr>
-        <w:t>to</w:t>
-      </w:r>
-      <w:r>
-        <w:rPr>
-          <w:rStyle w:val="a9"/>
-        </w:rPr>
-        <w:t xml:space="preserve"> </w:t>
-      </w:r>
-      <w:r>
-        <w:rPr>
-          <w:rStyle w:val="a9"/>
-          <w:lang w:val="en-US"/>
-        </w:rPr>
-        <w:t>j</w:t>
-      </w:r>
-      <w:r>
-        <w:t xml:space="preserve"> может отличаться от </w:t>
-      </w:r>
-      <w:r>
-        <w:rPr>
-          <w:rStyle w:val="a9"/>
-          <w:lang w:val="en-US"/>
-        </w:rPr>
-        <w:t>j</w:t>
-      </w:r>
-      <w:r>
-        <w:rPr>
-          <w:rStyle w:val="a9"/>
-        </w:rPr>
-        <w:t xml:space="preserve"> </w:t>
-      </w:r>
-      <w:r>
-        <w:rPr>
-          <w:rStyle w:val="a9"/>
-          <w:lang w:val="en-US"/>
-        </w:rPr>
-        <w:t>to</w:t>
-      </w:r>
-      <w:r>
-        <w:rPr>
-          <w:rStyle w:val="a9"/>
-        </w:rPr>
-        <w:t xml:space="preserve"> </w:t>
-      </w:r>
-      <w:r>
-        <w:rPr>
-          <w:rStyle w:val="a9"/>
-          <w:lang w:val="en-US"/>
-        </w:rPr>
-        <w:t>i</w:t>
-      </w:r>
-      <w:r>
-        <w:t>; требуется минимальный гамильтонов цикл.</w:t>
-      </w:r>
-    </w:p>
-    <w:p>
-      <w:pPr>
-        <w:pStyle w:val="a8"/>
-        <w:ind w:firstLine="709"/>
-        <w:jc w:val="both"/>
-      </w:pPr>
-      <w:r>
-        <w:rPr>
-          <w:rStyle w:val="a9"/>
-          <w:b/>
-          <w:bCs/>
-          <w:lang w:val="en-US"/>
-        </w:rPr>
-        <w:t>M</w:t>
-      </w:r>
-      <w:r>
-        <w:rPr>
-          <w:rStyle w:val="a9"/>
-          <w:b/>
-          <w:bCs/>
-        </w:rPr>
-        <w:t>TSP (задача нескольких коммивояжёров)</w:t>
-      </w:r>
-      <w:r>
-        <w:t xml:space="preserve"> — обобщение TSP, где множество вершин обслуживается несколькими агентами, каждый строит свой маршрут.</w:t>
-      </w:r>
-    </w:p>
-    <w:p>
-      <w:pPr>
-        <w:pStyle w:val="a8"/>
-        <w:ind w:firstLine="709"/>
-        <w:jc w:val="both"/>
-      </w:pPr>
-      <w:r>
-        <w:rPr>
-          <w:rStyle w:val="a9"/>
-          <w:b/>
-          <w:bCs/>
-        </w:rPr>
-        <w:t>MDMTSP (несколько коммивояжёров и несколько депо)</w:t>
-      </w:r>
-      <w:r>
-        <w:t xml:space="preserve"> — </w:t>
-      </w:r>
-      <w:r>
-        <w:t>постановка классической задачи, в которой каждый клиент должен быть посещён ровно один раз одним из агентов, а каждый агент строит маршрут, начинающийся в одном из депо и (в классическом варианте) возвращающийся в депо; оптимизируется суммарная стоимость маршрутов и/или критерии балансировки нагрузки (например, минимизация максимальной длины маршрута).</w:t>
-      </w:r>
-    </w:p>
-    <w:p>
-      <w:pPr>
-        <w:pStyle w:val="a8"/>
-        <w:ind w:firstLine="709"/>
-        <w:jc w:val="both"/>
-      </w:pPr>
-      <w:r>
-        <w:rPr>
-          <w:rStyle w:val="a9"/>
-          <w:b/>
-          <w:bCs/>
-        </w:rPr>
-        <w:t>База (депо)</w:t>
-      </w:r>
-      <w:r>
-        <w:t xml:space="preserve"> — исходная и/или конечная точка маршрута агента, откуда он стартует и куда возвращается (в зависимости от постановки).</w:t>
-      </w:r>
-    </w:p>
-    <w:p>
-      <w:pPr>
-        <w:pStyle w:val="a8"/>
-        <w:ind w:firstLine="709"/>
-        <w:jc w:val="both"/>
-      </w:pPr>
-      <w:r>
-        <w:rPr>
-          <w:rStyle w:val="a9"/>
-          <w:b/>
-          <w:bCs/>
-        </w:rPr>
-        <w:t>Балансировка нагрузки</w:t>
-      </w:r>
-      <w:r>
-        <w:t xml:space="preserve"> — распределение работы между агентами так, чтобы нагрузка была близкой по выбранному критерию (длина маршрута, число точек, время).</w:t>
-      </w:r>
-    </w:p>
-    <w:p>
-      <w:pPr>
-        <w:pStyle w:val="a8"/>
-        <w:ind w:firstLine="709"/>
-        <w:jc w:val="both"/>
-      </w:pPr>
-      <w:r>
-        <w:rPr>
-          <w:rStyle w:val="a9"/>
-          <w:b/>
-          <w:bCs/>
-        </w:rPr>
-        <w:t>Вычислительная сложность</w:t>
-      </w:r>
-      <w:r>
-        <w:rPr>
-          <w:b/>
-          <w:bCs/>
-        </w:rPr>
-        <w:t xml:space="preserve"> </w:t>
-      </w:r>
-      <w:r>
-        <w:t>— оценка ресурсоёмкости алгоритма (время/память) как функции размера входа.</w:t>
-      </w:r>
-    </w:p>
-    <w:p>
-      <w:pPr>
-        <w:pStyle w:val="a8"/>
-        <w:ind w:firstLine="709"/>
-        <w:jc w:val="both"/>
-      </w:pPr>
-      <w:r>
-        <w:rPr>
-          <w:rStyle w:val="a9"/>
-          <w:b/>
-          <w:bCs/>
-        </w:rPr>
-        <w:t>Вычислительный эксперимент</w:t>
-      </w:r>
-      <w:r>
-        <w:t xml:space="preserve"> — исследование через программную реализацию и многократный запуск методов на инстансах с измерением метрик.</w:t>
-      </w:r>
-    </w:p>
-    <w:p>
-      <w:pPr>
-        <w:pStyle w:val="a8"/>
-        <w:ind w:firstLine="709"/>
-        <w:jc w:val="both"/>
-      </w:pPr>
-      <w:r>
-        <w:rPr>
-          <w:rStyle w:val="a9"/>
-          <w:b/>
-          <w:bCs/>
-        </w:rPr>
-        <w:t>Данные (набор данных)</w:t>
-      </w:r>
-      <w:r>
-        <w:t xml:space="preserve"> — совокупность инстансов и/или примеров, на которых проводятся вычисления и измеряются метрики.</w:t>
-      </w:r>
-    </w:p>
-    <w:p>
-      <w:pPr>
-        <w:pStyle w:val="a8"/>
-        <w:ind w:firstLine="709"/>
-        <w:jc w:val="both"/>
-      </w:pPr>
-      <w:r>
-        <w:rPr>
-          <w:rStyle w:val="a9"/>
-          <w:b/>
-          <w:bCs/>
-        </w:rPr>
-        <w:t>Инстанс</w:t>
-      </w:r>
-      <w:r>
-        <w:t xml:space="preserve"> — конкретный экземпляр задачи: набор узлов, матрица стоимостей/расстояний, число депо и агентов, ограничения.</w:t>
-      </w:r>
-    </w:p>
-    <w:p>
-      <w:pPr>
-        <w:pStyle w:val="a8"/>
-        <w:ind w:firstLine="709"/>
-        <w:jc w:val="both"/>
-      </w:pPr>
-      <w:r>
-        <w:rPr>
-          <w:rStyle w:val="a9"/>
-          <w:b/>
-          <w:bCs/>
-        </w:rPr>
-        <w:t>Качество решения</w:t>
-      </w:r>
-      <w:r>
-        <w:t xml:space="preserve"> — численная оценка «насколько хорошо» решение по целевой функции и дополнительным критериям.</w:t>
-      </w:r>
-    </w:p>
-    <w:p>
-      <w:pPr>
-        <w:pStyle w:val="a8"/>
-        <w:ind w:firstLine="709"/>
-        <w:jc w:val="both"/>
-      </w:pPr>
-      <w:r>
-        <w:rPr>
-          <w:rStyle w:val="a9"/>
-          <w:b/>
-          <w:bCs/>
-        </w:rPr>
-        <w:t>Клиент</w:t>
-      </w:r>
-      <w:r>
-        <w:rPr>
-          <w:b/>
-          <w:bCs/>
-        </w:rPr>
-        <w:t xml:space="preserve"> </w:t>
-      </w:r>
-      <w:r>
-        <w:t>— точка, которую необходимо посетить/обслужить в рамках маршрута (узел, отличный от депо).</w:t>
-      </w:r>
-    </w:p>
-    <w:p>
-      <w:pPr>
-        <w:pStyle w:val="a8"/>
-        <w:ind w:firstLine="709"/>
-        <w:jc w:val="both"/>
-      </w:pPr>
-      <w:r>
-        <w:rPr>
-          <w:rStyle w:val="a9"/>
-          <w:b/>
-          <w:bCs/>
-        </w:rPr>
-        <w:t>Критерий оптимальности</w:t>
-      </w:r>
-      <w:r>
-        <w:rPr>
-          <w:b/>
-          <w:bCs/>
-        </w:rPr>
-        <w:t xml:space="preserve"> </w:t>
-      </w:r>
-      <w:r>
-        <w:t>— формализованное правило сравнения решений (что именно минимизируется/</w:t>
-      </w:r>
-      <w:proofErr w:type="spellStart"/>
-      <w:r>
-        <w:t>максимизируется</w:t>
-      </w:r>
-      <w:proofErr w:type="spellEnd"/>
-      <w:r>
-        <w:t>).</w:t>
-      </w:r>
-    </w:p>
-    <w:p>
-      <w:pPr>
-        <w:pStyle w:val="a8"/>
-        <w:ind w:firstLine="709"/>
-        <w:jc w:val="both"/>
-      </w:pPr>
-      <w:r>
-        <w:rPr>
-          <w:rStyle w:val="a9"/>
-          <w:b/>
-          <w:bCs/>
-        </w:rPr>
-        <w:t>Локальный поиск</w:t>
-      </w:r>
-      <w:r>
-        <w:t xml:space="preserve"> — класс методов улучшения решения через локальные преобразования (соседства) с итеративным снижением целевой функции.</w:t>
-      </w:r>
-    </w:p>
-    <w:p>
-      <w:pPr>
-        <w:pStyle w:val="a8"/>
-        <w:ind w:firstLine="709"/>
-        <w:jc w:val="both"/>
-      </w:pPr>
-      <w:r>
-        <w:rPr>
-          <w:rStyle w:val="a9"/>
-          <w:b/>
-          <w:bCs/>
-        </w:rPr>
-        <w:lastRenderedPageBreak/>
-        <w:t>Маршрут (тур)</w:t>
-      </w:r>
-      <w:r>
-        <w:t xml:space="preserve"> — упорядоченная последовательность посещений вершин агентом, обычно связанная с депо в начале/конце.</w:t>
-      </w:r>
-    </w:p>
-    <w:p>
-      <w:pPr>
-        <w:pStyle w:val="a8"/>
-        <w:ind w:firstLine="709"/>
-        <w:jc w:val="both"/>
-      </w:pPr>
-      <w:r>
-        <w:rPr>
-          <w:rStyle w:val="a9"/>
-          <w:b/>
-          <w:bCs/>
-        </w:rPr>
-        <w:t>Масштабируемость</w:t>
-      </w:r>
-      <w:r>
-        <w:rPr>
-          <w:b/>
-          <w:bCs/>
-        </w:rPr>
-        <w:t xml:space="preserve"> </w:t>
-      </w:r>
-      <w:r>
-        <w:t>— способность метода сохранять приемлемые метрики при росте размера задачи.</w:t>
-      </w:r>
-    </w:p>
-    <w:p>
-      <w:pPr>
-        <w:pStyle w:val="a8"/>
-        <w:ind w:firstLine="709"/>
-        <w:jc w:val="both"/>
-      </w:pPr>
-      <w:r>
-        <w:rPr>
-          <w:rStyle w:val="a9"/>
-          <w:b/>
-          <w:bCs/>
-        </w:rPr>
-        <w:t>Метрики</w:t>
-      </w:r>
-      <w:r>
-        <w:t xml:space="preserve"> — набор числовых показателей для оценки и сравнения (качество, баланс, время, память и т. п.).</w:t>
-      </w:r>
-    </w:p>
-    <w:p>
-      <w:pPr>
-        <w:pStyle w:val="a8"/>
-        <w:ind w:firstLine="709"/>
-        <w:jc w:val="both"/>
-      </w:pPr>
-      <w:r>
-        <w:rPr>
-          <w:rStyle w:val="a9"/>
-          <w:b/>
-          <w:bCs/>
-        </w:rPr>
-        <w:t>Методика эксперимента</w:t>
-      </w:r>
-      <w:r>
-        <w:t xml:space="preserve"> — регламент: как выбираются данные, как запускаются методы, как измеряются метрики и фиксируются условия.</w:t>
-      </w:r>
-    </w:p>
-    <w:p>
-      <w:pPr>
-        <w:pStyle w:val="a8"/>
-        <w:ind w:firstLine="709"/>
-        <w:jc w:val="both"/>
-      </w:pPr>
-      <w:proofErr w:type="spellStart"/>
-      <w:r>
-        <w:rPr>
-          <w:rStyle w:val="a9"/>
-          <w:b/>
-          <w:bCs/>
-        </w:rPr>
-        <w:t>Многодепо</w:t>
-      </w:r>
-      <w:proofErr w:type="spellEnd"/>
-      <w:r>
-        <w:rPr>
-          <w:rStyle w:val="a9"/>
-          <w:b/>
-          <w:bCs/>
-        </w:rPr>
-        <w:t xml:space="preserve"> (</w:t>
-      </w:r>
-      <w:proofErr w:type="spellStart"/>
-      <w:r>
-        <w:rPr>
-          <w:rStyle w:val="a9"/>
-          <w:b/>
-          <w:bCs/>
-        </w:rPr>
-        <w:t>multi-depot</w:t>
-      </w:r>
-      <w:proofErr w:type="spellEnd"/>
-      <w:r>
-        <w:rPr>
-          <w:rStyle w:val="a9"/>
-          <w:b/>
-          <w:bCs/>
-        </w:rPr>
-        <w:t>)</w:t>
-      </w:r>
-      <w:r>
-        <w:t xml:space="preserve"> — постановка, допускающая несколько депо, из которых могут начинаться и/или заканчиваться маршруты.</w:t>
-      </w:r>
-    </w:p>
-    <w:p>
-      <w:pPr>
-        <w:pStyle w:val="a8"/>
-        <w:ind w:firstLine="709"/>
-        <w:jc w:val="both"/>
-      </w:pPr>
-      <w:proofErr w:type="spellStart"/>
-      <w:r>
-        <w:rPr>
-          <w:rStyle w:val="a9"/>
-          <w:b/>
-          <w:bCs/>
-        </w:rPr>
-        <w:t>Мультидепо</w:t>
-      </w:r>
-      <w:proofErr w:type="spellEnd"/>
-      <w:r>
-        <w:rPr>
-          <w:rStyle w:val="a9"/>
-          <w:b/>
-          <w:bCs/>
-        </w:rPr>
-        <w:t>-доставка</w:t>
-      </w:r>
-      <w:r>
-        <w:rPr>
-          <w:b/>
-          <w:bCs/>
-        </w:rPr>
-        <w:t xml:space="preserve"> </w:t>
-      </w:r>
-      <w:r>
-        <w:t>— прикладной сценарий обслуживания точек из нескольких баз (депо).</w:t>
-      </w:r>
-    </w:p>
-    <w:p>
-      <w:pPr>
-        <w:pStyle w:val="a8"/>
-        <w:ind w:firstLine="709"/>
-        <w:jc w:val="both"/>
-      </w:pPr>
-      <w:r>
-        <w:rPr>
-          <w:rStyle w:val="a9"/>
-          <w:b/>
-          <w:bCs/>
-        </w:rPr>
-        <w:t>NP-трудность (NP-</w:t>
-      </w:r>
-      <w:proofErr w:type="spellStart"/>
-      <w:r>
-        <w:rPr>
-          <w:rStyle w:val="a9"/>
-          <w:b/>
-          <w:bCs/>
-        </w:rPr>
-        <w:t>hard</w:t>
-      </w:r>
-      <w:proofErr w:type="spellEnd"/>
-      <w:r>
-        <w:rPr>
-          <w:rStyle w:val="a9"/>
-          <w:b/>
-          <w:bCs/>
-        </w:rPr>
-        <w:t>)</w:t>
-      </w:r>
-      <w:r>
-        <w:t xml:space="preserve"> — свойство задачи, для которой не известно полиномиального точного решения и ожидается высокая вычислительная трудоёмкость на больших размерах.</w:t>
-      </w:r>
-    </w:p>
-    <w:p>
-      <w:pPr>
-        <w:pStyle w:val="a8"/>
-        <w:ind w:firstLine="709"/>
-        <w:jc w:val="both"/>
-      </w:pPr>
-      <w:r>
-        <w:rPr>
-          <w:rStyle w:val="a9"/>
-          <w:b/>
-          <w:bCs/>
-        </w:rPr>
-        <w:t>Оптимизация маршрутов</w:t>
-      </w:r>
-      <w:r>
-        <w:t xml:space="preserve"> — поиск маршрутов, минимизирующих целевую функцию при ограничениях.</w:t>
-      </w:r>
-    </w:p>
-    <w:p>
-      <w:pPr>
-        <w:pStyle w:val="a8"/>
-        <w:ind w:firstLine="709"/>
-        <w:jc w:val="both"/>
-      </w:pPr>
-      <w:r>
-        <w:rPr>
-          <w:rStyle w:val="a9"/>
-          <w:b/>
-          <w:bCs/>
-        </w:rPr>
-        <w:t>Память (использование памяти)</w:t>
-      </w:r>
-      <w:r>
-        <w:rPr>
-          <w:b/>
-          <w:bCs/>
-        </w:rPr>
-        <w:t xml:space="preserve"> </w:t>
-      </w:r>
-      <w:r>
-        <w:t>— объём оперативной памяти, потребляемый реализацией метода.</w:t>
-      </w:r>
-    </w:p>
-    <w:p>
-      <w:pPr>
-        <w:pStyle w:val="a8"/>
-        <w:ind w:firstLine="709"/>
-        <w:jc w:val="both"/>
-      </w:pPr>
-      <w:r>
-        <w:rPr>
-          <w:rStyle w:val="a9"/>
-          <w:b/>
-          <w:bCs/>
-        </w:rPr>
-        <w:t>Разметка (</w:t>
-      </w:r>
-      <w:proofErr w:type="spellStart"/>
-      <w:r>
-        <w:rPr>
-          <w:rStyle w:val="a9"/>
-          <w:b/>
-          <w:bCs/>
-        </w:rPr>
-        <w:t>annotation</w:t>
-      </w:r>
-      <w:proofErr w:type="spellEnd"/>
-      <w:r>
-        <w:rPr>
-          <w:rStyle w:val="a9"/>
-          <w:b/>
-          <w:bCs/>
-        </w:rPr>
-        <w:t>)</w:t>
-      </w:r>
-      <w:r>
-        <w:t xml:space="preserve"> — дополнительные данные/метки, позволяющие проверять корректность и оценивать качество результатов.</w:t>
+          <w:i/>
+          <w:iCs/>
+        </w:rPr>
+        <w:t>Генератор псевдослучайных чисел</w:t>
+      </w:r>
+      <w:r>
+        <w:t xml:space="preserve"> — алгоритм, который по </w:t>
+      </w:r>
+      <w:r>
+        <w:t xml:space="preserve">произвольному </w:t>
+      </w:r>
+      <w:r>
+        <w:t>начальному значению выдаёт детерминированную последовательность чисел, выглядящую случайной и пригодную для моделирования и рандомизированных алгоритмов.</w:t>
       </w:r>
     </w:p>
     <w:p>
@@ -5496,14 +4680,27 @@
       </w:pPr>
       <w:r>
         <w:rPr>
-          <w:rStyle w:val="a9"/>
           <w:b/>
           <w:bCs/>
-        </w:rPr>
-        <w:t>Солвер</w:t>
-      </w:r>
-      <w:r>
-        <w:t xml:space="preserve"> — решатель, который по входному инстансу строит решение задачи оптимизации (точно или приближённо).</w:t>
+          <w:i/>
+          <w:iCs/>
+        </w:rPr>
+        <w:t>Seed</w:t>
+      </w:r>
+      <w:r>
+        <w:t xml:space="preserve"> — начальное значение генератора псевдослучайных чисел, которое определяет последовательность </w:t>
+      </w:r>
+      <w:r>
+        <w:t>псевдо</w:t>
+      </w:r>
+      <w:r>
+        <w:t>случайных</w:t>
+      </w:r>
+      <w:r>
+        <w:t xml:space="preserve"> </w:t>
+      </w:r>
+      <w:r>
+        <w:t>выборов в алгоритме.</w:t>
       </w:r>
     </w:p>
     <w:p>
@@ -5518,10 +4715,10 @@
           <w:b/>
           <w:bCs/>
         </w:rPr>
-        <w:t>Точность</w:t>
-      </w:r>
-      <w:r>
-        <w:t xml:space="preserve"> — метрика корректности результата относительно эталона/правила проверки.</w:t>
+        <w:t>Эвристика</w:t>
+      </w:r>
+      <w:r>
+        <w:t xml:space="preserve"> — приближённый метод, не гарантирующий оптимум, но ориентированный на хорошие решения за разумное время.</w:t>
       </w:r>
     </w:p>
     <w:p>
@@ -5530,14 +4727,591 @@
         <w:ind w:firstLine="709"/>
         <w:jc w:val="both"/>
       </w:pPr>
+      <w:r>
+        <w:rPr>
+          <w:rStyle w:val="a9"/>
+          <w:b/>
+          <w:bCs/>
+        </w:rPr>
+        <w:t>Алгоритмы маршрутизации</w:t>
+      </w:r>
+      <w:r>
+        <w:t xml:space="preserve"> — </w:t>
+      </w:r>
+      <w:r>
+        <w:t xml:space="preserve">методы построения набора маршрутов (путей/туров) для обслуживания заданных точек при ограничениях и оптимизации выбранного критерия; включают точные, эвристические и </w:t>
+      </w:r>
       <w:proofErr w:type="spellStart"/>
       <w:r>
+        <w:t>метаэвристические</w:t>
+      </w:r>
+      <w:proofErr w:type="spellEnd"/>
+      <w:r>
+        <w:t xml:space="preserve"> подходы.</w:t>
+      </w:r>
+    </w:p>
+    <w:p>
+      <w:pPr>
+        <w:pStyle w:val="a8"/>
+        <w:ind w:firstLine="709"/>
+        <w:jc w:val="both"/>
+      </w:pPr>
+      <w:r>
         <w:rPr>
           <w:rStyle w:val="a9"/>
           <w:b/>
           <w:bCs/>
         </w:rPr>
-        <w:t>Location</w:t>
+        <w:t>Граф</w:t>
+      </w:r>
+      <w:r>
+        <w:t xml:space="preserve"> — модель «вершины + рёбра», используемая для представления точек и допустимых переходов между ними.</w:t>
+      </w:r>
+    </w:p>
+    <w:p>
+      <w:pPr>
+        <w:pStyle w:val="a8"/>
+        <w:ind w:firstLine="709"/>
+        <w:jc w:val="both"/>
+      </w:pPr>
+      <w:r>
+        <w:rPr>
+          <w:rStyle w:val="a9"/>
+          <w:b/>
+          <w:bCs/>
+        </w:rPr>
+        <w:t>Гамильтонов цикл</w:t>
+      </w:r>
+      <w:r>
+        <w:t xml:space="preserve"> — замкнутый обход графа, проходящий через каждую вершину ровно один раз.</w:t>
+      </w:r>
+    </w:p>
+    <w:p>
+      <w:pPr>
+        <w:pStyle w:val="a8"/>
+        <w:ind w:firstLine="709"/>
+        <w:jc w:val="both"/>
+      </w:pPr>
+      <w:r>
+        <w:rPr>
+          <w:b/>
+          <w:bCs/>
+          <w:i/>
+          <w:iCs/>
+        </w:rPr>
+        <w:t>VRP (Vehicle Routing Problem)</w:t>
+      </w:r>
+      <w:r>
+        <w:t xml:space="preserve"> — класс задач, где нужно построить маршруты для набора машин (обычно из одного или нескольких депо), чтобы обслужить всех клиентов и минимизировать стоимость (например, суммарное расстояние или время) при заданных ограничениях.</w:t>
+      </w:r>
+    </w:p>
+    <w:p>
+      <w:pPr>
+        <w:pStyle w:val="a8"/>
+        <w:ind w:firstLine="709"/>
+        <w:jc w:val="both"/>
+      </w:pPr>
+      <w:r>
+        <w:rPr>
+          <w:rStyle w:val="a9"/>
+          <w:b/>
+          <w:bCs/>
+        </w:rPr>
+        <w:t>TSP (задача коммивояжёра)</w:t>
+      </w:r>
+      <w:r>
+        <w:rPr>
+          <w:b/>
+          <w:bCs/>
+        </w:rPr>
+        <w:t xml:space="preserve"> </w:t>
+      </w:r>
+      <w:r>
+        <w:t>— поиск минимального по стоимости гамильтонова цикла по всем вершинам.</w:t>
+      </w:r>
+    </w:p>
+    <w:p>
+      <w:pPr>
+        <w:pStyle w:val="a8"/>
+        <w:ind w:firstLine="709"/>
+        <w:jc w:val="both"/>
+      </w:pPr>
+      <w:r>
+        <w:rPr>
+          <w:rStyle w:val="a9"/>
+          <w:b/>
+          <w:bCs/>
+        </w:rPr>
+        <w:t>Асимметричная задача коммивояжёра (ATSP)</w:t>
+      </w:r>
+      <w:r>
+        <w:t xml:space="preserve"> — вариант TSP, где стоимость перехода </w:t>
+      </w:r>
+      <w:r>
+        <w:rPr>
+          <w:rStyle w:val="a9"/>
+          <w:lang w:val="en-US"/>
+        </w:rPr>
+        <w:t>i</w:t>
+      </w:r>
+      <w:r>
+        <w:rPr>
+          <w:rStyle w:val="a9"/>
+        </w:rPr>
+        <w:t xml:space="preserve"> </w:t>
+      </w:r>
+      <w:r>
+        <w:rPr>
+          <w:rStyle w:val="a9"/>
+          <w:lang w:val="en-US"/>
+        </w:rPr>
+        <w:t>to</w:t>
+      </w:r>
+      <w:r>
+        <w:rPr>
+          <w:rStyle w:val="a9"/>
+        </w:rPr>
+        <w:t xml:space="preserve"> </w:t>
+      </w:r>
+      <w:r>
+        <w:rPr>
+          <w:rStyle w:val="a9"/>
+          <w:lang w:val="en-US"/>
+        </w:rPr>
+        <w:t>j</w:t>
+      </w:r>
+      <w:r>
+        <w:t xml:space="preserve"> может отличаться от </w:t>
+      </w:r>
+      <w:r>
+        <w:rPr>
+          <w:rStyle w:val="a9"/>
+          <w:lang w:val="en-US"/>
+        </w:rPr>
+        <w:t>j</w:t>
+      </w:r>
+      <w:r>
+        <w:rPr>
+          <w:rStyle w:val="a9"/>
+        </w:rPr>
+        <w:t xml:space="preserve"> </w:t>
+      </w:r>
+      <w:r>
+        <w:rPr>
+          <w:rStyle w:val="a9"/>
+          <w:lang w:val="en-US"/>
+        </w:rPr>
+        <w:t>to</w:t>
+      </w:r>
+      <w:r>
+        <w:rPr>
+          <w:rStyle w:val="a9"/>
+        </w:rPr>
+        <w:t xml:space="preserve"> </w:t>
+      </w:r>
+      <w:r>
+        <w:rPr>
+          <w:rStyle w:val="a9"/>
+          <w:lang w:val="en-US"/>
+        </w:rPr>
+        <w:t>i</w:t>
+      </w:r>
+      <w:r>
+        <w:t>; требуется минимальный гамильтонов цикл.</w:t>
+      </w:r>
+    </w:p>
+    <w:p>
+      <w:pPr>
+        <w:pStyle w:val="a8"/>
+        <w:ind w:firstLine="709"/>
+        <w:jc w:val="both"/>
+      </w:pPr>
+      <w:r>
+        <w:rPr>
+          <w:rStyle w:val="a9"/>
+          <w:b/>
+          <w:bCs/>
+          <w:lang w:val="en-US"/>
+        </w:rPr>
+        <w:lastRenderedPageBreak/>
+        <w:t>M</w:t>
+      </w:r>
+      <w:r>
+        <w:rPr>
+          <w:rStyle w:val="a9"/>
+          <w:b/>
+          <w:bCs/>
+        </w:rPr>
+        <w:t>TSP (задача нескольких коммивояжёров)</w:t>
+      </w:r>
+      <w:r>
+        <w:t xml:space="preserve"> — обобщение TSP, где множество вершин обслуживается несколькими агентами, каждый строит свой маршрут.</w:t>
+      </w:r>
+    </w:p>
+    <w:p>
+      <w:pPr>
+        <w:pStyle w:val="a8"/>
+        <w:ind w:firstLine="709"/>
+        <w:jc w:val="both"/>
+      </w:pPr>
+      <w:r>
+        <w:rPr>
+          <w:rStyle w:val="a9"/>
+          <w:b/>
+          <w:bCs/>
+        </w:rPr>
+        <w:t>MDMTSP (несколько коммивояжёров и несколько депо)</w:t>
+      </w:r>
+      <w:r>
+        <w:t xml:space="preserve"> — </w:t>
+      </w:r>
+      <w:r>
+        <w:t>постановка классической задачи, в которой каждый клиент должен быть посещён ровно один раз одним из агентов, а каждый агент строит маршрут, начинающийся в одном из депо и (в классическом варианте) возвращающийся в депо; оптимизируется суммарная стоимость маршрутов и/или критерии балансировки нагрузки (например, минимизация максимальной длины маршрута).</w:t>
+      </w:r>
+    </w:p>
+    <w:p>
+      <w:pPr>
+        <w:pStyle w:val="a8"/>
+        <w:ind w:firstLine="709"/>
+        <w:jc w:val="both"/>
+        <w:rPr>
+          <w:b/>
+          <w:bCs/>
+          <w:i/>
+          <w:iCs/>
+        </w:rPr>
+      </w:pPr>
+      <w:r>
+        <w:rPr>
+          <w:b/>
+          <w:bCs/>
+          <w:i/>
+          <w:iCs/>
+        </w:rPr>
+        <w:t>LKH (Lin–Kernighan–Helsgaun)</w:t>
+      </w:r>
+      <w:r>
+        <w:rPr>
+          <w:b/>
+          <w:bCs/>
+          <w:i/>
+          <w:iCs/>
+        </w:rPr>
+        <w:t xml:space="preserve"> </w:t>
+      </w:r>
+      <w:r>
+        <w:t>—</w:t>
+      </w:r>
+      <w:r>
+        <w:t xml:space="preserve"> </w:t>
+      </w:r>
+      <w:r>
+        <w:t>высокоэффективная эвристика для задачи коммивояжёра, основанная на k-opt локальном поиске, часто используемая как базовый солвер для получения качественных приближённых туров.</w:t>
+      </w:r>
+    </w:p>
+    <w:p>
+      <w:pPr>
+        <w:pStyle w:val="a8"/>
+        <w:ind w:firstLine="709"/>
+        <w:jc w:val="both"/>
+      </w:pPr>
+      <w:r>
+        <w:rPr>
+          <w:rStyle w:val="a9"/>
+          <w:b/>
+          <w:bCs/>
+        </w:rPr>
+        <w:t>База (депо)</w:t>
+      </w:r>
+      <w:r>
+        <w:t xml:space="preserve"> — исходная и/или конечная точка маршрута агента, откуда он стартует и куда возвращается (в зависимости от постановки).</w:t>
+      </w:r>
+    </w:p>
+    <w:p>
+      <w:pPr>
+        <w:pStyle w:val="a8"/>
+        <w:ind w:firstLine="709"/>
+        <w:jc w:val="both"/>
+      </w:pPr>
+      <w:r>
+        <w:rPr>
+          <w:rStyle w:val="a9"/>
+          <w:b/>
+          <w:bCs/>
+        </w:rPr>
+        <w:t>Балансировка нагрузки</w:t>
+      </w:r>
+      <w:r>
+        <w:t xml:space="preserve"> — распределение работы между агентами так, чтобы нагрузка была близкой по выбранному критерию (длина маршрута, число точек, время).</w:t>
+      </w:r>
+    </w:p>
+    <w:p>
+      <w:pPr>
+        <w:pStyle w:val="a8"/>
+        <w:ind w:firstLine="709"/>
+        <w:jc w:val="both"/>
+      </w:pPr>
+      <w:r>
+        <w:rPr>
+          <w:rStyle w:val="a9"/>
+          <w:b/>
+          <w:bCs/>
+        </w:rPr>
+        <w:t>Вычислительная сложность</w:t>
+      </w:r>
+      <w:r>
+        <w:rPr>
+          <w:b/>
+          <w:bCs/>
+        </w:rPr>
+        <w:t xml:space="preserve"> </w:t>
+      </w:r>
+      <w:r>
+        <w:t>— оценка ресурсоёмкости алгоритма (время/память) как функции размера входа.</w:t>
+      </w:r>
+    </w:p>
+    <w:p>
+      <w:pPr>
+        <w:pStyle w:val="a8"/>
+        <w:ind w:firstLine="709"/>
+        <w:jc w:val="both"/>
+      </w:pPr>
+      <w:r>
+        <w:rPr>
+          <w:rStyle w:val="a9"/>
+          <w:b/>
+          <w:bCs/>
+        </w:rPr>
+        <w:t>Вычислительный эксперимент</w:t>
+      </w:r>
+      <w:r>
+        <w:t xml:space="preserve"> — исследование через программную реализацию и многократный запуск методов на инстансах с измерением метрик.</w:t>
+      </w:r>
+    </w:p>
+    <w:p>
+      <w:pPr>
+        <w:pStyle w:val="a8"/>
+        <w:ind w:firstLine="709"/>
+        <w:jc w:val="both"/>
+      </w:pPr>
+      <w:r>
+        <w:rPr>
+          <w:rStyle w:val="a9"/>
+          <w:b/>
+          <w:bCs/>
+        </w:rPr>
+        <w:t>Данные (набор данных)</w:t>
+      </w:r>
+      <w:r>
+        <w:t xml:space="preserve"> — совокупность инстансов и/или примеров, на которых проводятся вычисления и измеряются метрики.</w:t>
+      </w:r>
+    </w:p>
+    <w:p>
+      <w:pPr>
+        <w:pStyle w:val="a8"/>
+        <w:ind w:firstLine="709"/>
+        <w:jc w:val="both"/>
+      </w:pPr>
+      <w:r>
+        <w:rPr>
+          <w:rStyle w:val="a9"/>
+          <w:b/>
+          <w:bCs/>
+        </w:rPr>
+        <w:t>Инстанс</w:t>
+      </w:r>
+      <w:r>
+        <w:t xml:space="preserve"> — конкретный экземпляр задачи: набор узлов, матрица стоимостей/расстояний, число депо и агентов, ограничения.</w:t>
+      </w:r>
+    </w:p>
+    <w:p>
+      <w:pPr>
+        <w:pStyle w:val="a8"/>
+        <w:ind w:firstLine="709"/>
+        <w:jc w:val="both"/>
+      </w:pPr>
+      <w:r>
+        <w:rPr>
+          <w:rStyle w:val="a9"/>
+          <w:b/>
+          <w:bCs/>
+        </w:rPr>
+        <w:t>Качество решения</w:t>
+      </w:r>
+      <w:r>
+        <w:t xml:space="preserve"> — численная оценка «насколько хорошо» решение по целевой функции и дополнительным критериям.</w:t>
+      </w:r>
+    </w:p>
+    <w:p>
+      <w:pPr>
+        <w:pStyle w:val="a8"/>
+        <w:ind w:firstLine="709"/>
+        <w:jc w:val="both"/>
+      </w:pPr>
+      <w:r>
+        <w:rPr>
+          <w:rStyle w:val="a9"/>
+          <w:b/>
+          <w:bCs/>
+        </w:rPr>
+        <w:t>Клиент</w:t>
+      </w:r>
+      <w:r>
+        <w:rPr>
+          <w:b/>
+          <w:bCs/>
+        </w:rPr>
+        <w:t xml:space="preserve"> </w:t>
+      </w:r>
+      <w:r>
+        <w:t>— точка, которую необходимо посетить/обслужить в рамках маршрута (узел, отличный от депо).</w:t>
+      </w:r>
+    </w:p>
+    <w:p>
+      <w:pPr>
+        <w:pStyle w:val="a8"/>
+        <w:ind w:firstLine="709"/>
+        <w:jc w:val="both"/>
+      </w:pPr>
+      <w:r>
+        <w:rPr>
+          <w:rStyle w:val="a9"/>
+          <w:b/>
+          <w:bCs/>
+        </w:rPr>
+        <w:t>Критерий оптимальности</w:t>
+      </w:r>
+      <w:r>
+        <w:rPr>
+          <w:b/>
+          <w:bCs/>
+        </w:rPr>
+        <w:t xml:space="preserve"> </w:t>
+      </w:r>
+      <w:r>
+        <w:t>— формализованное правило сравнения решений (что именно минимизируется/максимизируется).</w:t>
+      </w:r>
+    </w:p>
+    <w:p>
+      <w:pPr>
+        <w:pStyle w:val="a8"/>
+        <w:ind w:firstLine="709"/>
+        <w:jc w:val="both"/>
+      </w:pPr>
+      <w:r>
+        <w:rPr>
+          <w:rStyle w:val="a9"/>
+          <w:b/>
+          <w:bCs/>
+        </w:rPr>
+        <w:t>Локальный поиск</w:t>
+      </w:r>
+      <w:r>
+        <w:t xml:space="preserve"> — класс методов улучшения решения через локальные преобразования (соседства) с итеративным снижением целевой функции.</w:t>
+      </w:r>
+    </w:p>
+    <w:p>
+      <w:pPr>
+        <w:pStyle w:val="a8"/>
+        <w:ind w:firstLine="709"/>
+        <w:jc w:val="both"/>
+      </w:pPr>
+      <w:r>
+        <w:rPr>
+          <w:rStyle w:val="a9"/>
+          <w:b/>
+          <w:bCs/>
+        </w:rPr>
+        <w:t>Маршрут (тур)</w:t>
+      </w:r>
+      <w:r>
+        <w:t xml:space="preserve"> — упорядоченная последовательность посещений вершин агентом, обычно связанная с депо в начале/конце.</w:t>
+      </w:r>
+    </w:p>
+    <w:p>
+      <w:pPr>
+        <w:pStyle w:val="a8"/>
+        <w:ind w:firstLine="709"/>
+        <w:jc w:val="both"/>
+      </w:pPr>
+      <w:r>
+        <w:rPr>
+          <w:rStyle w:val="a9"/>
+          <w:b/>
+          <w:bCs/>
+        </w:rPr>
+        <w:t>Масштабируемость</w:t>
+      </w:r>
+      <w:r>
+        <w:rPr>
+          <w:b/>
+          <w:bCs/>
+        </w:rPr>
+        <w:t xml:space="preserve"> </w:t>
+      </w:r>
+      <w:r>
+        <w:t>— способность метода сохранять приемлемые метрики при росте размера задачи.</w:t>
+      </w:r>
+    </w:p>
+    <w:p>
+      <w:pPr>
+        <w:pStyle w:val="a8"/>
+        <w:ind w:firstLine="709"/>
+        <w:jc w:val="both"/>
+      </w:pPr>
+      <w:r>
+        <w:rPr>
+          <w:rStyle w:val="a9"/>
+          <w:b/>
+          <w:bCs/>
+        </w:rPr>
+        <w:t>Метрики</w:t>
+      </w:r>
+      <w:r>
+        <w:t xml:space="preserve"> — набор числовых показателей для оценки и сравнения (качество, баланс, время, память и т. п.).</w:t>
+      </w:r>
+    </w:p>
+    <w:p>
+      <w:pPr>
+        <w:pStyle w:val="a8"/>
+        <w:ind w:firstLine="709"/>
+        <w:jc w:val="both"/>
+      </w:pPr>
+      <w:r>
+        <w:rPr>
+          <w:rStyle w:val="a9"/>
+          <w:b/>
+          <w:bCs/>
+        </w:rPr>
+        <w:lastRenderedPageBreak/>
+        <w:t>Методика эксперимента</w:t>
+      </w:r>
+      <w:r>
+        <w:t xml:space="preserve"> — регламент: как выбираются данные, как запускаются методы, как измеряются метрики и фиксируются условия.</w:t>
+      </w:r>
+    </w:p>
+    <w:p>
+      <w:pPr>
+        <w:pStyle w:val="a8"/>
+        <w:ind w:firstLine="709"/>
+        <w:jc w:val="both"/>
+      </w:pPr>
+      <w:r>
+        <w:rPr>
+          <w:rStyle w:val="a9"/>
+          <w:b/>
+          <w:bCs/>
+        </w:rPr>
+        <w:t>Многодепо (</w:t>
+      </w:r>
+      <w:proofErr w:type="spellStart"/>
+      <w:r>
+        <w:rPr>
+          <w:rStyle w:val="a9"/>
+          <w:b/>
+          <w:bCs/>
+        </w:rPr>
+        <w:t>multi-depot</w:t>
       </w:r>
       <w:proofErr w:type="spellEnd"/>
       <w:r>
@@ -5546,8 +5320,61 @@
           <w:b/>
           <w:bCs/>
         </w:rPr>
+        <w:t>)</w:t>
+      </w:r>
+      <w:r>
+        <w:t xml:space="preserve"> — постановка, допускающая несколько депо, из которых могут начинаться и/или заканчиваться маршруты.</w:t>
+      </w:r>
+    </w:p>
+    <w:p>
+      <w:pPr>
+        <w:pStyle w:val="a8"/>
+        <w:ind w:firstLine="709"/>
+        <w:jc w:val="both"/>
+      </w:pPr>
+      <w:proofErr w:type="spellStart"/>
+      <w:r>
+        <w:rPr>
+          <w:rStyle w:val="a9"/>
+          <w:b/>
+          <w:bCs/>
+        </w:rPr>
+        <w:t>Мультидепо</w:t>
+      </w:r>
+      <w:proofErr w:type="spellEnd"/>
+      <w:r>
+        <w:rPr>
+          <w:rStyle w:val="a9"/>
+          <w:b/>
+          <w:bCs/>
+        </w:rPr>
+        <w:t>-доставка</w:t>
+      </w:r>
+      <w:r>
+        <w:rPr>
+          <w:b/>
+          <w:bCs/>
+        </w:rPr>
         <w:t xml:space="preserve"> </w:t>
       </w:r>
+      <w:r>
+        <w:t>— прикладной сценарий обслуживания точек из нескольких баз (депо).</w:t>
+      </w:r>
+    </w:p>
+    <w:p>
+      <w:pPr>
+        <w:pStyle w:val="a8"/>
+        <w:ind w:firstLine="709"/>
+        <w:jc w:val="both"/>
+      </w:pPr>
+      <w:r>
+        <w:rPr>
+          <w:rStyle w:val="a9"/>
+          <w:b/>
+          <w:bCs/>
+        </w:rPr>
+        <w:t>NP-трудность (NP-</w:t>
+      </w:r>
       <w:proofErr w:type="spellStart"/>
       <w:r>
         <w:rPr>
@@ -5555,7 +5382,7 @@
           <w:b/>
           <w:bCs/>
         </w:rPr>
-        <w:t>Routing</w:t>
+        <w:t>hard</w:t>
       </w:r>
       <w:proofErr w:type="spellEnd"/>
       <w:r>
@@ -5564,18 +5391,143 @@
           <w:b/>
           <w:bCs/>
         </w:rPr>
-        <w:t xml:space="preserve"> (размещение и маршрутизация)</w:t>
-      </w:r>
-      <w:r>
-        <w:rPr>
+        <w:t>)</w:t>
+      </w:r>
+      <w:r>
+        <w:t xml:space="preserve"> — свойство задачи, для которой не известно полиномиального точного решения и ожидается высокая вычислительная трудоёмкость на больших размерах.</w:t>
+      </w:r>
+    </w:p>
+    <w:p>
+      <w:pPr>
+        <w:pStyle w:val="a8"/>
+        <w:ind w:firstLine="709"/>
+        <w:jc w:val="both"/>
+      </w:pPr>
+      <w:r>
+        <w:rPr>
+          <w:rStyle w:val="a9"/>
           <w:b/>
           <w:bCs/>
         </w:rPr>
+        <w:t>Оптимизация маршрутов</w:t>
+      </w:r>
+      <w:r>
+        <w:t xml:space="preserve"> — поиск маршрутов, минимизирующих целевую функцию при ограничениях.</w:t>
+      </w:r>
+    </w:p>
+    <w:p>
+      <w:pPr>
+        <w:pStyle w:val="a8"/>
+        <w:ind w:firstLine="709"/>
+        <w:jc w:val="both"/>
+      </w:pPr>
+      <w:r>
+        <w:rPr>
+          <w:rStyle w:val="a9"/>
+          <w:b/>
+          <w:bCs/>
+        </w:rPr>
+        <w:t>Память (использование памяти)</w:t>
+      </w:r>
+      <w:r>
+        <w:rPr>
+          <w:b/>
+          <w:bCs/>
+        </w:rPr>
         <w:t xml:space="preserve"> </w:t>
       </w:r>
       <w:r>
+        <w:t>— объём оперативной памяти, потребляемый реализацией метода.</w:t>
+      </w:r>
+    </w:p>
+    <w:p>
+      <w:pPr>
+        <w:pStyle w:val="a8"/>
+        <w:ind w:firstLine="709"/>
+        <w:jc w:val="both"/>
+      </w:pPr>
+      <w:r>
+        <w:rPr>
+          <w:rStyle w:val="a9"/>
+          <w:b/>
+          <w:bCs/>
+        </w:rPr>
+        <w:t>Разметка (annotation)</w:t>
+      </w:r>
+      <w:r>
+        <w:t xml:space="preserve"> — дополнительные данные/метки, позволяющие проверять корректность и оценивать качество результатов.</w:t>
+      </w:r>
+    </w:p>
+    <w:p>
+      <w:pPr>
+        <w:pStyle w:val="a8"/>
+        <w:tabs>
+          <w:tab w:val="left" w:pos="709"/>
+        </w:tabs>
+        <w:ind w:firstLine="709"/>
+        <w:jc w:val="both"/>
+      </w:pPr>
+      <w:r>
+        <w:rPr>
+          <w:rStyle w:val="a9"/>
+          <w:b/>
+          <w:bCs/>
+        </w:rPr>
+        <w:t>Солвер</w:t>
+      </w:r>
+      <w:r>
+        <w:t xml:space="preserve"> — решатель, который по входному инстансу строит решение задачи оптимизации (точно или приближённо).</w:t>
+      </w:r>
+    </w:p>
+    <w:p>
+      <w:pPr>
+        <w:pStyle w:val="a8"/>
+        <w:ind w:firstLine="709"/>
+        <w:jc w:val="both"/>
+      </w:pPr>
+      <w:r>
+        <w:rPr>
+          <w:rStyle w:val="a9"/>
+          <w:b/>
+          <w:bCs/>
+        </w:rPr>
+        <w:t>Точность</w:t>
+      </w:r>
+      <w:r>
+        <w:t xml:space="preserve"> — метрика корректности результата относительно эталона/правила проверки.</w:t>
+      </w:r>
+    </w:p>
+    <w:p>
+      <w:pPr>
+        <w:pStyle w:val="a8"/>
+        <w:ind w:firstLine="709"/>
+        <w:jc w:val="both"/>
+      </w:pPr>
+      <w:r>
+        <w:rPr>
+          <w:rStyle w:val="a9"/>
+          <w:b/>
+          <w:bCs/>
+        </w:rPr>
+        <w:t>Location Routing (размещение и маршрутизация)</w:t>
+      </w:r>
+      <w:r>
+        <w:rPr>
+          <w:b/>
+          <w:bCs/>
+        </w:rPr>
+        <w:t xml:space="preserve"> </w:t>
+      </w:r>
+      <w:r>
         <w:t>— класс задач, объединяющий решения о размещении инфраструктуры (например, депо) и построение маршрутов обслуживания.</w:t>
       </w:r>
+    </w:p>
+    <w:p>
+      <w:pPr>
+        <w:pStyle w:val="a8"/>
+        <w:ind w:firstLine="709"/>
+        <w:jc w:val="both"/>
+      </w:pPr>
     </w:p>
     <w:p>
       <w:pPr>
@@ -5590,9 +5542,9 @@
         <w:spacing w:before="61"/>
         <w:ind w:hanging="430"/>
       </w:pPr>
-      <w:bookmarkStart w:id="37" w:name="Основные_термины_и_сокращения"/>
-      <w:bookmarkStart w:id="38" w:name="_Toc220871077"/>
-      <w:bookmarkEnd w:id="37"/>
+      <w:bookmarkStart w:id="42" w:name="Основные_термины_и_сокращения"/>
+      <w:bookmarkStart w:id="43" w:name="_Toc221127147"/>
+      <w:bookmarkEnd w:id="42"/>
       <w:r>
         <w:t>Календарный</w:t>
       </w:r>
@@ -5617,7 +5569,7 @@
         </w:rPr>
         <w:t>работ</w:t>
       </w:r>
-      <w:bookmarkEnd w:id="38"/>
+      <w:bookmarkEnd w:id="43"/>
     </w:p>
     <w:p>
       <w:pPr>
@@ -5667,7 +5619,6 @@
                 <w:b/>
                 <w:sz w:val="20"/>
               </w:rPr>
-              <w:lastRenderedPageBreak/>
               <w:t>Этап проекта</w:t>
             </w:r>
           </w:p>
@@ -5766,15 +5717,7 @@
             </w:r>
             <w:proofErr w:type="spellEnd"/>
             <w:r>
-              <w:t>/ILP), базовых эвристик и локального поиска (2-opt/3-opt/k-</w:t>
-            </w:r>
-            <w:proofErr w:type="spellStart"/>
-            <w:r>
-              <w:t>opt</w:t>
-            </w:r>
-            <w:proofErr w:type="spellEnd"/>
-            <w:r>
-              <w:t>), критериев качества и сложности.</w:t>
+              <w:t>/ILP), базовых эвристик и локального поиска (2-opt/3-opt/k-opt), критериев качества и сложности.</w:t>
             </w:r>
           </w:p>
         </w:tc>
@@ -5899,6 +5842,7 @@
           </w:tcPr>
           <w:p>
             <w:r>
+              <w:lastRenderedPageBreak/>
               <w:t>Проектирование и разработка системы валидации решений</w:t>
             </w:r>
           </w:p>
@@ -6183,7 +6127,6 @@
               <w:ind w:left="41"/>
             </w:pPr>
             <w:r>
-              <w:lastRenderedPageBreak/>
               <w:t>Основные вычислительные эксперименты и сравнение методов</w:t>
             </w:r>
           </w:p>
@@ -6277,6 +6220,7 @@
           </w:tcPr>
           <w:p>
             <w:r>
+              <w:lastRenderedPageBreak/>
               <w:t>Суммаризация результатов и оформление выводов</w:t>
             </w:r>
           </w:p>
@@ -6383,7 +6327,7 @@
         <w:spacing w:before="61"/>
         <w:ind w:hanging="430"/>
       </w:pPr>
-      <w:bookmarkStart w:id="39" w:name="_Toc220871078"/>
+      <w:bookmarkStart w:id="44" w:name="_Toc221127148"/>
       <w:r>
         <w:t>Список</w:t>
       </w:r>
@@ -6399,7 +6343,7 @@
         </w:rPr>
         <w:t>литературы</w:t>
       </w:r>
-      <w:bookmarkEnd w:id="39"/>
+      <w:bookmarkEnd w:id="44"/>
     </w:p>
     <w:p>
       <w:pPr>
@@ -6418,8 +6362,8 @@
           <w:lang w:val="en-US"/>
         </w:rPr>
       </w:pPr>
-      <w:bookmarkStart w:id="40" w:name="_bookmark13"/>
-      <w:bookmarkEnd w:id="40"/>
+      <w:bookmarkStart w:id="45" w:name="_bookmark13"/>
+      <w:bookmarkEnd w:id="45"/>
       <w:proofErr w:type="spellStart"/>
       <w:r>
         <w:rPr>

</xml_diff>

<commit_message>
fix( docx intervals )
</commit_message>
<xml_diff>
--- a/docs/Отчет_MDMTSP_КТ1.docx
+++ b/docs/Отчет_MDMTSP_КТ1.docx
@@ -4161,7 +4161,7 @@
     <w:p>
       <w:pPr>
         <w:pStyle w:val="a8"/>
-        <w:spacing w:before="235" w:beforeAutospacing="0"/>
+        <w:spacing w:before="235" w:beforeAutospacing="0" w:after="0" w:afterAutospacing="0"/>
         <w:ind w:left="142" w:right="142" w:firstLine="360"/>
         <w:jc w:val="both"/>
       </w:pPr>
@@ -4172,22 +4172,22 @@
     <w:p>
       <w:pPr>
         <w:pStyle w:val="a8"/>
-        <w:spacing w:before="235" w:beforeAutospacing="0"/>
+        <w:spacing w:before="0" w:beforeAutospacing="0" w:after="0" w:afterAutospacing="0"/>
         <w:ind w:left="142" w:right="142" w:firstLine="360"/>
         <w:jc w:val="both"/>
       </w:pPr>
       <w:r>
-        <w:t xml:space="preserve">На каждом этапе ключевую роль будут играть эвристики. Для назначения можно использовать простые правила (например, близость к депо) и более «умные» варианты, которые учитывают баланс нагрузки между агентами. Для построения маршрутов </w:t>
+        <w:t xml:space="preserve">На каждом этапе ключевую роль будут играть эвристики. Для назначения можно использовать простые правила (например, близость к депо) и более «умные» варианты, которые учитывают баланс нагрузки между агентами. Для построения маршрутов внутри групп подойдут быстрые начальные эвристики и локальный поиск, а для </w:t>
       </w:r>
       <w:r>
         <w:lastRenderedPageBreak/>
-        <w:t>внутри групп подойдут быстрые начальные эвристики и локальный поиск, а для финального улучшения важны межмаршрутные операции, которые позволяют переносить клиентов между маршрутами, менять их местами и пересобирать участки маршрутов. Идея в том, что даже если стартовое решение не идеальное, последовательное применение таких эвристик позволяет стабильно “дожимать” качество без взрывного роста времени.</w:t>
+        <w:t>финального улучшения важны межмаршрутные операции, которые позволяют переносить клиентов между маршрутами, менять их местами и пересобирать участки маршрутов. Идея в том, что даже если стартовое решение не идеальное, последовательное применение таких эвристик позволяет стабильно “дожимать” качество без взрывного роста времени.</w:t>
       </w:r>
     </w:p>
     <w:p>
       <w:pPr>
         <w:pStyle w:val="a8"/>
-        <w:spacing w:before="235" w:beforeAutospacing="0"/>
+        <w:spacing w:before="0" w:beforeAutospacing="0"/>
         <w:ind w:left="142" w:right="142" w:firstLine="360"/>
         <w:jc w:val="both"/>
       </w:pPr>
@@ -5192,7 +5192,6 @@
           <w:b/>
           <w:bCs/>
         </w:rPr>
-        <w:lastRenderedPageBreak/>
         <w:t>Гамильтонов цикл</w:t>
       </w:r>
       <w:r>
@@ -5212,6 +5211,7 @@
           <w:i/>
           <w:iCs/>
         </w:rPr>
+        <w:lastRenderedPageBreak/>
         <w:t>VRP (Vehicle Routing Problem)</w:t>
       </w:r>
       <w:r>
@@ -5591,7 +5591,6 @@
           <w:b/>
           <w:bCs/>
         </w:rPr>
-        <w:lastRenderedPageBreak/>
         <w:t>Критерий оптимальности</w:t>
       </w:r>
       <w:r>
@@ -5617,6 +5616,7 @@
           <w:b/>
           <w:bCs/>
         </w:rPr>
+        <w:lastRenderedPageBreak/>
         <w:t>Локальный поиск</w:t>
       </w:r>
       <w:r>
@@ -5951,35 +5951,6 @@
     <w:p>
       <w:pPr>
         <w:pStyle w:val="a8"/>
-        <w:ind w:firstLine="709"/>
-        <w:jc w:val="both"/>
-      </w:pPr>
-    </w:p>
-    <w:p>
-      <w:pPr>
-        <w:pStyle w:val="a8"/>
-        <w:ind w:firstLine="709"/>
-        <w:jc w:val="both"/>
-      </w:pPr>
-    </w:p>
-    <w:p>
-      <w:pPr>
-        <w:pStyle w:val="a8"/>
-        <w:ind w:firstLine="709"/>
-        <w:jc w:val="both"/>
-      </w:pPr>
-    </w:p>
-    <w:p>
-      <w:pPr>
-        <w:pStyle w:val="a8"/>
-        <w:ind w:firstLine="709"/>
-        <w:jc w:val="both"/>
-      </w:pPr>
-    </w:p>
-    <w:p>
-      <w:pPr>
-        <w:pStyle w:val="a8"/>
-        <w:ind w:firstLine="709"/>
         <w:jc w:val="both"/>
       </w:pPr>
     </w:p>
@@ -6496,7 +6467,6 @@
           </w:tcPr>
           <w:p>
             <w:r>
-              <w:lastRenderedPageBreak/>
               <w:t>Настройка, профилирование и пилотные эксперименты</w:t>
             </w:r>
           </w:p>
@@ -6583,6 +6553,7 @@
               <w:ind w:left="41"/>
             </w:pPr>
             <w:r>
+              <w:lastRenderedPageBreak/>
               <w:t>Основные вычислительные эксперименты и сравнение методов</w:t>
             </w:r>
           </w:p>
@@ -6752,20 +6723,7 @@
           <w:tab w:val="left" w:pos="572"/>
         </w:tabs>
         <w:spacing w:before="61"/>
-        <w:ind w:left="360" w:firstLine="0"/>
-        <w:rPr>
-          <w:spacing w:val="-4"/>
-        </w:rPr>
-      </w:pPr>
-    </w:p>
-    <w:p>
-      <w:pPr>
-        <w:pStyle w:val="1"/>
-        <w:tabs>
-          <w:tab w:val="left" w:pos="572"/>
-        </w:tabs>
-        <w:spacing w:before="61"/>
-        <w:ind w:left="360" w:firstLine="0"/>
+        <w:ind w:left="0" w:firstLine="0"/>
       </w:pPr>
     </w:p>
     <w:p>
@@ -7004,7 +6962,6 @@
           <w:shd w:val="clear" w:color="auto" w:fill="FFFFFF"/>
           <w:lang w:val="en-US"/>
         </w:rPr>
-        <w:lastRenderedPageBreak/>
         <w:t xml:space="preserve">Shi X. H. et al. Particle swarm optimization-based algorithms for TSP and generalized TSP //Information processing letters. – 2007. – </w:t>
       </w:r>
       <w:r>

</xml_diff>